<commit_message>
Cap nhat tai lieu: them phan mobile va thiet ke giao dien
</commit_message>
<xml_diff>
--- a/docs/UseCase_Sequence.docx
+++ b/docs/UseCase_Sequence.docx
@@ -1280,7 +1280,7 @@
                 <w:sz w:val="22"/>
                 <w:szCs w:val="22"/>
               </w:rPr>
-              <w:t xml:space="preserve">Web</w:t>
+              <w:t xml:space="preserve">Web, Mobile</w:t>
             </w:r>
           </w:p>
         </w:tc>
@@ -4449,37 +4449,22 @@
                 <w:sz w:val="22"/>
                 <w:szCs w:val="22"/>
               </w:rPr>
-              <w:t xml:space="preserve">1. Hệ thống hiển thị danh sách ngôn ngữ đã xử lý (dạng thẻ chọn trên web, dạng danh sách trên mobile).</w:t>
-            </w:r>
-          </w:p>
-          <w:p>
-            <w:pPr>
-              <w:spacing w:after="40" w:line="264"/>
-            </w:pPr>
-            <w:r>
-              <w:rPr>
-                <w:rFonts w:ascii="Times New Roman" w:cs="Times New Roman" w:eastAsia="Times New Roman" w:hAnsi="Times New Roman"/>
-                <w:b w:val="false"/>
-                <w:bCs w:val="false"/>
-                <w:sz w:val="22"/>
-                <w:szCs w:val="22"/>
-              </w:rPr>
-              <w:t xml:space="preserve">2. Trên web: người dùng chọn một ngôn ngữ, hệ thống phát video hoặc audio tương ứng.</w:t>
-            </w:r>
-          </w:p>
-          <w:p>
-            <w:pPr>
-              <w:spacing w:after="40" w:line="264"/>
-            </w:pPr>
-            <w:r>
-              <w:rPr>
-                <w:rFonts w:ascii="Times New Roman" w:cs="Times New Roman" w:eastAsia="Times New Roman" w:hAnsi="Times New Roman"/>
-                <w:b w:val="false"/>
-                <w:bCs w:val="false"/>
-                <w:sz w:val="22"/>
-                <w:szCs w:val="22"/>
-              </w:rPr>
-              <w:t xml:space="preserve">3. Trên mobile: hệ thống hiển thị trạng thái Sẵn sàng của từng ngôn ngữ.</w:t>
+              <w:t xml:space="preserve">1. Hệ thống hiển thị danh sách ngôn ngữ đã xử lý dưới dạng các nút chọn (web và mobile).</w:t>
+            </w:r>
+          </w:p>
+          <w:p>
+            <w:pPr>
+              <w:spacing w:after="40" w:line="264"/>
+            </w:pPr>
+            <w:r>
+              <w:rPr>
+                <w:rFonts w:ascii="Times New Roman" w:cs="Times New Roman" w:eastAsia="Times New Roman" w:hAnsi="Times New Roman"/>
+                <w:b w:val="false"/>
+                <w:bCs w:val="false"/>
+                <w:sz w:val="22"/>
+                <w:szCs w:val="22"/>
+              </w:rPr>
+              <w:t xml:space="preserve">2. Người dùng chọn một ngôn ngữ, hệ thống phát video hoặc audio tương ứng bằng trình phát.</w:t>
             </w:r>
           </w:p>
         </w:tc>
@@ -4569,7 +4554,7 @@
         <w:rPr>
           <w:rFonts w:ascii="Times New Roman" w:cs="Times New Roman" w:eastAsia="Times New Roman" w:hAnsi="Times New Roman"/>
         </w:rPr>
-        <w:t xml:space="preserve">UC06 - Tải kết quả về máy (web)</w:t>
+        <w:t xml:space="preserve">UC06 - Tải kết quả về máy (web, mobile)</w:t>
       </w:r>
     </w:p>
     <w:tbl>
@@ -4895,7 +4880,22 @@
                 <w:sz w:val="22"/>
                 <w:szCs w:val="22"/>
               </w:rPr>
-              <w:t xml:space="preserve">3. Trình duyệt lưu tệp về máy với tên dạng tên_gốc_mã_ngôn_ngữ (ví dụ video_en.mp4).</w:t>
+              <w:t xml:space="preserve">3. Web: trình duyệt lưu tệp về máy với tên dạng tên_gốc_mã_ngôn_ngữ (ví dụ video_en.mp4).</w:t>
+            </w:r>
+          </w:p>
+          <w:p>
+            <w:pPr>
+              <w:spacing w:after="40" w:line="264"/>
+            </w:pPr>
+            <w:r>
+              <w:rPr>
+                <w:rFonts w:ascii="Times New Roman" w:cs="Times New Roman" w:eastAsia="Times New Roman" w:hAnsi="Times New Roman"/>
+                <w:b w:val="false"/>
+                <w:bCs w:val="false"/>
+                <w:sz w:val="22"/>
+                <w:szCs w:val="22"/>
+              </w:rPr>
+              <w:t xml:space="preserve">4. Mobile: hệ thống mở bảng chia sẻ của điện thoại để người dùng lưu tệp vào Tệp hoặc gửi sang ứng dụng khác.</w:t>
             </w:r>
           </w:p>
         </w:tc>
@@ -8090,7 +8090,7 @@
           <w:sz w:val="26"/>
           <w:szCs w:val="26"/>
         </w:rPr>
-        <w:t xml:space="preserve">Mobile hiện chưa có trình phát và nút Tải về, các mục UC05, UC06 trên mobile sẽ bổ sung ở giai đoạn sau.</w:t>
+        <w:t xml:space="preserve">Mobile phát tệp bằng thư viện expo-video và dùng bảng chia sẻ của điện thoại thay cho nút tải trực tiếp. Cả web và mobile hiện đều phát lại tệp gốc, chưa có giọng lồng tiếng thật.</w:t>
       </w:r>
     </w:p>
     <w:p>
@@ -13348,7 +13348,7 @@
                 <w:sz w:val="22"/>
                 <w:szCs w:val="22"/>
               </w:rPr>
-              <w:t xml:space="preserve">Web dùng đối tượng File của trình duyệt. Mobile dùng PickedFile gồm name và size</w:t>
+              <w:t xml:space="preserve">Web dùng đối tượng File của trình duyệt. Mobile dùng PickedFile gồm name, size và uri</w:t>
             </w:r>
           </w:p>
         </w:tc>
@@ -14400,7 +14400,7 @@
                 <w:sz w:val="22"/>
                 <w:szCs w:val="22"/>
               </w:rPr>
-              <w:t xml:space="preserve">Có (chưa có trình phát và nút Tải về)</w:t>
+              <w:t xml:space="preserve">Có</w:t>
             </w:r>
           </w:p>
         </w:tc>
@@ -18271,7 +18271,7 @@
             <w:r>
               <w:drawing>
                 <wp:inline distT="0" distB="0" distL="0" distR="0">
-                  <wp:extent cx="2047875" cy="2371725"/>
+                  <wp:extent cx="2047875" cy="3324225"/>
                   <wp:effectExtent t="0" r="0" b="0" l="0"/>
                   <wp:docPr id="1" name="" descr="" title=""/>
                   <wp:cNvGraphicFramePr>
@@ -18296,7 +18296,7 @@
                         <pic:spPr bwMode="auto">
                           <a:xfrm>
                             <a:off x="0" y="0"/>
-                            <a:ext cx="2047875" cy="2371725"/>
+                            <a:ext cx="2047875" cy="3324225"/>
                           </a:xfrm>
                           <a:prstGeom prst="rect">
                             <a:avLst/>
@@ -18322,7 +18322,7 @@
                 <w:sz w:val="22"/>
                 <w:szCs w:val="22"/>
               </w:rPr>
-              <w:t xml:space="preserve">Hình M04b. Màn hình Kết quả trên mobile (chưa có trình phát và nút Tải về)</w:t>
+              <w:t xml:space="preserve">Hình M04b. Màn hình Kết quả trên mobile</w:t>
             </w:r>
           </w:p>
         </w:tc>
@@ -18535,7 +18535,7 @@
                 <w:sz w:val="22"/>
                 <w:szCs w:val="22"/>
               </w:rPr>
-              <w:t xml:space="preserve">Thanh chuyển bản (web)</w:t>
+              <w:t xml:space="preserve">Thanh chuyển bản</w:t>
             </w:r>
           </w:p>
         </w:tc>
@@ -18605,7 +18605,7 @@
                 <w:sz w:val="22"/>
                 <w:szCs w:val="22"/>
               </w:rPr>
-              <w:t xml:space="preserve">Trình phát (web)</w:t>
+              <w:t xml:space="preserve">Trình phát</w:t>
             </w:r>
           </w:p>
         </w:tc>
@@ -18675,7 +18675,7 @@
                 <w:sz w:val="22"/>
                 <w:szCs w:val="22"/>
               </w:rPr>
-              <w:t xml:space="preserve">Danh sách ngôn ngữ (mobile)</w:t>
+              <w:t xml:space="preserve">Ghi chú demo</w:t>
             </w:r>
           </w:p>
         </w:tc>
@@ -18707,7 +18707,7 @@
                 <w:sz w:val="22"/>
                 <w:szCs w:val="22"/>
               </w:rPr>
-              <w:t xml:space="preserve">Mỗi dòng gồm ký hiệu, tên ngôn ngữ và trạng thái Sẵn sàng</w:t>
+              <w:t xml:space="preserve">Nhắc rằng chưa có giọng lồng tiếng thật</w:t>
             </w:r>
           </w:p>
         </w:tc>
@@ -18745,7 +18745,7 @@
                 <w:sz w:val="22"/>
                 <w:szCs w:val="22"/>
               </w:rPr>
-              <w:t xml:space="preserve">Ghi chú demo</w:t>
+              <w:t xml:space="preserve">Nút Tải về bản (ngôn ngữ)</w:t>
             </w:r>
           </w:p>
         </w:tc>
@@ -18777,77 +18777,7 @@
                 <w:sz w:val="22"/>
                 <w:szCs w:val="22"/>
               </w:rPr>
-              <w:t xml:space="preserve">Nhắc rằng chưa có giọng lồng tiếng thật</w:t>
-            </w:r>
-          </w:p>
-        </w:tc>
-      </w:tr>
-      <w:tr>
-        <w:trPr>
-          <w:cantSplit/>
-          <w:tblHeader w:val="false"/>
-        </w:trPr>
-        <w:tc>
-          <w:tcPr>
-            <w:tcW w:type="dxa" w:w="3000"/>
-            <w:tcBorders>
-              <w:top w:val="single" w:color="AEB4C0" w:sz="4"/>
-              <w:left w:val="single" w:color="AEB4C0" w:sz="4"/>
-              <w:bottom w:val="single" w:color="AEB4C0" w:sz="4"/>
-              <w:right w:val="single" w:color="AEB4C0" w:sz="4"/>
-            </w:tcBorders>
-            <w:tcMar>
-              <w:top w:type="dxa" w:w="70"/>
-              <w:left w:type="dxa" w:w="110"/>
-              <w:bottom w:type="dxa" w:w="70"/>
-              <w:right w:type="dxa" w:w="110"/>
-            </w:tcMar>
-          </w:tcPr>
-          <w:p>
-            <w:pPr>
-              <w:spacing w:after="40" w:line="264"/>
-            </w:pPr>
-            <w:r>
-              <w:rPr>
-                <w:rFonts w:ascii="Times New Roman" w:cs="Times New Roman" w:eastAsia="Times New Roman" w:hAnsi="Times New Roman"/>
-                <w:b w:val="false"/>
-                <w:bCs w:val="false"/>
-                <w:sz w:val="22"/>
-                <w:szCs w:val="22"/>
-              </w:rPr>
-              <w:t xml:space="preserve">Nút Tải về bản (ngôn ngữ) (web)</w:t>
-            </w:r>
-          </w:p>
-        </w:tc>
-        <w:tc>
-          <w:tcPr>
-            <w:tcW w:type="dxa" w:w="6638"/>
-            <w:tcBorders>
-              <w:top w:val="single" w:color="AEB4C0" w:sz="4"/>
-              <w:left w:val="single" w:color="AEB4C0" w:sz="4"/>
-              <w:bottom w:val="single" w:color="AEB4C0" w:sz="4"/>
-              <w:right w:val="single" w:color="AEB4C0" w:sz="4"/>
-            </w:tcBorders>
-            <w:tcMar>
-              <w:top w:type="dxa" w:w="70"/>
-              <w:left w:type="dxa" w:w="110"/>
-              <w:bottom w:type="dxa" w:w="70"/>
-              <w:right w:type="dxa" w:w="110"/>
-            </w:tcMar>
-          </w:tcPr>
-          <w:p>
-            <w:pPr>
-              <w:spacing w:after="40" w:line="264"/>
-            </w:pPr>
-            <w:r>
-              <w:rPr>
-                <w:rFonts w:ascii="Times New Roman" w:cs="Times New Roman" w:eastAsia="Times New Roman" w:hAnsi="Times New Roman"/>
-                <w:b w:val="false"/>
-                <w:bCs w:val="false"/>
-                <w:sz w:val="22"/>
-                <w:szCs w:val="22"/>
-              </w:rPr>
-              <w:t xml:space="preserve">Tải tệp về máy</w:t>
+              <w:t xml:space="preserve">Web: tải tệp về máy. Mobile: mở bảng chia sẻ của điện thoại để lưu tệp</w:t>
             </w:r>
           </w:p>
         </w:tc>
@@ -19094,7 +19024,7 @@
                 <w:sz w:val="22"/>
                 <w:szCs w:val="22"/>
               </w:rPr>
-              <w:t xml:space="preserve">Bấm một nút ngôn ngữ (web)</w:t>
+              <w:t xml:space="preserve">Bấm một nút ngôn ngữ</w:t>
             </w:r>
           </w:p>
         </w:tc>
@@ -19196,7 +19126,7 @@
                 <w:sz w:val="22"/>
                 <w:szCs w:val="22"/>
               </w:rPr>
-              <w:t xml:space="preserve">Bấm nút phát (web)</w:t>
+              <w:t xml:space="preserve">Bấm nút phát</w:t>
             </w:r>
           </w:p>
         </w:tc>
@@ -19298,7 +19228,7 @@
                 <w:sz w:val="22"/>
                 <w:szCs w:val="22"/>
               </w:rPr>
-              <w:t xml:space="preserve">Bấm Tải về (web)</w:t>
+              <w:t xml:space="preserve">Bấm Tải về</w:t>
             </w:r>
           </w:p>
         </w:tc>
@@ -19330,7 +19260,7 @@
                 <w:sz w:val="22"/>
                 <w:szCs w:val="22"/>
               </w:rPr>
-              <w:t xml:space="preserve">Lưu tệp với tên dạng tên_gốc_mã_ngôn_ngữ</w:t>
+              <w:t xml:space="preserve">Web: lưu tệp với tên dạng tên_gốc_mã_ngôn_ngữ. Mobile: mở bảng chia sẻ</w:t>
             </w:r>
           </w:p>
         </w:tc>
@@ -19362,7 +19292,7 @@
                 <w:sz w:val="22"/>
                 <w:szCs w:val="22"/>
               </w:rPr>
-              <w:t xml:space="preserve">Trình duyệt tải tệp về máy</w:t>
+              <w:t xml:space="preserve">Tệp được lưu về máy hoặc gửi sang ứng dụng khác</w:t>
             </w:r>
           </w:p>
         </w:tc>
@@ -19502,7 +19432,7 @@
           <w:sz w:val="26"/>
           <w:szCs w:val="26"/>
         </w:rPr>
-        <w:t xml:space="preserve">Mobile chưa có kéo thả, trình phát và nút Tải về. Các phần này nằm trong danh sách việc cần bổ sung.</w:t>
+        <w:t xml:space="preserve">Mobile chưa có kéo thả tệp (chỉ bấm để chọn). Nút Tải về trên mobile mở bảng chia sẻ của điện thoại, còn trên web tải trực tiếp về máy.</w:t>
       </w:r>
     </w:p>
     <w:p>

</xml_diff>

<commit_message>
Them muc cai dat, thu nghiem va ket luan vao tai lieu
</commit_message>
<xml_diff>
--- a/docs/UseCase_Sequence.docx
+++ b/docs/UseCase_Sequence.docx
@@ -19469,6 +19469,4265 @@
           <w:szCs w:val="26"/>
         </w:rPr>
         <w:t xml:space="preserve">Luồng chuyển màn hình, dữ liệu mô phỏng và các quy tắc khóa nút là giống nhau trên hai nền tảng.</w:t>
+      </w:r>
+    </w:p>
+    <w:p>
+      <w:pPr>
+        <w:pStyle w:val="Heading2"/>
+        <w:keepNext/>
+      </w:pPr>
+      <w:r>
+        <w:rPr>
+          <w:rFonts w:ascii="Times New Roman" w:cs="Times New Roman" w:eastAsia="Times New Roman" w:hAnsi="Times New Roman"/>
+        </w:rPr>
+        <w:t xml:space="preserve">8. Cài đặt và thử nghiệm</w:t>
+      </w:r>
+    </w:p>
+    <w:p>
+      <w:pPr>
+        <w:pStyle w:val="Heading3"/>
+        <w:keepNext/>
+      </w:pPr>
+      <w:r>
+        <w:rPr>
+          <w:rFonts w:ascii="Times New Roman" w:cs="Times New Roman" w:eastAsia="Times New Roman" w:hAnsi="Times New Roman"/>
+        </w:rPr>
+        <w:t xml:space="preserve">8.1 Môi trường</w:t>
+      </w:r>
+    </w:p>
+    <w:tbl>
+      <w:tblPr>
+        <w:tblW w:type="dxa" w:w="9638"/>
+        <w:tblBorders>
+          <w:top w:val="single" w:color="auto" w:sz="4"/>
+          <w:left w:val="single" w:color="auto" w:sz="4"/>
+          <w:bottom w:val="single" w:color="auto" w:sz="4"/>
+          <w:right w:val="single" w:color="auto" w:sz="4"/>
+          <w:insideH w:val="single" w:color="auto" w:sz="4"/>
+          <w:insideV w:val="single" w:color="auto" w:sz="4"/>
+        </w:tblBorders>
+      </w:tblPr>
+      <w:tblGrid>
+        <w:gridCol w:w="3000"/>
+        <w:gridCol w:w="6638"/>
+      </w:tblGrid>
+      <w:tr>
+        <w:trPr>
+          <w:cantSplit/>
+          <w:tblHeader/>
+        </w:trPr>
+        <w:tc>
+          <w:tcPr>
+            <w:tcW w:type="dxa" w:w="3000"/>
+            <w:tcBorders>
+              <w:top w:val="single" w:color="AEB4C0" w:sz="4"/>
+              <w:left w:val="single" w:color="AEB4C0" w:sz="4"/>
+              <w:bottom w:val="single" w:color="AEB4C0" w:sz="4"/>
+              <w:right w:val="single" w:color="AEB4C0" w:sz="4"/>
+            </w:tcBorders>
+            <w:shd w:fill="E4E7F5" w:color="auto" w:val="clear"/>
+            <w:tcMar>
+              <w:top w:type="dxa" w:w="70"/>
+              <w:left w:type="dxa" w:w="110"/>
+              <w:bottom w:type="dxa" w:w="70"/>
+              <w:right w:type="dxa" w:w="110"/>
+            </w:tcMar>
+          </w:tcPr>
+          <w:p>
+            <w:pPr>
+              <w:spacing w:after="40" w:line="264"/>
+            </w:pPr>
+            <w:r>
+              <w:rPr>
+                <w:rFonts w:ascii="Times New Roman" w:cs="Times New Roman" w:eastAsia="Times New Roman" w:hAnsi="Times New Roman"/>
+                <w:b/>
+                <w:bCs/>
+                <w:sz w:val="22"/>
+                <w:szCs w:val="22"/>
+              </w:rPr>
+              <w:t xml:space="preserve">Hạng mục</w:t>
+            </w:r>
+          </w:p>
+        </w:tc>
+        <w:tc>
+          <w:tcPr>
+            <w:tcW w:type="dxa" w:w="6638"/>
+            <w:tcBorders>
+              <w:top w:val="single" w:color="AEB4C0" w:sz="4"/>
+              <w:left w:val="single" w:color="AEB4C0" w:sz="4"/>
+              <w:bottom w:val="single" w:color="AEB4C0" w:sz="4"/>
+              <w:right w:val="single" w:color="AEB4C0" w:sz="4"/>
+            </w:tcBorders>
+            <w:shd w:fill="E4E7F5" w:color="auto" w:val="clear"/>
+            <w:tcMar>
+              <w:top w:type="dxa" w:w="70"/>
+              <w:left w:type="dxa" w:w="110"/>
+              <w:bottom w:type="dxa" w:w="70"/>
+              <w:right w:type="dxa" w:w="110"/>
+            </w:tcMar>
+          </w:tcPr>
+          <w:p>
+            <w:pPr>
+              <w:spacing w:after="40" w:line="264"/>
+            </w:pPr>
+            <w:r>
+              <w:rPr>
+                <w:rFonts w:ascii="Times New Roman" w:cs="Times New Roman" w:eastAsia="Times New Roman" w:hAnsi="Times New Roman"/>
+                <w:b/>
+                <w:bCs/>
+                <w:sz w:val="22"/>
+                <w:szCs w:val="22"/>
+              </w:rPr>
+              <w:t xml:space="preserve">Công cụ và phiên bản</w:t>
+            </w:r>
+          </w:p>
+        </w:tc>
+      </w:tr>
+      <w:tr>
+        <w:trPr>
+          <w:cantSplit/>
+          <w:tblHeader w:val="false"/>
+        </w:trPr>
+        <w:tc>
+          <w:tcPr>
+            <w:tcW w:type="dxa" w:w="3000"/>
+            <w:tcBorders>
+              <w:top w:val="single" w:color="AEB4C0" w:sz="4"/>
+              <w:left w:val="single" w:color="AEB4C0" w:sz="4"/>
+              <w:bottom w:val="single" w:color="AEB4C0" w:sz="4"/>
+              <w:right w:val="single" w:color="AEB4C0" w:sz="4"/>
+            </w:tcBorders>
+            <w:tcMar>
+              <w:top w:type="dxa" w:w="70"/>
+              <w:left w:type="dxa" w:w="110"/>
+              <w:bottom w:type="dxa" w:w="70"/>
+              <w:right w:type="dxa" w:w="110"/>
+            </w:tcMar>
+          </w:tcPr>
+          <w:p>
+            <w:pPr>
+              <w:spacing w:after="40" w:line="264"/>
+            </w:pPr>
+            <w:r>
+              <w:rPr>
+                <w:rFonts w:ascii="Times New Roman" w:cs="Times New Roman" w:eastAsia="Times New Roman" w:hAnsi="Times New Roman"/>
+                <w:b w:val="false"/>
+                <w:bCs w:val="false"/>
+                <w:sz w:val="22"/>
+                <w:szCs w:val="22"/>
+              </w:rPr>
+              <w:t xml:space="preserve">Máy phát triển</w:t>
+            </w:r>
+          </w:p>
+        </w:tc>
+        <w:tc>
+          <w:tcPr>
+            <w:tcW w:type="dxa" w:w="6638"/>
+            <w:tcBorders>
+              <w:top w:val="single" w:color="AEB4C0" w:sz="4"/>
+              <w:left w:val="single" w:color="AEB4C0" w:sz="4"/>
+              <w:bottom w:val="single" w:color="AEB4C0" w:sz="4"/>
+              <w:right w:val="single" w:color="AEB4C0" w:sz="4"/>
+            </w:tcBorders>
+            <w:tcMar>
+              <w:top w:type="dxa" w:w="70"/>
+              <w:left w:type="dxa" w:w="110"/>
+              <w:bottom w:type="dxa" w:w="70"/>
+              <w:right w:type="dxa" w:w="110"/>
+            </w:tcMar>
+          </w:tcPr>
+          <w:p>
+            <w:pPr>
+              <w:spacing w:after="40" w:line="264"/>
+            </w:pPr>
+            <w:r>
+              <w:rPr>
+                <w:rFonts w:ascii="Times New Roman" w:cs="Times New Roman" w:eastAsia="Times New Roman" w:hAnsi="Times New Roman"/>
+                <w:b w:val="false"/>
+                <w:bCs w:val="false"/>
+                <w:sz w:val="22"/>
+                <w:szCs w:val="22"/>
+              </w:rPr>
+              <w:t xml:space="preserve">Windows 11</w:t>
+            </w:r>
+          </w:p>
+        </w:tc>
+      </w:tr>
+      <w:tr>
+        <w:trPr>
+          <w:cantSplit/>
+          <w:tblHeader w:val="false"/>
+        </w:trPr>
+        <w:tc>
+          <w:tcPr>
+            <w:tcW w:type="dxa" w:w="3000"/>
+            <w:tcBorders>
+              <w:top w:val="single" w:color="AEB4C0" w:sz="4"/>
+              <w:left w:val="single" w:color="AEB4C0" w:sz="4"/>
+              <w:bottom w:val="single" w:color="AEB4C0" w:sz="4"/>
+              <w:right w:val="single" w:color="AEB4C0" w:sz="4"/>
+            </w:tcBorders>
+            <w:tcMar>
+              <w:top w:type="dxa" w:w="70"/>
+              <w:left w:type="dxa" w:w="110"/>
+              <w:bottom w:type="dxa" w:w="70"/>
+              <w:right w:type="dxa" w:w="110"/>
+            </w:tcMar>
+          </w:tcPr>
+          <w:p>
+            <w:pPr>
+              <w:spacing w:after="40" w:line="264"/>
+            </w:pPr>
+            <w:r>
+              <w:rPr>
+                <w:rFonts w:ascii="Times New Roman" w:cs="Times New Roman" w:eastAsia="Times New Roman" w:hAnsi="Times New Roman"/>
+                <w:b w:val="false"/>
+                <w:bCs w:val="false"/>
+                <w:sz w:val="22"/>
+                <w:szCs w:val="22"/>
+              </w:rPr>
+              <w:t xml:space="preserve">Node.js và npm</w:t>
+            </w:r>
+          </w:p>
+        </w:tc>
+        <w:tc>
+          <w:tcPr>
+            <w:tcW w:type="dxa" w:w="6638"/>
+            <w:tcBorders>
+              <w:top w:val="single" w:color="AEB4C0" w:sz="4"/>
+              <w:left w:val="single" w:color="AEB4C0" w:sz="4"/>
+              <w:bottom w:val="single" w:color="AEB4C0" w:sz="4"/>
+              <w:right w:val="single" w:color="AEB4C0" w:sz="4"/>
+            </w:tcBorders>
+            <w:tcMar>
+              <w:top w:type="dxa" w:w="70"/>
+              <w:left w:type="dxa" w:w="110"/>
+              <w:bottom w:type="dxa" w:w="70"/>
+              <w:right w:type="dxa" w:w="110"/>
+            </w:tcMar>
+          </w:tcPr>
+          <w:p>
+            <w:pPr>
+              <w:spacing w:after="40" w:line="264"/>
+            </w:pPr>
+            <w:r>
+              <w:rPr>
+                <w:rFonts w:ascii="Times New Roman" w:cs="Times New Roman" w:eastAsia="Times New Roman" w:hAnsi="Times New Roman"/>
+                <w:b w:val="false"/>
+                <w:bCs w:val="false"/>
+                <w:sz w:val="22"/>
+                <w:szCs w:val="22"/>
+              </w:rPr>
+              <w:t xml:space="preserve">Node.js v24.21.0, npm 11.19.0</w:t>
+            </w:r>
+          </w:p>
+        </w:tc>
+      </w:tr>
+      <w:tr>
+        <w:trPr>
+          <w:cantSplit/>
+          <w:tblHeader w:val="false"/>
+        </w:trPr>
+        <w:tc>
+          <w:tcPr>
+            <w:tcW w:type="dxa" w:w="3000"/>
+            <w:tcBorders>
+              <w:top w:val="single" w:color="AEB4C0" w:sz="4"/>
+              <w:left w:val="single" w:color="AEB4C0" w:sz="4"/>
+              <w:bottom w:val="single" w:color="AEB4C0" w:sz="4"/>
+              <w:right w:val="single" w:color="AEB4C0" w:sz="4"/>
+            </w:tcBorders>
+            <w:tcMar>
+              <w:top w:type="dxa" w:w="70"/>
+              <w:left w:type="dxa" w:w="110"/>
+              <w:bottom w:type="dxa" w:w="70"/>
+              <w:right w:type="dxa" w:w="110"/>
+            </w:tcMar>
+          </w:tcPr>
+          <w:p>
+            <w:pPr>
+              <w:spacing w:after="40" w:line="264"/>
+            </w:pPr>
+            <w:r>
+              <w:rPr>
+                <w:rFonts w:ascii="Times New Roman" w:cs="Times New Roman" w:eastAsia="Times New Roman" w:hAnsi="Times New Roman"/>
+                <w:b w:val="false"/>
+                <w:bCs w:val="false"/>
+                <w:sz w:val="22"/>
+                <w:szCs w:val="22"/>
+              </w:rPr>
+              <w:t xml:space="preserve">Quản lý mã nguồn</w:t>
+            </w:r>
+          </w:p>
+        </w:tc>
+        <w:tc>
+          <w:tcPr>
+            <w:tcW w:type="dxa" w:w="6638"/>
+            <w:tcBorders>
+              <w:top w:val="single" w:color="AEB4C0" w:sz="4"/>
+              <w:left w:val="single" w:color="AEB4C0" w:sz="4"/>
+              <w:bottom w:val="single" w:color="AEB4C0" w:sz="4"/>
+              <w:right w:val="single" w:color="AEB4C0" w:sz="4"/>
+            </w:tcBorders>
+            <w:tcMar>
+              <w:top w:type="dxa" w:w="70"/>
+              <w:left w:type="dxa" w:w="110"/>
+              <w:bottom w:type="dxa" w:w="70"/>
+              <w:right w:type="dxa" w:w="110"/>
+            </w:tcMar>
+          </w:tcPr>
+          <w:p>
+            <w:pPr>
+              <w:spacing w:after="40" w:line="264"/>
+            </w:pPr>
+            <w:r>
+              <w:rPr>
+                <w:rFonts w:ascii="Times New Roman" w:cs="Times New Roman" w:eastAsia="Times New Roman" w:hAnsi="Times New Roman"/>
+                <w:b w:val="false"/>
+                <w:bCs w:val="false"/>
+                <w:sz w:val="22"/>
+                <w:szCs w:val="22"/>
+              </w:rPr>
+              <w:t xml:space="preserve">Git 2.56.0, GitHub (repository CNPM)</w:t>
+            </w:r>
+          </w:p>
+        </w:tc>
+      </w:tr>
+      <w:tr>
+        <w:trPr>
+          <w:cantSplit/>
+          <w:tblHeader w:val="false"/>
+        </w:trPr>
+        <w:tc>
+          <w:tcPr>
+            <w:tcW w:type="dxa" w:w="3000"/>
+            <w:tcBorders>
+              <w:top w:val="single" w:color="AEB4C0" w:sz="4"/>
+              <w:left w:val="single" w:color="AEB4C0" w:sz="4"/>
+              <w:bottom w:val="single" w:color="AEB4C0" w:sz="4"/>
+              <w:right w:val="single" w:color="AEB4C0" w:sz="4"/>
+            </w:tcBorders>
+            <w:tcMar>
+              <w:top w:type="dxa" w:w="70"/>
+              <w:left w:type="dxa" w:w="110"/>
+              <w:bottom w:type="dxa" w:w="70"/>
+              <w:right w:type="dxa" w:w="110"/>
+            </w:tcMar>
+          </w:tcPr>
+          <w:p>
+            <w:pPr>
+              <w:spacing w:after="40" w:line="264"/>
+            </w:pPr>
+            <w:r>
+              <w:rPr>
+                <w:rFonts w:ascii="Times New Roman" w:cs="Times New Roman" w:eastAsia="Times New Roman" w:hAnsi="Times New Roman"/>
+                <w:b w:val="false"/>
+                <w:bCs w:val="false"/>
+                <w:sz w:val="22"/>
+                <w:szCs w:val="22"/>
+              </w:rPr>
+              <w:t xml:space="preserve">Web</w:t>
+            </w:r>
+          </w:p>
+        </w:tc>
+        <w:tc>
+          <w:tcPr>
+            <w:tcW w:type="dxa" w:w="6638"/>
+            <w:tcBorders>
+              <w:top w:val="single" w:color="AEB4C0" w:sz="4"/>
+              <w:left w:val="single" w:color="AEB4C0" w:sz="4"/>
+              <w:bottom w:val="single" w:color="AEB4C0" w:sz="4"/>
+              <w:right w:val="single" w:color="AEB4C0" w:sz="4"/>
+            </w:tcBorders>
+            <w:tcMar>
+              <w:top w:type="dxa" w:w="70"/>
+              <w:left w:type="dxa" w:w="110"/>
+              <w:bottom w:type="dxa" w:w="70"/>
+              <w:right w:type="dxa" w:w="110"/>
+            </w:tcMar>
+          </w:tcPr>
+          <w:p>
+            <w:pPr>
+              <w:spacing w:after="40" w:line="264"/>
+            </w:pPr>
+            <w:r>
+              <w:rPr>
+                <w:rFonts w:ascii="Times New Roman" w:cs="Times New Roman" w:eastAsia="Times New Roman" w:hAnsi="Times New Roman"/>
+                <w:b w:val="false"/>
+                <w:bCs w:val="false"/>
+                <w:sz w:val="22"/>
+                <w:szCs w:val="22"/>
+              </w:rPr>
+              <w:t xml:space="preserve">React 19, Vite 8.3.1, JavaScript</w:t>
+            </w:r>
+          </w:p>
+        </w:tc>
+      </w:tr>
+      <w:tr>
+        <w:trPr>
+          <w:cantSplit/>
+          <w:tblHeader w:val="false"/>
+        </w:trPr>
+        <w:tc>
+          <w:tcPr>
+            <w:tcW w:type="dxa" w:w="3000"/>
+            <w:tcBorders>
+              <w:top w:val="single" w:color="AEB4C0" w:sz="4"/>
+              <w:left w:val="single" w:color="AEB4C0" w:sz="4"/>
+              <w:bottom w:val="single" w:color="AEB4C0" w:sz="4"/>
+              <w:right w:val="single" w:color="AEB4C0" w:sz="4"/>
+            </w:tcBorders>
+            <w:tcMar>
+              <w:top w:type="dxa" w:w="70"/>
+              <w:left w:type="dxa" w:w="110"/>
+              <w:bottom w:type="dxa" w:w="70"/>
+              <w:right w:type="dxa" w:w="110"/>
+            </w:tcMar>
+          </w:tcPr>
+          <w:p>
+            <w:pPr>
+              <w:spacing w:after="40" w:line="264"/>
+            </w:pPr>
+            <w:r>
+              <w:rPr>
+                <w:rFonts w:ascii="Times New Roman" w:cs="Times New Roman" w:eastAsia="Times New Roman" w:hAnsi="Times New Roman"/>
+                <w:b w:val="false"/>
+                <w:bCs w:val="false"/>
+                <w:sz w:val="22"/>
+                <w:szCs w:val="22"/>
+              </w:rPr>
+              <w:t xml:space="preserve">Mobile</w:t>
+            </w:r>
+          </w:p>
+        </w:tc>
+        <w:tc>
+          <w:tcPr>
+            <w:tcW w:type="dxa" w:w="6638"/>
+            <w:tcBorders>
+              <w:top w:val="single" w:color="AEB4C0" w:sz="4"/>
+              <w:left w:val="single" w:color="AEB4C0" w:sz="4"/>
+              <w:bottom w:val="single" w:color="AEB4C0" w:sz="4"/>
+              <w:right w:val="single" w:color="AEB4C0" w:sz="4"/>
+            </w:tcBorders>
+            <w:tcMar>
+              <w:top w:type="dxa" w:w="70"/>
+              <w:left w:type="dxa" w:w="110"/>
+              <w:bottom w:type="dxa" w:w="70"/>
+              <w:right w:type="dxa" w:w="110"/>
+            </w:tcMar>
+          </w:tcPr>
+          <w:p>
+            <w:pPr>
+              <w:spacing w:after="40" w:line="264"/>
+            </w:pPr>
+            <w:r>
+              <w:rPr>
+                <w:rFonts w:ascii="Times New Roman" w:cs="Times New Roman" w:eastAsia="Times New Roman" w:hAnsi="Times New Roman"/>
+                <w:b w:val="false"/>
+                <w:bCs w:val="false"/>
+                <w:sz w:val="22"/>
+                <w:szCs w:val="22"/>
+              </w:rPr>
+              <w:t xml:space="preserve">React Native, Expo SDK 57, Expo Router, TypeScript</w:t>
+            </w:r>
+          </w:p>
+        </w:tc>
+      </w:tr>
+      <w:tr>
+        <w:trPr>
+          <w:cantSplit/>
+          <w:tblHeader w:val="false"/>
+        </w:trPr>
+        <w:tc>
+          <w:tcPr>
+            <w:tcW w:type="dxa" w:w="3000"/>
+            <w:tcBorders>
+              <w:top w:val="single" w:color="AEB4C0" w:sz="4"/>
+              <w:left w:val="single" w:color="AEB4C0" w:sz="4"/>
+              <w:bottom w:val="single" w:color="AEB4C0" w:sz="4"/>
+              <w:right w:val="single" w:color="AEB4C0" w:sz="4"/>
+            </w:tcBorders>
+            <w:tcMar>
+              <w:top w:type="dxa" w:w="70"/>
+              <w:left w:type="dxa" w:w="110"/>
+              <w:bottom w:type="dxa" w:w="70"/>
+              <w:right w:type="dxa" w:w="110"/>
+            </w:tcMar>
+          </w:tcPr>
+          <w:p>
+            <w:pPr>
+              <w:spacing w:after="40" w:line="264"/>
+            </w:pPr>
+            <w:r>
+              <w:rPr>
+                <w:rFonts w:ascii="Times New Roman" w:cs="Times New Roman" w:eastAsia="Times New Roman" w:hAnsi="Times New Roman"/>
+                <w:b w:val="false"/>
+                <w:bCs w:val="false"/>
+                <w:sz w:val="22"/>
+                <w:szCs w:val="22"/>
+              </w:rPr>
+              <w:t xml:space="preserve">Thư viện mobile</w:t>
+            </w:r>
+          </w:p>
+        </w:tc>
+        <w:tc>
+          <w:tcPr>
+            <w:tcW w:type="dxa" w:w="6638"/>
+            <w:tcBorders>
+              <w:top w:val="single" w:color="AEB4C0" w:sz="4"/>
+              <w:left w:val="single" w:color="AEB4C0" w:sz="4"/>
+              <w:bottom w:val="single" w:color="AEB4C0" w:sz="4"/>
+              <w:right w:val="single" w:color="AEB4C0" w:sz="4"/>
+            </w:tcBorders>
+            <w:tcMar>
+              <w:top w:type="dxa" w:w="70"/>
+              <w:left w:type="dxa" w:w="110"/>
+              <w:bottom w:type="dxa" w:w="70"/>
+              <w:right w:type="dxa" w:w="110"/>
+            </w:tcMar>
+          </w:tcPr>
+          <w:p>
+            <w:pPr>
+              <w:spacing w:after="40" w:line="264"/>
+            </w:pPr>
+            <w:r>
+              <w:rPr>
+                <w:rFonts w:ascii="Times New Roman" w:cs="Times New Roman" w:eastAsia="Times New Roman" w:hAnsi="Times New Roman"/>
+                <w:b w:val="false"/>
+                <w:bCs w:val="false"/>
+                <w:sz w:val="22"/>
+                <w:szCs w:val="22"/>
+              </w:rPr>
+              <w:t xml:space="preserve">expo-document-picker (chọn tệp), expo-video (phát video/audio), expo-sharing (chia sẻ, lưu tệp)</w:t>
+            </w:r>
+          </w:p>
+        </w:tc>
+      </w:tr>
+      <w:tr>
+        <w:trPr>
+          <w:cantSplit/>
+          <w:tblHeader w:val="false"/>
+        </w:trPr>
+        <w:tc>
+          <w:tcPr>
+            <w:tcW w:type="dxa" w:w="3000"/>
+            <w:tcBorders>
+              <w:top w:val="single" w:color="AEB4C0" w:sz="4"/>
+              <w:left w:val="single" w:color="AEB4C0" w:sz="4"/>
+              <w:bottom w:val="single" w:color="AEB4C0" w:sz="4"/>
+              <w:right w:val="single" w:color="AEB4C0" w:sz="4"/>
+            </w:tcBorders>
+            <w:tcMar>
+              <w:top w:type="dxa" w:w="70"/>
+              <w:left w:type="dxa" w:w="110"/>
+              <w:bottom w:type="dxa" w:w="70"/>
+              <w:right w:type="dxa" w:w="110"/>
+            </w:tcMar>
+          </w:tcPr>
+          <w:p>
+            <w:pPr>
+              <w:spacing w:after="40" w:line="264"/>
+            </w:pPr>
+            <w:r>
+              <w:rPr>
+                <w:rFonts w:ascii="Times New Roman" w:cs="Times New Roman" w:eastAsia="Times New Roman" w:hAnsi="Times New Roman"/>
+                <w:b w:val="false"/>
+                <w:bCs w:val="false"/>
+                <w:sz w:val="22"/>
+                <w:szCs w:val="22"/>
+              </w:rPr>
+              <w:t xml:space="preserve">Kiểm tra tự động (CI)</w:t>
+            </w:r>
+          </w:p>
+        </w:tc>
+        <w:tc>
+          <w:tcPr>
+            <w:tcW w:type="dxa" w:w="6638"/>
+            <w:tcBorders>
+              <w:top w:val="single" w:color="AEB4C0" w:sz="4"/>
+              <w:left w:val="single" w:color="AEB4C0" w:sz="4"/>
+              <w:bottom w:val="single" w:color="AEB4C0" w:sz="4"/>
+              <w:right w:val="single" w:color="AEB4C0" w:sz="4"/>
+            </w:tcBorders>
+            <w:tcMar>
+              <w:top w:type="dxa" w:w="70"/>
+              <w:left w:type="dxa" w:w="110"/>
+              <w:bottom w:type="dxa" w:w="70"/>
+              <w:right w:type="dxa" w:w="110"/>
+            </w:tcMar>
+          </w:tcPr>
+          <w:p>
+            <w:pPr>
+              <w:spacing w:after="40" w:line="264"/>
+            </w:pPr>
+            <w:r>
+              <w:rPr>
+                <w:rFonts w:ascii="Times New Roman" w:cs="Times New Roman" w:eastAsia="Times New Roman" w:hAnsi="Times New Roman"/>
+                <w:b w:val="false"/>
+                <w:bCs w:val="false"/>
+                <w:sz w:val="22"/>
+                <w:szCs w:val="22"/>
+              </w:rPr>
+              <w:t xml:space="preserve">GitHub Actions: Web CI (cài thư viện, lint, build) và Mobile CI (cài thư viện, kiểm tra kiểu TypeScript)</w:t>
+            </w:r>
+          </w:p>
+        </w:tc>
+      </w:tr>
+      <w:tr>
+        <w:trPr>
+          <w:cantSplit/>
+          <w:tblHeader w:val="false"/>
+        </w:trPr>
+        <w:tc>
+          <w:tcPr>
+            <w:tcW w:type="dxa" w:w="3000"/>
+            <w:tcBorders>
+              <w:top w:val="single" w:color="AEB4C0" w:sz="4"/>
+              <w:left w:val="single" w:color="AEB4C0" w:sz="4"/>
+              <w:bottom w:val="single" w:color="AEB4C0" w:sz="4"/>
+              <w:right w:val="single" w:color="AEB4C0" w:sz="4"/>
+            </w:tcBorders>
+            <w:tcMar>
+              <w:top w:type="dxa" w:w="70"/>
+              <w:left w:type="dxa" w:w="110"/>
+              <w:bottom w:type="dxa" w:w="70"/>
+              <w:right w:type="dxa" w:w="110"/>
+            </w:tcMar>
+          </w:tcPr>
+          <w:p>
+            <w:pPr>
+              <w:spacing w:after="40" w:line="264"/>
+            </w:pPr>
+            <w:r>
+              <w:rPr>
+                <w:rFonts w:ascii="Times New Roman" w:cs="Times New Roman" w:eastAsia="Times New Roman" w:hAnsi="Times New Roman"/>
+                <w:b w:val="false"/>
+                <w:bCs w:val="false"/>
+                <w:sz w:val="22"/>
+                <w:szCs w:val="22"/>
+              </w:rPr>
+              <w:t xml:space="preserve">Triển khai (CD)</w:t>
+            </w:r>
+          </w:p>
+        </w:tc>
+        <w:tc>
+          <w:tcPr>
+            <w:tcW w:type="dxa" w:w="6638"/>
+            <w:tcBorders>
+              <w:top w:val="single" w:color="AEB4C0" w:sz="4"/>
+              <w:left w:val="single" w:color="AEB4C0" w:sz="4"/>
+              <w:bottom w:val="single" w:color="AEB4C0" w:sz="4"/>
+              <w:right w:val="single" w:color="AEB4C0" w:sz="4"/>
+            </w:tcBorders>
+            <w:tcMar>
+              <w:top w:type="dxa" w:w="70"/>
+              <w:left w:type="dxa" w:w="110"/>
+              <w:bottom w:type="dxa" w:w="70"/>
+              <w:right w:type="dxa" w:w="110"/>
+            </w:tcMar>
+          </w:tcPr>
+          <w:p>
+            <w:pPr>
+              <w:spacing w:after="40" w:line="264"/>
+            </w:pPr>
+            <w:r>
+              <w:rPr>
+                <w:rFonts w:ascii="Times New Roman" w:cs="Times New Roman" w:eastAsia="Times New Roman" w:hAnsi="Times New Roman"/>
+                <w:b w:val="false"/>
+                <w:bCs w:val="false"/>
+                <w:sz w:val="22"/>
+                <w:szCs w:val="22"/>
+              </w:rPr>
+              <w:t xml:space="preserve">Vercel, tự động cập nhật bản web khi gộp mã vào nhánh main</w:t>
+            </w:r>
+          </w:p>
+        </w:tc>
+      </w:tr>
+      <w:tr>
+        <w:trPr>
+          <w:cantSplit/>
+          <w:tblHeader w:val="false"/>
+        </w:trPr>
+        <w:tc>
+          <w:tcPr>
+            <w:tcW w:type="dxa" w:w="3000"/>
+            <w:tcBorders>
+              <w:top w:val="single" w:color="AEB4C0" w:sz="4"/>
+              <w:left w:val="single" w:color="AEB4C0" w:sz="4"/>
+              <w:bottom w:val="single" w:color="AEB4C0" w:sz="4"/>
+              <w:right w:val="single" w:color="AEB4C0" w:sz="4"/>
+            </w:tcBorders>
+            <w:tcMar>
+              <w:top w:type="dxa" w:w="70"/>
+              <w:left w:type="dxa" w:w="110"/>
+              <w:bottom w:type="dxa" w:w="70"/>
+              <w:right w:type="dxa" w:w="110"/>
+            </w:tcMar>
+          </w:tcPr>
+          <w:p>
+            <w:pPr>
+              <w:spacing w:after="40" w:line="264"/>
+            </w:pPr>
+            <w:r>
+              <w:rPr>
+                <w:rFonts w:ascii="Times New Roman" w:cs="Times New Roman" w:eastAsia="Times New Roman" w:hAnsi="Times New Roman"/>
+                <w:b w:val="false"/>
+                <w:bCs w:val="false"/>
+                <w:sz w:val="22"/>
+                <w:szCs w:val="22"/>
+              </w:rPr>
+              <w:t xml:space="preserve">Thiết bị thử web</w:t>
+            </w:r>
+          </w:p>
+        </w:tc>
+        <w:tc>
+          <w:tcPr>
+            <w:tcW w:type="dxa" w:w="6638"/>
+            <w:tcBorders>
+              <w:top w:val="single" w:color="AEB4C0" w:sz="4"/>
+              <w:left w:val="single" w:color="AEB4C0" w:sz="4"/>
+              <w:bottom w:val="single" w:color="AEB4C0" w:sz="4"/>
+              <w:right w:val="single" w:color="AEB4C0" w:sz="4"/>
+            </w:tcBorders>
+            <w:tcMar>
+              <w:top w:type="dxa" w:w="70"/>
+              <w:left w:type="dxa" w:w="110"/>
+              <w:bottom w:type="dxa" w:w="70"/>
+              <w:right w:type="dxa" w:w="110"/>
+            </w:tcMar>
+          </w:tcPr>
+          <w:p>
+            <w:pPr>
+              <w:spacing w:after="40" w:line="264"/>
+            </w:pPr>
+            <w:r>
+              <w:rPr>
+                <w:rFonts w:ascii="Times New Roman" w:cs="Times New Roman" w:eastAsia="Times New Roman" w:hAnsi="Times New Roman"/>
+                <w:b w:val="false"/>
+                <w:bCs w:val="false"/>
+                <w:sz w:val="22"/>
+                <w:szCs w:val="22"/>
+              </w:rPr>
+              <w:t xml:space="preserve">Máy tính Windows 11, trình duyệt Google Chrome</w:t>
+            </w:r>
+          </w:p>
+        </w:tc>
+      </w:tr>
+      <w:tr>
+        <w:trPr>
+          <w:cantSplit/>
+          <w:tblHeader w:val="false"/>
+        </w:trPr>
+        <w:tc>
+          <w:tcPr>
+            <w:tcW w:type="dxa" w:w="3000"/>
+            <w:tcBorders>
+              <w:top w:val="single" w:color="AEB4C0" w:sz="4"/>
+              <w:left w:val="single" w:color="AEB4C0" w:sz="4"/>
+              <w:bottom w:val="single" w:color="AEB4C0" w:sz="4"/>
+              <w:right w:val="single" w:color="AEB4C0" w:sz="4"/>
+            </w:tcBorders>
+            <w:tcMar>
+              <w:top w:type="dxa" w:w="70"/>
+              <w:left w:type="dxa" w:w="110"/>
+              <w:bottom w:type="dxa" w:w="70"/>
+              <w:right w:type="dxa" w:w="110"/>
+            </w:tcMar>
+          </w:tcPr>
+          <w:p>
+            <w:pPr>
+              <w:spacing w:after="40" w:line="264"/>
+            </w:pPr>
+            <w:r>
+              <w:rPr>
+                <w:rFonts w:ascii="Times New Roman" w:cs="Times New Roman" w:eastAsia="Times New Roman" w:hAnsi="Times New Roman"/>
+                <w:b w:val="false"/>
+                <w:bCs w:val="false"/>
+                <w:sz w:val="22"/>
+                <w:szCs w:val="22"/>
+              </w:rPr>
+              <w:t xml:space="preserve">Thiết bị thử mobile</w:t>
+            </w:r>
+          </w:p>
+        </w:tc>
+        <w:tc>
+          <w:tcPr>
+            <w:tcW w:type="dxa" w:w="6638"/>
+            <w:tcBorders>
+              <w:top w:val="single" w:color="AEB4C0" w:sz="4"/>
+              <w:left w:val="single" w:color="AEB4C0" w:sz="4"/>
+              <w:bottom w:val="single" w:color="AEB4C0" w:sz="4"/>
+              <w:right w:val="single" w:color="AEB4C0" w:sz="4"/>
+            </w:tcBorders>
+            <w:tcMar>
+              <w:top w:type="dxa" w:w="70"/>
+              <w:left w:type="dxa" w:w="110"/>
+              <w:bottom w:type="dxa" w:w="70"/>
+              <w:right w:type="dxa" w:w="110"/>
+            </w:tcMar>
+          </w:tcPr>
+          <w:p>
+            <w:pPr>
+              <w:spacing w:after="40" w:line="264"/>
+            </w:pPr>
+            <w:r>
+              <w:rPr>
+                <w:rFonts w:ascii="Times New Roman" w:cs="Times New Roman" w:eastAsia="Times New Roman" w:hAnsi="Times New Roman"/>
+                <w:b w:val="false"/>
+                <w:bCs w:val="false"/>
+                <w:sz w:val="22"/>
+                <w:szCs w:val="22"/>
+              </w:rPr>
+              <w:t xml:space="preserve">iPhone, chạy ứng dụng Expo Go</w:t>
+            </w:r>
+          </w:p>
+        </w:tc>
+      </w:tr>
+      <w:tr>
+        <w:trPr>
+          <w:cantSplit/>
+          <w:tblHeader w:val="false"/>
+        </w:trPr>
+        <w:tc>
+          <w:tcPr>
+            <w:tcW w:type="dxa" w:w="3000"/>
+            <w:tcBorders>
+              <w:top w:val="single" w:color="AEB4C0" w:sz="4"/>
+              <w:left w:val="single" w:color="AEB4C0" w:sz="4"/>
+              <w:bottom w:val="single" w:color="AEB4C0" w:sz="4"/>
+              <w:right w:val="single" w:color="AEB4C0" w:sz="4"/>
+            </w:tcBorders>
+            <w:tcMar>
+              <w:top w:type="dxa" w:w="70"/>
+              <w:left w:type="dxa" w:w="110"/>
+              <w:bottom w:type="dxa" w:w="70"/>
+              <w:right w:type="dxa" w:w="110"/>
+            </w:tcMar>
+          </w:tcPr>
+          <w:p>
+            <w:pPr>
+              <w:spacing w:after="40" w:line="264"/>
+            </w:pPr>
+            <w:r>
+              <w:rPr>
+                <w:rFonts w:ascii="Times New Roman" w:cs="Times New Roman" w:eastAsia="Times New Roman" w:hAnsi="Times New Roman"/>
+                <w:b w:val="false"/>
+                <w:bCs w:val="false"/>
+                <w:sz w:val="22"/>
+                <w:szCs w:val="22"/>
+              </w:rPr>
+              <w:t xml:space="preserve">Bản chạy thử</w:t>
+            </w:r>
+          </w:p>
+        </w:tc>
+        <w:tc>
+          <w:tcPr>
+            <w:tcW w:type="dxa" w:w="6638"/>
+            <w:tcBorders>
+              <w:top w:val="single" w:color="AEB4C0" w:sz="4"/>
+              <w:left w:val="single" w:color="AEB4C0" w:sz="4"/>
+              <w:bottom w:val="single" w:color="AEB4C0" w:sz="4"/>
+              <w:right w:val="single" w:color="AEB4C0" w:sz="4"/>
+            </w:tcBorders>
+            <w:tcMar>
+              <w:top w:type="dxa" w:w="70"/>
+              <w:left w:type="dxa" w:w="110"/>
+              <w:bottom w:type="dxa" w:w="70"/>
+              <w:right w:type="dxa" w:w="110"/>
+            </w:tcMar>
+          </w:tcPr>
+          <w:p>
+            <w:pPr>
+              <w:spacing w:after="40" w:line="264"/>
+            </w:pPr>
+            <w:r>
+              <w:rPr>
+                <w:rFonts w:ascii="Times New Roman" w:cs="Times New Roman" w:eastAsia="Times New Roman" w:hAnsi="Times New Roman"/>
+                <w:b w:val="false"/>
+                <w:bCs w:val="false"/>
+                <w:sz w:val="22"/>
+                <w:szCs w:val="22"/>
+              </w:rPr>
+              <w:t xml:space="preserve">https://cnpm-pied.vercel.app</w:t>
+            </w:r>
+          </w:p>
+        </w:tc>
+      </w:tr>
+    </w:tbl>
+    <w:p>
+      <w:pPr>
+        <w:spacing w:after="100"/>
+      </w:pPr>
+    </w:p>
+    <w:p>
+      <w:pPr>
+        <w:pStyle w:val="Heading3"/>
+        <w:keepNext/>
+      </w:pPr>
+      <w:r>
+        <w:rPr>
+          <w:rFonts w:ascii="Times New Roman" w:cs="Times New Roman" w:eastAsia="Times New Roman" w:hAnsi="Times New Roman"/>
+        </w:rPr>
+        <w:t xml:space="preserve">8.2 Cách cài đặt và chạy</w:t>
+      </w:r>
+    </w:p>
+    <w:p>
+      <w:pPr>
+        <w:spacing w:after="120" w:line="288"/>
+      </w:pPr>
+      <w:r>
+        <w:rPr>
+          <w:rFonts w:ascii="Times New Roman" w:cs="Times New Roman" w:eastAsia="Times New Roman" w:hAnsi="Times New Roman"/>
+          <w:sz w:val="26"/>
+          <w:szCs w:val="26"/>
+        </w:rPr>
+        <w:t xml:space="preserve">Yêu cầu: cài Git và Node.js (bản LTS). Mobile cần thêm tài khoản Expo (đăng nhập bằng npx expo login) và ứng dụng Expo Go trên điện thoại.</w:t>
+      </w:r>
+    </w:p>
+    <w:tbl>
+      <w:tblPr>
+        <w:tblW w:type="dxa" w:w="9638"/>
+        <w:tblBorders>
+          <w:top w:val="single" w:color="auto" w:sz="4"/>
+          <w:left w:val="single" w:color="auto" w:sz="4"/>
+          <w:bottom w:val="single" w:color="auto" w:sz="4"/>
+          <w:right w:val="single" w:color="auto" w:sz="4"/>
+          <w:insideH w:val="single" w:color="auto" w:sz="4"/>
+          <w:insideV w:val="single" w:color="auto" w:sz="4"/>
+        </w:tblBorders>
+      </w:tblPr>
+      <w:tblGrid>
+        <w:gridCol w:w="2200"/>
+        <w:gridCol w:w="7438"/>
+      </w:tblGrid>
+      <w:tr>
+        <w:trPr>
+          <w:cantSplit/>
+          <w:tblHeader/>
+        </w:trPr>
+        <w:tc>
+          <w:tcPr>
+            <w:tcW w:type="dxa" w:w="2200"/>
+            <w:tcBorders>
+              <w:top w:val="single" w:color="AEB4C0" w:sz="4"/>
+              <w:left w:val="single" w:color="AEB4C0" w:sz="4"/>
+              <w:bottom w:val="single" w:color="AEB4C0" w:sz="4"/>
+              <w:right w:val="single" w:color="AEB4C0" w:sz="4"/>
+            </w:tcBorders>
+            <w:shd w:fill="E4E7F5" w:color="auto" w:val="clear"/>
+            <w:tcMar>
+              <w:top w:type="dxa" w:w="70"/>
+              <w:left w:type="dxa" w:w="110"/>
+              <w:bottom w:type="dxa" w:w="70"/>
+              <w:right w:type="dxa" w:w="110"/>
+            </w:tcMar>
+          </w:tcPr>
+          <w:p>
+            <w:pPr>
+              <w:spacing w:after="40" w:line="264"/>
+            </w:pPr>
+            <w:r>
+              <w:rPr>
+                <w:rFonts w:ascii="Times New Roman" w:cs="Times New Roman" w:eastAsia="Times New Roman" w:hAnsi="Times New Roman"/>
+                <w:b/>
+                <w:bCs/>
+                <w:sz w:val="22"/>
+                <w:szCs w:val="22"/>
+              </w:rPr>
+              <w:t xml:space="preserve">Bước</w:t>
+            </w:r>
+          </w:p>
+        </w:tc>
+        <w:tc>
+          <w:tcPr>
+            <w:tcW w:type="dxa" w:w="7438"/>
+            <w:tcBorders>
+              <w:top w:val="single" w:color="AEB4C0" w:sz="4"/>
+              <w:left w:val="single" w:color="AEB4C0" w:sz="4"/>
+              <w:bottom w:val="single" w:color="AEB4C0" w:sz="4"/>
+              <w:right w:val="single" w:color="AEB4C0" w:sz="4"/>
+            </w:tcBorders>
+            <w:shd w:fill="E4E7F5" w:color="auto" w:val="clear"/>
+            <w:tcMar>
+              <w:top w:type="dxa" w:w="70"/>
+              <w:left w:type="dxa" w:w="110"/>
+              <w:bottom w:type="dxa" w:w="70"/>
+              <w:right w:type="dxa" w:w="110"/>
+            </w:tcMar>
+          </w:tcPr>
+          <w:p>
+            <w:pPr>
+              <w:spacing w:after="40" w:line="264"/>
+            </w:pPr>
+            <w:r>
+              <w:rPr>
+                <w:rFonts w:ascii="Times New Roman" w:cs="Times New Roman" w:eastAsia="Times New Roman" w:hAnsi="Times New Roman"/>
+                <w:b/>
+                <w:bCs/>
+                <w:sz w:val="22"/>
+                <w:szCs w:val="22"/>
+              </w:rPr>
+              <w:t xml:space="preserve">Lệnh</w:t>
+            </w:r>
+          </w:p>
+        </w:tc>
+      </w:tr>
+      <w:tr>
+        <w:trPr>
+          <w:cantSplit/>
+          <w:tblHeader w:val="false"/>
+        </w:trPr>
+        <w:tc>
+          <w:tcPr>
+            <w:tcW w:type="dxa" w:w="2200"/>
+            <w:tcBorders>
+              <w:top w:val="single" w:color="AEB4C0" w:sz="4"/>
+              <w:left w:val="single" w:color="AEB4C0" w:sz="4"/>
+              <w:bottom w:val="single" w:color="AEB4C0" w:sz="4"/>
+              <w:right w:val="single" w:color="AEB4C0" w:sz="4"/>
+            </w:tcBorders>
+            <w:tcMar>
+              <w:top w:type="dxa" w:w="70"/>
+              <w:left w:type="dxa" w:w="110"/>
+              <w:bottom w:type="dxa" w:w="70"/>
+              <w:right w:type="dxa" w:w="110"/>
+            </w:tcMar>
+          </w:tcPr>
+          <w:p>
+            <w:pPr>
+              <w:spacing w:after="40" w:line="264"/>
+            </w:pPr>
+            <w:r>
+              <w:rPr>
+                <w:rFonts w:ascii="Times New Roman" w:cs="Times New Roman" w:eastAsia="Times New Roman" w:hAnsi="Times New Roman"/>
+                <w:b w:val="false"/>
+                <w:bCs w:val="false"/>
+                <w:sz w:val="22"/>
+                <w:szCs w:val="22"/>
+              </w:rPr>
+              <w:t xml:space="preserve">Tải mã nguồn</w:t>
+            </w:r>
+          </w:p>
+        </w:tc>
+        <w:tc>
+          <w:tcPr>
+            <w:tcW w:type="dxa" w:w="7438"/>
+            <w:tcBorders>
+              <w:top w:val="single" w:color="AEB4C0" w:sz="4"/>
+              <w:left w:val="single" w:color="AEB4C0" w:sz="4"/>
+              <w:bottom w:val="single" w:color="AEB4C0" w:sz="4"/>
+              <w:right w:val="single" w:color="AEB4C0" w:sz="4"/>
+            </w:tcBorders>
+            <w:tcMar>
+              <w:top w:type="dxa" w:w="70"/>
+              <w:left w:type="dxa" w:w="110"/>
+              <w:bottom w:type="dxa" w:w="70"/>
+              <w:right w:type="dxa" w:w="110"/>
+            </w:tcMar>
+          </w:tcPr>
+          <w:p>
+            <w:pPr>
+              <w:spacing w:after="40" w:line="264"/>
+            </w:pPr>
+            <w:r>
+              <w:rPr>
+                <w:rFonts w:ascii="Times New Roman" w:cs="Times New Roman" w:eastAsia="Times New Roman" w:hAnsi="Times New Roman"/>
+                <w:b w:val="false"/>
+                <w:bCs w:val="false"/>
+                <w:sz w:val="22"/>
+                <w:szCs w:val="22"/>
+              </w:rPr>
+              <w:t xml:space="preserve">git clone https://github.com/quangdieuluong2006-ctrl/CNPM.git</w:t>
+            </w:r>
+          </w:p>
+        </w:tc>
+      </w:tr>
+      <w:tr>
+        <w:trPr>
+          <w:cantSplit/>
+          <w:tblHeader w:val="false"/>
+        </w:trPr>
+        <w:tc>
+          <w:tcPr>
+            <w:tcW w:type="dxa" w:w="2200"/>
+            <w:tcBorders>
+              <w:top w:val="single" w:color="AEB4C0" w:sz="4"/>
+              <w:left w:val="single" w:color="AEB4C0" w:sz="4"/>
+              <w:bottom w:val="single" w:color="AEB4C0" w:sz="4"/>
+              <w:right w:val="single" w:color="AEB4C0" w:sz="4"/>
+            </w:tcBorders>
+            <w:tcMar>
+              <w:top w:type="dxa" w:w="70"/>
+              <w:left w:type="dxa" w:w="110"/>
+              <w:bottom w:type="dxa" w:w="70"/>
+              <w:right w:type="dxa" w:w="110"/>
+            </w:tcMar>
+          </w:tcPr>
+          <w:p>
+            <w:pPr>
+              <w:spacing w:after="40" w:line="264"/>
+            </w:pPr>
+            <w:r>
+              <w:rPr>
+                <w:rFonts w:ascii="Times New Roman" w:cs="Times New Roman" w:eastAsia="Times New Roman" w:hAnsi="Times New Roman"/>
+                <w:b w:val="false"/>
+                <w:bCs w:val="false"/>
+                <w:sz w:val="22"/>
+                <w:szCs w:val="22"/>
+              </w:rPr>
+              <w:t xml:space="preserve">Chạy web</w:t>
+            </w:r>
+          </w:p>
+        </w:tc>
+        <w:tc>
+          <w:tcPr>
+            <w:tcW w:type="dxa" w:w="7438"/>
+            <w:tcBorders>
+              <w:top w:val="single" w:color="AEB4C0" w:sz="4"/>
+              <w:left w:val="single" w:color="AEB4C0" w:sz="4"/>
+              <w:bottom w:val="single" w:color="AEB4C0" w:sz="4"/>
+              <w:right w:val="single" w:color="AEB4C0" w:sz="4"/>
+            </w:tcBorders>
+            <w:tcMar>
+              <w:top w:type="dxa" w:w="70"/>
+              <w:left w:type="dxa" w:w="110"/>
+              <w:bottom w:type="dxa" w:w="70"/>
+              <w:right w:type="dxa" w:w="110"/>
+            </w:tcMar>
+          </w:tcPr>
+          <w:p>
+            <w:pPr>
+              <w:spacing w:after="40" w:line="264"/>
+            </w:pPr>
+            <w:r>
+              <w:rPr>
+                <w:rFonts w:ascii="Times New Roman" w:cs="Times New Roman" w:eastAsia="Times New Roman" w:hAnsi="Times New Roman"/>
+                <w:b w:val="false"/>
+                <w:bCs w:val="false"/>
+                <w:sz w:val="22"/>
+                <w:szCs w:val="22"/>
+              </w:rPr>
+              <w:t xml:space="preserve">cd CNPM/web</w:t>
+            </w:r>
+          </w:p>
+          <w:p>
+            <w:pPr>
+              <w:spacing w:after="40" w:line="264"/>
+            </w:pPr>
+            <w:r>
+              <w:rPr>
+                <w:rFonts w:ascii="Times New Roman" w:cs="Times New Roman" w:eastAsia="Times New Roman" w:hAnsi="Times New Roman"/>
+                <w:b w:val="false"/>
+                <w:bCs w:val="false"/>
+                <w:sz w:val="22"/>
+                <w:szCs w:val="22"/>
+              </w:rPr>
+              <w:t xml:space="preserve">npm install</w:t>
+            </w:r>
+          </w:p>
+          <w:p>
+            <w:pPr>
+              <w:spacing w:after="40" w:line="264"/>
+            </w:pPr>
+            <w:r>
+              <w:rPr>
+                <w:rFonts w:ascii="Times New Roman" w:cs="Times New Roman" w:eastAsia="Times New Roman" w:hAnsi="Times New Roman"/>
+                <w:b w:val="false"/>
+                <w:bCs w:val="false"/>
+                <w:sz w:val="22"/>
+                <w:szCs w:val="22"/>
+              </w:rPr>
+              <w:t xml:space="preserve">npm run dev</w:t>
+            </w:r>
+          </w:p>
+          <w:p>
+            <w:pPr>
+              <w:spacing w:after="40" w:line="264"/>
+            </w:pPr>
+            <w:r>
+              <w:rPr>
+                <w:rFonts w:ascii="Times New Roman" w:cs="Times New Roman" w:eastAsia="Times New Roman" w:hAnsi="Times New Roman"/>
+                <w:b w:val="false"/>
+                <w:bCs w:val="false"/>
+                <w:sz w:val="22"/>
+                <w:szCs w:val="22"/>
+              </w:rPr>
+              <w:t xml:space="preserve">Mở http://localhost:5173</w:t>
+            </w:r>
+          </w:p>
+        </w:tc>
+      </w:tr>
+      <w:tr>
+        <w:trPr>
+          <w:cantSplit/>
+          <w:tblHeader w:val="false"/>
+        </w:trPr>
+        <w:tc>
+          <w:tcPr>
+            <w:tcW w:type="dxa" w:w="2200"/>
+            <w:tcBorders>
+              <w:top w:val="single" w:color="AEB4C0" w:sz="4"/>
+              <w:left w:val="single" w:color="AEB4C0" w:sz="4"/>
+              <w:bottom w:val="single" w:color="AEB4C0" w:sz="4"/>
+              <w:right w:val="single" w:color="AEB4C0" w:sz="4"/>
+            </w:tcBorders>
+            <w:tcMar>
+              <w:top w:type="dxa" w:w="70"/>
+              <w:left w:type="dxa" w:w="110"/>
+              <w:bottom w:type="dxa" w:w="70"/>
+              <w:right w:type="dxa" w:w="110"/>
+            </w:tcMar>
+          </w:tcPr>
+          <w:p>
+            <w:pPr>
+              <w:spacing w:after="40" w:line="264"/>
+            </w:pPr>
+            <w:r>
+              <w:rPr>
+                <w:rFonts w:ascii="Times New Roman" w:cs="Times New Roman" w:eastAsia="Times New Roman" w:hAnsi="Times New Roman"/>
+                <w:b w:val="false"/>
+                <w:bCs w:val="false"/>
+                <w:sz w:val="22"/>
+                <w:szCs w:val="22"/>
+              </w:rPr>
+              <w:t xml:space="preserve">Chạy mobile</w:t>
+            </w:r>
+          </w:p>
+        </w:tc>
+        <w:tc>
+          <w:tcPr>
+            <w:tcW w:type="dxa" w:w="7438"/>
+            <w:tcBorders>
+              <w:top w:val="single" w:color="AEB4C0" w:sz="4"/>
+              <w:left w:val="single" w:color="AEB4C0" w:sz="4"/>
+              <w:bottom w:val="single" w:color="AEB4C0" w:sz="4"/>
+              <w:right w:val="single" w:color="AEB4C0" w:sz="4"/>
+            </w:tcBorders>
+            <w:tcMar>
+              <w:top w:type="dxa" w:w="70"/>
+              <w:left w:type="dxa" w:w="110"/>
+              <w:bottom w:type="dxa" w:w="70"/>
+              <w:right w:type="dxa" w:w="110"/>
+            </w:tcMar>
+          </w:tcPr>
+          <w:p>
+            <w:pPr>
+              <w:spacing w:after="40" w:line="264"/>
+            </w:pPr>
+            <w:r>
+              <w:rPr>
+                <w:rFonts w:ascii="Times New Roman" w:cs="Times New Roman" w:eastAsia="Times New Roman" w:hAnsi="Times New Roman"/>
+                <w:b w:val="false"/>
+                <w:bCs w:val="false"/>
+                <w:sz w:val="22"/>
+                <w:szCs w:val="22"/>
+              </w:rPr>
+              <w:t xml:space="preserve">cd CNPM/mobile</w:t>
+            </w:r>
+          </w:p>
+          <w:p>
+            <w:pPr>
+              <w:spacing w:after="40" w:line="264"/>
+            </w:pPr>
+            <w:r>
+              <w:rPr>
+                <w:rFonts w:ascii="Times New Roman" w:cs="Times New Roman" w:eastAsia="Times New Roman" w:hAnsi="Times New Roman"/>
+                <w:b w:val="false"/>
+                <w:bCs w:val="false"/>
+                <w:sz w:val="22"/>
+                <w:szCs w:val="22"/>
+              </w:rPr>
+              <w:t xml:space="preserve">npm install</w:t>
+            </w:r>
+          </w:p>
+          <w:p>
+            <w:pPr>
+              <w:spacing w:after="40" w:line="264"/>
+            </w:pPr>
+            <w:r>
+              <w:rPr>
+                <w:rFonts w:ascii="Times New Roman" w:cs="Times New Roman" w:eastAsia="Times New Roman" w:hAnsi="Times New Roman"/>
+                <w:b w:val="false"/>
+                <w:bCs w:val="false"/>
+                <w:sz w:val="22"/>
+                <w:szCs w:val="22"/>
+              </w:rPr>
+              <w:t xml:space="preserve">npx expo start</w:t>
+            </w:r>
+          </w:p>
+          <w:p>
+            <w:pPr>
+              <w:spacing w:after="40" w:line="264"/>
+            </w:pPr>
+            <w:r>
+              <w:rPr>
+                <w:rFonts w:ascii="Times New Roman" w:cs="Times New Roman" w:eastAsia="Times New Roman" w:hAnsi="Times New Roman"/>
+                <w:b w:val="false"/>
+                <w:bCs w:val="false"/>
+                <w:sz w:val="22"/>
+                <w:szCs w:val="22"/>
+              </w:rPr>
+              <w:t xml:space="preserve">Quét mã QR bằng Expo Go. Nếu điện thoại và máy tính không cùng Wi-Fi thì dùng npx expo start --tunnel</w:t>
+            </w:r>
+          </w:p>
+        </w:tc>
+      </w:tr>
+    </w:tbl>
+    <w:p>
+      <w:pPr>
+        <w:spacing w:after="100"/>
+      </w:pPr>
+    </w:p>
+    <w:p>
+      <w:pPr>
+        <w:pStyle w:val="Heading3"/>
+        <w:keepNext/>
+      </w:pPr>
+      <w:r>
+        <w:rPr>
+          <w:rFonts w:ascii="Times New Roman" w:cs="Times New Roman" w:eastAsia="Times New Roman" w:hAnsi="Times New Roman"/>
+        </w:rPr>
+        <w:t xml:space="preserve">8.3 Kịch bản kiểm thử và kết quả</w:t>
+      </w:r>
+    </w:p>
+    <w:p>
+      <w:pPr>
+        <w:spacing w:after="120" w:line="288"/>
+      </w:pPr>
+      <w:r>
+        <w:rPr>
+          <w:rFonts w:ascii="Times New Roman" w:cs="Times New Roman" w:eastAsia="Times New Roman" w:hAnsi="Times New Roman"/>
+          <w:sz w:val="26"/>
+          <w:szCs w:val="26"/>
+        </w:rPr>
+        <w:t xml:space="preserve">Mỗi ca được chạy trên web và mobile. Ca không có trên một nền tảng được ghi là Không áp dụng.</w:t>
+      </w:r>
+    </w:p>
+    <w:tbl>
+      <w:tblPr>
+        <w:tblW w:type="dxa" w:w="9638"/>
+        <w:tblBorders>
+          <w:top w:val="single" w:color="auto" w:sz="4"/>
+          <w:left w:val="single" w:color="auto" w:sz="4"/>
+          <w:bottom w:val="single" w:color="auto" w:sz="4"/>
+          <w:right w:val="single" w:color="auto" w:sz="4"/>
+          <w:insideH w:val="single" w:color="auto" w:sz="4"/>
+          <w:insideV w:val="single" w:color="auto" w:sz="4"/>
+        </w:tblBorders>
+      </w:tblPr>
+      <w:tblGrid>
+        <w:gridCol w:w="800"/>
+        <w:gridCol w:w="3150"/>
+        <w:gridCol w:w="3050"/>
+        <w:gridCol w:w="1000"/>
+        <w:gridCol w:w="1638"/>
+      </w:tblGrid>
+      <w:tr>
+        <w:trPr>
+          <w:cantSplit/>
+          <w:tblHeader/>
+        </w:trPr>
+        <w:tc>
+          <w:tcPr>
+            <w:tcW w:type="dxa" w:w="800"/>
+            <w:tcBorders>
+              <w:top w:val="single" w:color="AEB4C0" w:sz="4"/>
+              <w:left w:val="single" w:color="AEB4C0" w:sz="4"/>
+              <w:bottom w:val="single" w:color="AEB4C0" w:sz="4"/>
+              <w:right w:val="single" w:color="AEB4C0" w:sz="4"/>
+            </w:tcBorders>
+            <w:shd w:fill="E4E7F5" w:color="auto" w:val="clear"/>
+            <w:tcMar>
+              <w:top w:type="dxa" w:w="70"/>
+              <w:left w:type="dxa" w:w="110"/>
+              <w:bottom w:type="dxa" w:w="70"/>
+              <w:right w:type="dxa" w:w="110"/>
+            </w:tcMar>
+          </w:tcPr>
+          <w:p>
+            <w:pPr>
+              <w:spacing w:after="40" w:line="264"/>
+            </w:pPr>
+            <w:r>
+              <w:rPr>
+                <w:rFonts w:ascii="Times New Roman" w:cs="Times New Roman" w:eastAsia="Times New Roman" w:hAnsi="Times New Roman"/>
+                <w:b/>
+                <w:bCs/>
+                <w:sz w:val="22"/>
+                <w:szCs w:val="22"/>
+              </w:rPr>
+              <w:t xml:space="preserve">Mã</w:t>
+            </w:r>
+          </w:p>
+        </w:tc>
+        <w:tc>
+          <w:tcPr>
+            <w:tcW w:type="dxa" w:w="3150"/>
+            <w:tcBorders>
+              <w:top w:val="single" w:color="AEB4C0" w:sz="4"/>
+              <w:left w:val="single" w:color="AEB4C0" w:sz="4"/>
+              <w:bottom w:val="single" w:color="AEB4C0" w:sz="4"/>
+              <w:right w:val="single" w:color="AEB4C0" w:sz="4"/>
+            </w:tcBorders>
+            <w:shd w:fill="E4E7F5" w:color="auto" w:val="clear"/>
+            <w:tcMar>
+              <w:top w:type="dxa" w:w="70"/>
+              <w:left w:type="dxa" w:w="110"/>
+              <w:bottom w:type="dxa" w:w="70"/>
+              <w:right w:type="dxa" w:w="110"/>
+            </w:tcMar>
+          </w:tcPr>
+          <w:p>
+            <w:pPr>
+              <w:spacing w:after="40" w:line="264"/>
+            </w:pPr>
+            <w:r>
+              <w:rPr>
+                <w:rFonts w:ascii="Times New Roman" w:cs="Times New Roman" w:eastAsia="Times New Roman" w:hAnsi="Times New Roman"/>
+                <w:b/>
+                <w:bCs/>
+                <w:sz w:val="22"/>
+                <w:szCs w:val="22"/>
+              </w:rPr>
+              <w:t xml:space="preserve">Việc thực hiện</w:t>
+            </w:r>
+          </w:p>
+        </w:tc>
+        <w:tc>
+          <w:tcPr>
+            <w:tcW w:type="dxa" w:w="3050"/>
+            <w:tcBorders>
+              <w:top w:val="single" w:color="AEB4C0" w:sz="4"/>
+              <w:left w:val="single" w:color="AEB4C0" w:sz="4"/>
+              <w:bottom w:val="single" w:color="AEB4C0" w:sz="4"/>
+              <w:right w:val="single" w:color="AEB4C0" w:sz="4"/>
+            </w:tcBorders>
+            <w:shd w:fill="E4E7F5" w:color="auto" w:val="clear"/>
+            <w:tcMar>
+              <w:top w:type="dxa" w:w="70"/>
+              <w:left w:type="dxa" w:w="110"/>
+              <w:bottom w:type="dxa" w:w="70"/>
+              <w:right w:type="dxa" w:w="110"/>
+            </w:tcMar>
+          </w:tcPr>
+          <w:p>
+            <w:pPr>
+              <w:spacing w:after="40" w:line="264"/>
+            </w:pPr>
+            <w:r>
+              <w:rPr>
+                <w:rFonts w:ascii="Times New Roman" w:cs="Times New Roman" w:eastAsia="Times New Roman" w:hAnsi="Times New Roman"/>
+                <w:b/>
+                <w:bCs/>
+                <w:sz w:val="22"/>
+                <w:szCs w:val="22"/>
+              </w:rPr>
+              <w:t xml:space="preserve">Kết quả mong đợi</w:t>
+            </w:r>
+          </w:p>
+        </w:tc>
+        <w:tc>
+          <w:tcPr>
+            <w:tcW w:type="dxa" w:w="1000"/>
+            <w:tcBorders>
+              <w:top w:val="single" w:color="AEB4C0" w:sz="4"/>
+              <w:left w:val="single" w:color="AEB4C0" w:sz="4"/>
+              <w:bottom w:val="single" w:color="AEB4C0" w:sz="4"/>
+              <w:right w:val="single" w:color="AEB4C0" w:sz="4"/>
+            </w:tcBorders>
+            <w:shd w:fill="E4E7F5" w:color="auto" w:val="clear"/>
+            <w:tcMar>
+              <w:top w:type="dxa" w:w="70"/>
+              <w:left w:type="dxa" w:w="110"/>
+              <w:bottom w:type="dxa" w:w="70"/>
+              <w:right w:type="dxa" w:w="110"/>
+            </w:tcMar>
+          </w:tcPr>
+          <w:p>
+            <w:pPr>
+              <w:spacing w:after="40" w:line="264"/>
+            </w:pPr>
+            <w:r>
+              <w:rPr>
+                <w:rFonts w:ascii="Times New Roman" w:cs="Times New Roman" w:eastAsia="Times New Roman" w:hAnsi="Times New Roman"/>
+                <w:b/>
+                <w:bCs/>
+                <w:sz w:val="22"/>
+                <w:szCs w:val="22"/>
+              </w:rPr>
+              <w:t xml:space="preserve">Web</w:t>
+            </w:r>
+          </w:p>
+        </w:tc>
+        <w:tc>
+          <w:tcPr>
+            <w:tcW w:type="dxa" w:w="1638"/>
+            <w:tcBorders>
+              <w:top w:val="single" w:color="AEB4C0" w:sz="4"/>
+              <w:left w:val="single" w:color="AEB4C0" w:sz="4"/>
+              <w:bottom w:val="single" w:color="AEB4C0" w:sz="4"/>
+              <w:right w:val="single" w:color="AEB4C0" w:sz="4"/>
+            </w:tcBorders>
+            <w:shd w:fill="E4E7F5" w:color="auto" w:val="clear"/>
+            <w:tcMar>
+              <w:top w:type="dxa" w:w="70"/>
+              <w:left w:type="dxa" w:w="110"/>
+              <w:bottom w:type="dxa" w:w="70"/>
+              <w:right w:type="dxa" w:w="110"/>
+            </w:tcMar>
+          </w:tcPr>
+          <w:p>
+            <w:pPr>
+              <w:spacing w:after="40" w:line="264"/>
+            </w:pPr>
+            <w:r>
+              <w:rPr>
+                <w:rFonts w:ascii="Times New Roman" w:cs="Times New Roman" w:eastAsia="Times New Roman" w:hAnsi="Times New Roman"/>
+                <w:b/>
+                <w:bCs/>
+                <w:sz w:val="22"/>
+                <w:szCs w:val="22"/>
+              </w:rPr>
+              <w:t xml:space="preserve">Mobile</w:t>
+            </w:r>
+          </w:p>
+        </w:tc>
+      </w:tr>
+      <w:tr>
+        <w:trPr>
+          <w:cantSplit/>
+          <w:tblHeader w:val="false"/>
+        </w:trPr>
+        <w:tc>
+          <w:tcPr>
+            <w:tcW w:type="dxa" w:w="800"/>
+            <w:tcBorders>
+              <w:top w:val="single" w:color="AEB4C0" w:sz="4"/>
+              <w:left w:val="single" w:color="AEB4C0" w:sz="4"/>
+              <w:bottom w:val="single" w:color="AEB4C0" w:sz="4"/>
+              <w:right w:val="single" w:color="AEB4C0" w:sz="4"/>
+            </w:tcBorders>
+            <w:tcMar>
+              <w:top w:type="dxa" w:w="70"/>
+              <w:left w:type="dxa" w:w="110"/>
+              <w:bottom w:type="dxa" w:w="70"/>
+              <w:right w:type="dxa" w:w="110"/>
+            </w:tcMar>
+          </w:tcPr>
+          <w:p>
+            <w:pPr>
+              <w:spacing w:after="40" w:line="264"/>
+            </w:pPr>
+            <w:r>
+              <w:rPr>
+                <w:rFonts w:ascii="Times New Roman" w:cs="Times New Roman" w:eastAsia="Times New Roman" w:hAnsi="Times New Roman"/>
+                <w:b w:val="false"/>
+                <w:bCs w:val="false"/>
+                <w:sz w:val="22"/>
+                <w:szCs w:val="22"/>
+              </w:rPr>
+              <w:t xml:space="preserve">TC01</w:t>
+            </w:r>
+          </w:p>
+        </w:tc>
+        <w:tc>
+          <w:tcPr>
+            <w:tcW w:type="dxa" w:w="3150"/>
+            <w:tcBorders>
+              <w:top w:val="single" w:color="AEB4C0" w:sz="4"/>
+              <w:left w:val="single" w:color="AEB4C0" w:sz="4"/>
+              <w:bottom w:val="single" w:color="AEB4C0" w:sz="4"/>
+              <w:right w:val="single" w:color="AEB4C0" w:sz="4"/>
+            </w:tcBorders>
+            <w:tcMar>
+              <w:top w:type="dxa" w:w="70"/>
+              <w:left w:type="dxa" w:w="110"/>
+              <w:bottom w:type="dxa" w:w="70"/>
+              <w:right w:type="dxa" w:w="110"/>
+            </w:tcMar>
+          </w:tcPr>
+          <w:p>
+            <w:pPr>
+              <w:spacing w:after="40" w:line="264"/>
+            </w:pPr>
+            <w:r>
+              <w:rPr>
+                <w:rFonts w:ascii="Times New Roman" w:cs="Times New Roman" w:eastAsia="Times New Roman" w:hAnsi="Times New Roman"/>
+                <w:b w:val="false"/>
+                <w:bCs w:val="false"/>
+                <w:sz w:val="22"/>
+                <w:szCs w:val="22"/>
+              </w:rPr>
+              <w:t xml:space="preserve">Mở ứng dụng, chưa chọn tệp</w:t>
+            </w:r>
+          </w:p>
+        </w:tc>
+        <w:tc>
+          <w:tcPr>
+            <w:tcW w:type="dxa" w:w="3050"/>
+            <w:tcBorders>
+              <w:top w:val="single" w:color="AEB4C0" w:sz="4"/>
+              <w:left w:val="single" w:color="AEB4C0" w:sz="4"/>
+              <w:bottom w:val="single" w:color="AEB4C0" w:sz="4"/>
+              <w:right w:val="single" w:color="AEB4C0" w:sz="4"/>
+            </w:tcBorders>
+            <w:tcMar>
+              <w:top w:type="dxa" w:w="70"/>
+              <w:left w:type="dxa" w:w="110"/>
+              <w:bottom w:type="dxa" w:w="70"/>
+              <w:right w:type="dxa" w:w="110"/>
+            </w:tcMar>
+          </w:tcPr>
+          <w:p>
+            <w:pPr>
+              <w:spacing w:after="40" w:line="264"/>
+            </w:pPr>
+            <w:r>
+              <w:rPr>
+                <w:rFonts w:ascii="Times New Roman" w:cs="Times New Roman" w:eastAsia="Times New Roman" w:hAnsi="Times New Roman"/>
+                <w:b w:val="false"/>
+                <w:bCs w:val="false"/>
+                <w:sz w:val="22"/>
+                <w:szCs w:val="22"/>
+              </w:rPr>
+              <w:t xml:space="preserve">Nút Tiếp tục bị khóa</w:t>
+            </w:r>
+          </w:p>
+        </w:tc>
+        <w:tc>
+          <w:tcPr>
+            <w:tcW w:type="dxa" w:w="1000"/>
+            <w:tcBorders>
+              <w:top w:val="single" w:color="AEB4C0" w:sz="4"/>
+              <w:left w:val="single" w:color="AEB4C0" w:sz="4"/>
+              <w:bottom w:val="single" w:color="AEB4C0" w:sz="4"/>
+              <w:right w:val="single" w:color="AEB4C0" w:sz="4"/>
+            </w:tcBorders>
+            <w:tcMar>
+              <w:top w:type="dxa" w:w="70"/>
+              <w:left w:type="dxa" w:w="110"/>
+              <w:bottom w:type="dxa" w:w="70"/>
+              <w:right w:type="dxa" w:w="110"/>
+            </w:tcMar>
+          </w:tcPr>
+          <w:p>
+            <w:pPr>
+              <w:spacing w:after="40" w:line="264"/>
+            </w:pPr>
+            <w:r>
+              <w:rPr>
+                <w:rFonts w:ascii="Times New Roman" w:cs="Times New Roman" w:eastAsia="Times New Roman" w:hAnsi="Times New Roman"/>
+                <w:b w:val="false"/>
+                <w:bCs w:val="false"/>
+                <w:sz w:val="22"/>
+                <w:szCs w:val="22"/>
+              </w:rPr>
+              <w:t xml:space="preserve">Đạt</w:t>
+            </w:r>
+          </w:p>
+        </w:tc>
+        <w:tc>
+          <w:tcPr>
+            <w:tcW w:type="dxa" w:w="1638"/>
+            <w:tcBorders>
+              <w:top w:val="single" w:color="AEB4C0" w:sz="4"/>
+              <w:left w:val="single" w:color="AEB4C0" w:sz="4"/>
+              <w:bottom w:val="single" w:color="AEB4C0" w:sz="4"/>
+              <w:right w:val="single" w:color="AEB4C0" w:sz="4"/>
+            </w:tcBorders>
+            <w:tcMar>
+              <w:top w:type="dxa" w:w="70"/>
+              <w:left w:type="dxa" w:w="110"/>
+              <w:bottom w:type="dxa" w:w="70"/>
+              <w:right w:type="dxa" w:w="110"/>
+            </w:tcMar>
+          </w:tcPr>
+          <w:p>
+            <w:pPr>
+              <w:spacing w:after="40" w:line="264"/>
+            </w:pPr>
+            <w:r>
+              <w:rPr>
+                <w:rFonts w:ascii="Times New Roman" w:cs="Times New Roman" w:eastAsia="Times New Roman" w:hAnsi="Times New Roman"/>
+                <w:b w:val="false"/>
+                <w:bCs w:val="false"/>
+                <w:sz w:val="22"/>
+                <w:szCs w:val="22"/>
+              </w:rPr>
+              <w:t xml:space="preserve">Đạt</w:t>
+            </w:r>
+          </w:p>
+        </w:tc>
+      </w:tr>
+      <w:tr>
+        <w:trPr>
+          <w:cantSplit/>
+          <w:tblHeader w:val="false"/>
+        </w:trPr>
+        <w:tc>
+          <w:tcPr>
+            <w:tcW w:type="dxa" w:w="800"/>
+            <w:tcBorders>
+              <w:top w:val="single" w:color="AEB4C0" w:sz="4"/>
+              <w:left w:val="single" w:color="AEB4C0" w:sz="4"/>
+              <w:bottom w:val="single" w:color="AEB4C0" w:sz="4"/>
+              <w:right w:val="single" w:color="AEB4C0" w:sz="4"/>
+            </w:tcBorders>
+            <w:tcMar>
+              <w:top w:type="dxa" w:w="70"/>
+              <w:left w:type="dxa" w:w="110"/>
+              <w:bottom w:type="dxa" w:w="70"/>
+              <w:right w:type="dxa" w:w="110"/>
+            </w:tcMar>
+          </w:tcPr>
+          <w:p>
+            <w:pPr>
+              <w:spacing w:after="40" w:line="264"/>
+            </w:pPr>
+            <w:r>
+              <w:rPr>
+                <w:rFonts w:ascii="Times New Roman" w:cs="Times New Roman" w:eastAsia="Times New Roman" w:hAnsi="Times New Roman"/>
+                <w:b w:val="false"/>
+                <w:bCs w:val="false"/>
+                <w:sz w:val="22"/>
+                <w:szCs w:val="22"/>
+              </w:rPr>
+              <w:t xml:space="preserve">TC02</w:t>
+            </w:r>
+          </w:p>
+        </w:tc>
+        <w:tc>
+          <w:tcPr>
+            <w:tcW w:type="dxa" w:w="3150"/>
+            <w:tcBorders>
+              <w:top w:val="single" w:color="AEB4C0" w:sz="4"/>
+              <w:left w:val="single" w:color="AEB4C0" w:sz="4"/>
+              <w:bottom w:val="single" w:color="AEB4C0" w:sz="4"/>
+              <w:right w:val="single" w:color="AEB4C0" w:sz="4"/>
+            </w:tcBorders>
+            <w:tcMar>
+              <w:top w:type="dxa" w:w="70"/>
+              <w:left w:type="dxa" w:w="110"/>
+              <w:bottom w:type="dxa" w:w="70"/>
+              <w:right w:type="dxa" w:w="110"/>
+            </w:tcMar>
+          </w:tcPr>
+          <w:p>
+            <w:pPr>
+              <w:spacing w:after="40" w:line="264"/>
+            </w:pPr>
+            <w:r>
+              <w:rPr>
+                <w:rFonts w:ascii="Times New Roman" w:cs="Times New Roman" w:eastAsia="Times New Roman" w:hAnsi="Times New Roman"/>
+                <w:b w:val="false"/>
+                <w:bCs w:val="false"/>
+                <w:sz w:val="22"/>
+                <w:szCs w:val="22"/>
+              </w:rPr>
+              <w:t xml:space="preserve">Chọn một tệp video</w:t>
+            </w:r>
+          </w:p>
+        </w:tc>
+        <w:tc>
+          <w:tcPr>
+            <w:tcW w:type="dxa" w:w="3050"/>
+            <w:tcBorders>
+              <w:top w:val="single" w:color="AEB4C0" w:sz="4"/>
+              <w:left w:val="single" w:color="AEB4C0" w:sz="4"/>
+              <w:bottom w:val="single" w:color="AEB4C0" w:sz="4"/>
+              <w:right w:val="single" w:color="AEB4C0" w:sz="4"/>
+            </w:tcBorders>
+            <w:tcMar>
+              <w:top w:type="dxa" w:w="70"/>
+              <w:left w:type="dxa" w:w="110"/>
+              <w:bottom w:type="dxa" w:w="70"/>
+              <w:right w:type="dxa" w:w="110"/>
+            </w:tcMar>
+          </w:tcPr>
+          <w:p>
+            <w:pPr>
+              <w:spacing w:after="40" w:line="264"/>
+            </w:pPr>
+            <w:r>
+              <w:rPr>
+                <w:rFonts w:ascii="Times New Roman" w:cs="Times New Roman" w:eastAsia="Times New Roman" w:hAnsi="Times New Roman"/>
+                <w:b w:val="false"/>
+                <w:bCs w:val="false"/>
+                <w:sz w:val="22"/>
+                <w:szCs w:val="22"/>
+              </w:rPr>
+              <w:t xml:space="preserve">Hiện tên tệp, dung lượng; nút Tiếp tục sáng</w:t>
+            </w:r>
+          </w:p>
+        </w:tc>
+        <w:tc>
+          <w:tcPr>
+            <w:tcW w:type="dxa" w:w="1000"/>
+            <w:tcBorders>
+              <w:top w:val="single" w:color="AEB4C0" w:sz="4"/>
+              <w:left w:val="single" w:color="AEB4C0" w:sz="4"/>
+              <w:bottom w:val="single" w:color="AEB4C0" w:sz="4"/>
+              <w:right w:val="single" w:color="AEB4C0" w:sz="4"/>
+            </w:tcBorders>
+            <w:tcMar>
+              <w:top w:type="dxa" w:w="70"/>
+              <w:left w:type="dxa" w:w="110"/>
+              <w:bottom w:type="dxa" w:w="70"/>
+              <w:right w:type="dxa" w:w="110"/>
+            </w:tcMar>
+          </w:tcPr>
+          <w:p>
+            <w:pPr>
+              <w:spacing w:after="40" w:line="264"/>
+            </w:pPr>
+            <w:r>
+              <w:rPr>
+                <w:rFonts w:ascii="Times New Roman" w:cs="Times New Roman" w:eastAsia="Times New Roman" w:hAnsi="Times New Roman"/>
+                <w:b w:val="false"/>
+                <w:bCs w:val="false"/>
+                <w:sz w:val="22"/>
+                <w:szCs w:val="22"/>
+              </w:rPr>
+              <w:t xml:space="preserve">Đạt</w:t>
+            </w:r>
+          </w:p>
+        </w:tc>
+        <w:tc>
+          <w:tcPr>
+            <w:tcW w:type="dxa" w:w="1638"/>
+            <w:tcBorders>
+              <w:top w:val="single" w:color="AEB4C0" w:sz="4"/>
+              <w:left w:val="single" w:color="AEB4C0" w:sz="4"/>
+              <w:bottom w:val="single" w:color="AEB4C0" w:sz="4"/>
+              <w:right w:val="single" w:color="AEB4C0" w:sz="4"/>
+            </w:tcBorders>
+            <w:tcMar>
+              <w:top w:type="dxa" w:w="70"/>
+              <w:left w:type="dxa" w:w="110"/>
+              <w:bottom w:type="dxa" w:w="70"/>
+              <w:right w:type="dxa" w:w="110"/>
+            </w:tcMar>
+          </w:tcPr>
+          <w:p>
+            <w:pPr>
+              <w:spacing w:after="40" w:line="264"/>
+            </w:pPr>
+            <w:r>
+              <w:rPr>
+                <w:rFonts w:ascii="Times New Roman" w:cs="Times New Roman" w:eastAsia="Times New Roman" w:hAnsi="Times New Roman"/>
+                <w:b w:val="false"/>
+                <w:bCs w:val="false"/>
+                <w:sz w:val="22"/>
+                <w:szCs w:val="22"/>
+              </w:rPr>
+              <w:t xml:space="preserve">Đạt</w:t>
+            </w:r>
+          </w:p>
+        </w:tc>
+      </w:tr>
+      <w:tr>
+        <w:trPr>
+          <w:cantSplit/>
+          <w:tblHeader w:val="false"/>
+        </w:trPr>
+        <w:tc>
+          <w:tcPr>
+            <w:tcW w:type="dxa" w:w="800"/>
+            <w:tcBorders>
+              <w:top w:val="single" w:color="AEB4C0" w:sz="4"/>
+              <w:left w:val="single" w:color="AEB4C0" w:sz="4"/>
+              <w:bottom w:val="single" w:color="AEB4C0" w:sz="4"/>
+              <w:right w:val="single" w:color="AEB4C0" w:sz="4"/>
+            </w:tcBorders>
+            <w:tcMar>
+              <w:top w:type="dxa" w:w="70"/>
+              <w:left w:type="dxa" w:w="110"/>
+              <w:bottom w:type="dxa" w:w="70"/>
+              <w:right w:type="dxa" w:w="110"/>
+            </w:tcMar>
+          </w:tcPr>
+          <w:p>
+            <w:pPr>
+              <w:spacing w:after="40" w:line="264"/>
+            </w:pPr>
+            <w:r>
+              <w:rPr>
+                <w:rFonts w:ascii="Times New Roman" w:cs="Times New Roman" w:eastAsia="Times New Roman" w:hAnsi="Times New Roman"/>
+                <w:b w:val="false"/>
+                <w:bCs w:val="false"/>
+                <w:sz w:val="22"/>
+                <w:szCs w:val="22"/>
+              </w:rPr>
+              <w:t xml:space="preserve">TC03</w:t>
+            </w:r>
+          </w:p>
+        </w:tc>
+        <w:tc>
+          <w:tcPr>
+            <w:tcW w:type="dxa" w:w="3150"/>
+            <w:tcBorders>
+              <w:top w:val="single" w:color="AEB4C0" w:sz="4"/>
+              <w:left w:val="single" w:color="AEB4C0" w:sz="4"/>
+              <w:bottom w:val="single" w:color="AEB4C0" w:sz="4"/>
+              <w:right w:val="single" w:color="AEB4C0" w:sz="4"/>
+            </w:tcBorders>
+            <w:tcMar>
+              <w:top w:type="dxa" w:w="70"/>
+              <w:left w:type="dxa" w:w="110"/>
+              <w:bottom w:type="dxa" w:w="70"/>
+              <w:right w:type="dxa" w:w="110"/>
+            </w:tcMar>
+          </w:tcPr>
+          <w:p>
+            <w:pPr>
+              <w:spacing w:after="40" w:line="264"/>
+            </w:pPr>
+            <w:r>
+              <w:rPr>
+                <w:rFonts w:ascii="Times New Roman" w:cs="Times New Roman" w:eastAsia="Times New Roman" w:hAnsi="Times New Roman"/>
+                <w:b w:val="false"/>
+                <w:bCs w:val="false"/>
+                <w:sz w:val="22"/>
+                <w:szCs w:val="22"/>
+              </w:rPr>
+              <w:t xml:space="preserve">Chọn một tệp audio (mp3)</w:t>
+            </w:r>
+          </w:p>
+        </w:tc>
+        <w:tc>
+          <w:tcPr>
+            <w:tcW w:type="dxa" w:w="3050"/>
+            <w:tcBorders>
+              <w:top w:val="single" w:color="AEB4C0" w:sz="4"/>
+              <w:left w:val="single" w:color="AEB4C0" w:sz="4"/>
+              <w:bottom w:val="single" w:color="AEB4C0" w:sz="4"/>
+              <w:right w:val="single" w:color="AEB4C0" w:sz="4"/>
+            </w:tcBorders>
+            <w:tcMar>
+              <w:top w:type="dxa" w:w="70"/>
+              <w:left w:type="dxa" w:w="110"/>
+              <w:bottom w:type="dxa" w:w="70"/>
+              <w:right w:type="dxa" w:w="110"/>
+            </w:tcMar>
+          </w:tcPr>
+          <w:p>
+            <w:pPr>
+              <w:spacing w:after="40" w:line="264"/>
+            </w:pPr>
+            <w:r>
+              <w:rPr>
+                <w:rFonts w:ascii="Times New Roman" w:cs="Times New Roman" w:eastAsia="Times New Roman" w:hAnsi="Times New Roman"/>
+                <w:b w:val="false"/>
+                <w:bCs w:val="false"/>
+                <w:sz w:val="22"/>
+                <w:szCs w:val="22"/>
+              </w:rPr>
+              <w:t xml:space="preserve">Giống TC02</w:t>
+            </w:r>
+          </w:p>
+        </w:tc>
+        <w:tc>
+          <w:tcPr>
+            <w:tcW w:type="dxa" w:w="1000"/>
+            <w:tcBorders>
+              <w:top w:val="single" w:color="AEB4C0" w:sz="4"/>
+              <w:left w:val="single" w:color="AEB4C0" w:sz="4"/>
+              <w:bottom w:val="single" w:color="AEB4C0" w:sz="4"/>
+              <w:right w:val="single" w:color="AEB4C0" w:sz="4"/>
+            </w:tcBorders>
+            <w:tcMar>
+              <w:top w:type="dxa" w:w="70"/>
+              <w:left w:type="dxa" w:w="110"/>
+              <w:bottom w:type="dxa" w:w="70"/>
+              <w:right w:type="dxa" w:w="110"/>
+            </w:tcMar>
+          </w:tcPr>
+          <w:p>
+            <w:pPr>
+              <w:spacing w:after="40" w:line="264"/>
+            </w:pPr>
+            <w:r>
+              <w:rPr>
+                <w:rFonts w:ascii="Times New Roman" w:cs="Times New Roman" w:eastAsia="Times New Roman" w:hAnsi="Times New Roman"/>
+                <w:b w:val="false"/>
+                <w:bCs w:val="false"/>
+                <w:sz w:val="22"/>
+                <w:szCs w:val="22"/>
+              </w:rPr>
+              <w:t xml:space="preserve">Đạt</w:t>
+            </w:r>
+          </w:p>
+        </w:tc>
+        <w:tc>
+          <w:tcPr>
+            <w:tcW w:type="dxa" w:w="1638"/>
+            <w:tcBorders>
+              <w:top w:val="single" w:color="AEB4C0" w:sz="4"/>
+              <w:left w:val="single" w:color="AEB4C0" w:sz="4"/>
+              <w:bottom w:val="single" w:color="AEB4C0" w:sz="4"/>
+              <w:right w:val="single" w:color="AEB4C0" w:sz="4"/>
+            </w:tcBorders>
+            <w:tcMar>
+              <w:top w:type="dxa" w:w="70"/>
+              <w:left w:type="dxa" w:w="110"/>
+              <w:bottom w:type="dxa" w:w="70"/>
+              <w:right w:type="dxa" w:w="110"/>
+            </w:tcMar>
+          </w:tcPr>
+          <w:p>
+            <w:pPr>
+              <w:spacing w:after="40" w:line="264"/>
+            </w:pPr>
+            <w:r>
+              <w:rPr>
+                <w:rFonts w:ascii="Times New Roman" w:cs="Times New Roman" w:eastAsia="Times New Roman" w:hAnsi="Times New Roman"/>
+                <w:b w:val="false"/>
+                <w:bCs w:val="false"/>
+                <w:sz w:val="22"/>
+                <w:szCs w:val="22"/>
+              </w:rPr>
+              <w:t xml:space="preserve">Đạt</w:t>
+            </w:r>
+          </w:p>
+        </w:tc>
+      </w:tr>
+      <w:tr>
+        <w:trPr>
+          <w:cantSplit/>
+          <w:tblHeader w:val="false"/>
+        </w:trPr>
+        <w:tc>
+          <w:tcPr>
+            <w:tcW w:type="dxa" w:w="800"/>
+            <w:tcBorders>
+              <w:top w:val="single" w:color="AEB4C0" w:sz="4"/>
+              <w:left w:val="single" w:color="AEB4C0" w:sz="4"/>
+              <w:bottom w:val="single" w:color="AEB4C0" w:sz="4"/>
+              <w:right w:val="single" w:color="AEB4C0" w:sz="4"/>
+            </w:tcBorders>
+            <w:tcMar>
+              <w:top w:type="dxa" w:w="70"/>
+              <w:left w:type="dxa" w:w="110"/>
+              <w:bottom w:type="dxa" w:w="70"/>
+              <w:right w:type="dxa" w:w="110"/>
+            </w:tcMar>
+          </w:tcPr>
+          <w:p>
+            <w:pPr>
+              <w:spacing w:after="40" w:line="264"/>
+            </w:pPr>
+            <w:r>
+              <w:rPr>
+                <w:rFonts w:ascii="Times New Roman" w:cs="Times New Roman" w:eastAsia="Times New Roman" w:hAnsi="Times New Roman"/>
+                <w:b w:val="false"/>
+                <w:bCs w:val="false"/>
+                <w:sz w:val="22"/>
+                <w:szCs w:val="22"/>
+              </w:rPr>
+              <w:t xml:space="preserve">TC04</w:t>
+            </w:r>
+          </w:p>
+        </w:tc>
+        <w:tc>
+          <w:tcPr>
+            <w:tcW w:type="dxa" w:w="3150"/>
+            <w:tcBorders>
+              <w:top w:val="single" w:color="AEB4C0" w:sz="4"/>
+              <w:left w:val="single" w:color="AEB4C0" w:sz="4"/>
+              <w:bottom w:val="single" w:color="AEB4C0" w:sz="4"/>
+              <w:right w:val="single" w:color="AEB4C0" w:sz="4"/>
+            </w:tcBorders>
+            <w:tcMar>
+              <w:top w:type="dxa" w:w="70"/>
+              <w:left w:type="dxa" w:w="110"/>
+              <w:bottom w:type="dxa" w:w="70"/>
+              <w:right w:type="dxa" w:w="110"/>
+            </w:tcMar>
+          </w:tcPr>
+          <w:p>
+            <w:pPr>
+              <w:spacing w:after="40" w:line="264"/>
+            </w:pPr>
+            <w:r>
+              <w:rPr>
+                <w:rFonts w:ascii="Times New Roman" w:cs="Times New Roman" w:eastAsia="Times New Roman" w:hAnsi="Times New Roman"/>
+                <w:b w:val="false"/>
+                <w:bCs w:val="false"/>
+                <w:sz w:val="22"/>
+                <w:szCs w:val="22"/>
+              </w:rPr>
+              <w:t xml:space="preserve">Bấm Xóa sau khi chọn tệp</w:t>
+            </w:r>
+          </w:p>
+        </w:tc>
+        <w:tc>
+          <w:tcPr>
+            <w:tcW w:type="dxa" w:w="3050"/>
+            <w:tcBorders>
+              <w:top w:val="single" w:color="AEB4C0" w:sz="4"/>
+              <w:left w:val="single" w:color="AEB4C0" w:sz="4"/>
+              <w:bottom w:val="single" w:color="AEB4C0" w:sz="4"/>
+              <w:right w:val="single" w:color="AEB4C0" w:sz="4"/>
+            </w:tcBorders>
+            <w:tcMar>
+              <w:top w:type="dxa" w:w="70"/>
+              <w:left w:type="dxa" w:w="110"/>
+              <w:bottom w:type="dxa" w:w="70"/>
+              <w:right w:type="dxa" w:w="110"/>
+            </w:tcMar>
+          </w:tcPr>
+          <w:p>
+            <w:pPr>
+              <w:spacing w:after="40" w:line="264"/>
+            </w:pPr>
+            <w:r>
+              <w:rPr>
+                <w:rFonts w:ascii="Times New Roman" w:cs="Times New Roman" w:eastAsia="Times New Roman" w:hAnsi="Times New Roman"/>
+                <w:b w:val="false"/>
+                <w:bCs w:val="false"/>
+                <w:sz w:val="22"/>
+                <w:szCs w:val="22"/>
+              </w:rPr>
+              <w:t xml:space="preserve">Về trạng thái trống, nút Tiếp tục khóa lại</w:t>
+            </w:r>
+          </w:p>
+        </w:tc>
+        <w:tc>
+          <w:tcPr>
+            <w:tcW w:type="dxa" w:w="1000"/>
+            <w:tcBorders>
+              <w:top w:val="single" w:color="AEB4C0" w:sz="4"/>
+              <w:left w:val="single" w:color="AEB4C0" w:sz="4"/>
+              <w:bottom w:val="single" w:color="AEB4C0" w:sz="4"/>
+              <w:right w:val="single" w:color="AEB4C0" w:sz="4"/>
+            </w:tcBorders>
+            <w:tcMar>
+              <w:top w:type="dxa" w:w="70"/>
+              <w:left w:type="dxa" w:w="110"/>
+              <w:bottom w:type="dxa" w:w="70"/>
+              <w:right w:type="dxa" w:w="110"/>
+            </w:tcMar>
+          </w:tcPr>
+          <w:p>
+            <w:pPr>
+              <w:spacing w:after="40" w:line="264"/>
+            </w:pPr>
+            <w:r>
+              <w:rPr>
+                <w:rFonts w:ascii="Times New Roman" w:cs="Times New Roman" w:eastAsia="Times New Roman" w:hAnsi="Times New Roman"/>
+                <w:b w:val="false"/>
+                <w:bCs w:val="false"/>
+                <w:sz w:val="22"/>
+                <w:szCs w:val="22"/>
+              </w:rPr>
+              <w:t xml:space="preserve">Đạt</w:t>
+            </w:r>
+          </w:p>
+        </w:tc>
+        <w:tc>
+          <w:tcPr>
+            <w:tcW w:type="dxa" w:w="1638"/>
+            <w:tcBorders>
+              <w:top w:val="single" w:color="AEB4C0" w:sz="4"/>
+              <w:left w:val="single" w:color="AEB4C0" w:sz="4"/>
+              <w:bottom w:val="single" w:color="AEB4C0" w:sz="4"/>
+              <w:right w:val="single" w:color="AEB4C0" w:sz="4"/>
+            </w:tcBorders>
+            <w:tcMar>
+              <w:top w:type="dxa" w:w="70"/>
+              <w:left w:type="dxa" w:w="110"/>
+              <w:bottom w:type="dxa" w:w="70"/>
+              <w:right w:type="dxa" w:w="110"/>
+            </w:tcMar>
+          </w:tcPr>
+          <w:p>
+            <w:pPr>
+              <w:spacing w:after="40" w:line="264"/>
+            </w:pPr>
+            <w:r>
+              <w:rPr>
+                <w:rFonts w:ascii="Times New Roman" w:cs="Times New Roman" w:eastAsia="Times New Roman" w:hAnsi="Times New Roman"/>
+                <w:b w:val="false"/>
+                <w:bCs w:val="false"/>
+                <w:sz w:val="22"/>
+                <w:szCs w:val="22"/>
+              </w:rPr>
+              <w:t xml:space="preserve">Đạt</w:t>
+            </w:r>
+          </w:p>
+        </w:tc>
+      </w:tr>
+      <w:tr>
+        <w:trPr>
+          <w:cantSplit/>
+          <w:tblHeader w:val="false"/>
+        </w:trPr>
+        <w:tc>
+          <w:tcPr>
+            <w:tcW w:type="dxa" w:w="800"/>
+            <w:tcBorders>
+              <w:top w:val="single" w:color="AEB4C0" w:sz="4"/>
+              <w:left w:val="single" w:color="AEB4C0" w:sz="4"/>
+              <w:bottom w:val="single" w:color="AEB4C0" w:sz="4"/>
+              <w:right w:val="single" w:color="AEB4C0" w:sz="4"/>
+            </w:tcBorders>
+            <w:tcMar>
+              <w:top w:type="dxa" w:w="70"/>
+              <w:left w:type="dxa" w:w="110"/>
+              <w:bottom w:type="dxa" w:w="70"/>
+              <w:right w:type="dxa" w:w="110"/>
+            </w:tcMar>
+          </w:tcPr>
+          <w:p>
+            <w:pPr>
+              <w:spacing w:after="40" w:line="264"/>
+            </w:pPr>
+            <w:r>
+              <w:rPr>
+                <w:rFonts w:ascii="Times New Roman" w:cs="Times New Roman" w:eastAsia="Times New Roman" w:hAnsi="Times New Roman"/>
+                <w:b w:val="false"/>
+                <w:bCs w:val="false"/>
+                <w:sz w:val="22"/>
+                <w:szCs w:val="22"/>
+              </w:rPr>
+              <w:t xml:space="preserve">TC05</w:t>
+            </w:r>
+          </w:p>
+        </w:tc>
+        <w:tc>
+          <w:tcPr>
+            <w:tcW w:type="dxa" w:w="3150"/>
+            <w:tcBorders>
+              <w:top w:val="single" w:color="AEB4C0" w:sz="4"/>
+              <w:left w:val="single" w:color="AEB4C0" w:sz="4"/>
+              <w:bottom w:val="single" w:color="AEB4C0" w:sz="4"/>
+              <w:right w:val="single" w:color="AEB4C0" w:sz="4"/>
+            </w:tcBorders>
+            <w:tcMar>
+              <w:top w:type="dxa" w:w="70"/>
+              <w:left w:type="dxa" w:w="110"/>
+              <w:bottom w:type="dxa" w:w="70"/>
+              <w:right w:type="dxa" w:w="110"/>
+            </w:tcMar>
+          </w:tcPr>
+          <w:p>
+            <w:pPr>
+              <w:spacing w:after="40" w:line="264"/>
+            </w:pPr>
+            <w:r>
+              <w:rPr>
+                <w:rFonts w:ascii="Times New Roman" w:cs="Times New Roman" w:eastAsia="Times New Roman" w:hAnsi="Times New Roman"/>
+                <w:b w:val="false"/>
+                <w:bCs w:val="false"/>
+                <w:sz w:val="22"/>
+                <w:szCs w:val="22"/>
+              </w:rPr>
+              <w:t xml:space="preserve">Kéo thả tệp không phải video hoặc audio (ví dụ tệp Word)</w:t>
+            </w:r>
+          </w:p>
+        </w:tc>
+        <w:tc>
+          <w:tcPr>
+            <w:tcW w:type="dxa" w:w="3050"/>
+            <w:tcBorders>
+              <w:top w:val="single" w:color="AEB4C0" w:sz="4"/>
+              <w:left w:val="single" w:color="AEB4C0" w:sz="4"/>
+              <w:bottom w:val="single" w:color="AEB4C0" w:sz="4"/>
+              <w:right w:val="single" w:color="AEB4C0" w:sz="4"/>
+            </w:tcBorders>
+            <w:tcMar>
+              <w:top w:type="dxa" w:w="70"/>
+              <w:left w:type="dxa" w:w="110"/>
+              <w:bottom w:type="dxa" w:w="70"/>
+              <w:right w:type="dxa" w:w="110"/>
+            </w:tcMar>
+          </w:tcPr>
+          <w:p>
+            <w:pPr>
+              <w:spacing w:after="40" w:line="264"/>
+            </w:pPr>
+            <w:r>
+              <w:rPr>
+                <w:rFonts w:ascii="Times New Roman" w:cs="Times New Roman" w:eastAsia="Times New Roman" w:hAnsi="Times New Roman"/>
+                <w:b w:val="false"/>
+                <w:bCs w:val="false"/>
+                <w:sz w:val="22"/>
+                <w:szCs w:val="22"/>
+              </w:rPr>
+              <w:t xml:space="preserve">Tệp bị bỏ qua, không hiện thẻ tệp</w:t>
+            </w:r>
+          </w:p>
+        </w:tc>
+        <w:tc>
+          <w:tcPr>
+            <w:tcW w:type="dxa" w:w="1000"/>
+            <w:tcBorders>
+              <w:top w:val="single" w:color="AEB4C0" w:sz="4"/>
+              <w:left w:val="single" w:color="AEB4C0" w:sz="4"/>
+              <w:bottom w:val="single" w:color="AEB4C0" w:sz="4"/>
+              <w:right w:val="single" w:color="AEB4C0" w:sz="4"/>
+            </w:tcBorders>
+            <w:tcMar>
+              <w:top w:type="dxa" w:w="70"/>
+              <w:left w:type="dxa" w:w="110"/>
+              <w:bottom w:type="dxa" w:w="70"/>
+              <w:right w:type="dxa" w:w="110"/>
+            </w:tcMar>
+          </w:tcPr>
+          <w:p>
+            <w:pPr>
+              <w:spacing w:after="40" w:line="264"/>
+            </w:pPr>
+            <w:r>
+              <w:rPr>
+                <w:rFonts w:ascii="Times New Roman" w:cs="Times New Roman" w:eastAsia="Times New Roman" w:hAnsi="Times New Roman"/>
+                <w:b w:val="false"/>
+                <w:bCs w:val="false"/>
+                <w:sz w:val="22"/>
+                <w:szCs w:val="22"/>
+              </w:rPr>
+              <w:t xml:space="preserve">Đạt</w:t>
+            </w:r>
+          </w:p>
+        </w:tc>
+        <w:tc>
+          <w:tcPr>
+            <w:tcW w:type="dxa" w:w="1638"/>
+            <w:tcBorders>
+              <w:top w:val="single" w:color="AEB4C0" w:sz="4"/>
+              <w:left w:val="single" w:color="AEB4C0" w:sz="4"/>
+              <w:bottom w:val="single" w:color="AEB4C0" w:sz="4"/>
+              <w:right w:val="single" w:color="AEB4C0" w:sz="4"/>
+            </w:tcBorders>
+            <w:tcMar>
+              <w:top w:type="dxa" w:w="70"/>
+              <w:left w:type="dxa" w:w="110"/>
+              <w:bottom w:type="dxa" w:w="70"/>
+              <w:right w:type="dxa" w:w="110"/>
+            </w:tcMar>
+          </w:tcPr>
+          <w:p>
+            <w:pPr>
+              <w:spacing w:after="40" w:line="264"/>
+            </w:pPr>
+            <w:r>
+              <w:rPr>
+                <w:rFonts w:ascii="Times New Roman" w:cs="Times New Roman" w:eastAsia="Times New Roman" w:hAnsi="Times New Roman"/>
+                <w:b w:val="false"/>
+                <w:bCs w:val="false"/>
+                <w:sz w:val="22"/>
+                <w:szCs w:val="22"/>
+              </w:rPr>
+              <w:t xml:space="preserve">Không áp dụng</w:t>
+            </w:r>
+          </w:p>
+        </w:tc>
+      </w:tr>
+      <w:tr>
+        <w:trPr>
+          <w:cantSplit/>
+          <w:tblHeader w:val="false"/>
+        </w:trPr>
+        <w:tc>
+          <w:tcPr>
+            <w:tcW w:type="dxa" w:w="800"/>
+            <w:tcBorders>
+              <w:top w:val="single" w:color="AEB4C0" w:sz="4"/>
+              <w:left w:val="single" w:color="AEB4C0" w:sz="4"/>
+              <w:bottom w:val="single" w:color="AEB4C0" w:sz="4"/>
+              <w:right w:val="single" w:color="AEB4C0" w:sz="4"/>
+            </w:tcBorders>
+            <w:tcMar>
+              <w:top w:type="dxa" w:w="70"/>
+              <w:left w:type="dxa" w:w="110"/>
+              <w:bottom w:type="dxa" w:w="70"/>
+              <w:right w:type="dxa" w:w="110"/>
+            </w:tcMar>
+          </w:tcPr>
+          <w:p>
+            <w:pPr>
+              <w:spacing w:after="40" w:line="264"/>
+            </w:pPr>
+            <w:r>
+              <w:rPr>
+                <w:rFonts w:ascii="Times New Roman" w:cs="Times New Roman" w:eastAsia="Times New Roman" w:hAnsi="Times New Roman"/>
+                <w:b w:val="false"/>
+                <w:bCs w:val="false"/>
+                <w:sz w:val="22"/>
+                <w:szCs w:val="22"/>
+              </w:rPr>
+              <w:t xml:space="preserve">TC06</w:t>
+            </w:r>
+          </w:p>
+        </w:tc>
+        <w:tc>
+          <w:tcPr>
+            <w:tcW w:type="dxa" w:w="3150"/>
+            <w:tcBorders>
+              <w:top w:val="single" w:color="AEB4C0" w:sz="4"/>
+              <w:left w:val="single" w:color="AEB4C0" w:sz="4"/>
+              <w:bottom w:val="single" w:color="AEB4C0" w:sz="4"/>
+              <w:right w:val="single" w:color="AEB4C0" w:sz="4"/>
+            </w:tcBorders>
+            <w:tcMar>
+              <w:top w:type="dxa" w:w="70"/>
+              <w:left w:type="dxa" w:w="110"/>
+              <w:bottom w:type="dxa" w:w="70"/>
+              <w:right w:type="dxa" w:w="110"/>
+            </w:tcMar>
+          </w:tcPr>
+          <w:p>
+            <w:pPr>
+              <w:spacing w:after="40" w:line="264"/>
+            </w:pPr>
+            <w:r>
+              <w:rPr>
+                <w:rFonts w:ascii="Times New Roman" w:cs="Times New Roman" w:eastAsia="Times New Roman" w:hAnsi="Times New Roman"/>
+                <w:b w:val="false"/>
+                <w:bCs w:val="false"/>
+                <w:sz w:val="22"/>
+                <w:szCs w:val="22"/>
+              </w:rPr>
+              <w:t xml:space="preserve">Ở bước 2, chưa chọn ngôn ngữ nào</w:t>
+            </w:r>
+          </w:p>
+        </w:tc>
+        <w:tc>
+          <w:tcPr>
+            <w:tcW w:type="dxa" w:w="3050"/>
+            <w:tcBorders>
+              <w:top w:val="single" w:color="AEB4C0" w:sz="4"/>
+              <w:left w:val="single" w:color="AEB4C0" w:sz="4"/>
+              <w:bottom w:val="single" w:color="AEB4C0" w:sz="4"/>
+              <w:right w:val="single" w:color="AEB4C0" w:sz="4"/>
+            </w:tcBorders>
+            <w:tcMar>
+              <w:top w:type="dxa" w:w="70"/>
+              <w:left w:type="dxa" w:w="110"/>
+              <w:bottom w:type="dxa" w:w="70"/>
+              <w:right w:type="dxa" w:w="110"/>
+            </w:tcMar>
+          </w:tcPr>
+          <w:p>
+            <w:pPr>
+              <w:spacing w:after="40" w:line="264"/>
+            </w:pPr>
+            <w:r>
+              <w:rPr>
+                <w:rFonts w:ascii="Times New Roman" w:cs="Times New Roman" w:eastAsia="Times New Roman" w:hAnsi="Times New Roman"/>
+                <w:b w:val="false"/>
+                <w:bCs w:val="false"/>
+                <w:sz w:val="22"/>
+                <w:szCs w:val="22"/>
+              </w:rPr>
+              <w:t xml:space="preserve">Nút Tiếp tục bị khóa</w:t>
+            </w:r>
+          </w:p>
+        </w:tc>
+        <w:tc>
+          <w:tcPr>
+            <w:tcW w:type="dxa" w:w="1000"/>
+            <w:tcBorders>
+              <w:top w:val="single" w:color="AEB4C0" w:sz="4"/>
+              <w:left w:val="single" w:color="AEB4C0" w:sz="4"/>
+              <w:bottom w:val="single" w:color="AEB4C0" w:sz="4"/>
+              <w:right w:val="single" w:color="AEB4C0" w:sz="4"/>
+            </w:tcBorders>
+            <w:tcMar>
+              <w:top w:type="dxa" w:w="70"/>
+              <w:left w:type="dxa" w:w="110"/>
+              <w:bottom w:type="dxa" w:w="70"/>
+              <w:right w:type="dxa" w:w="110"/>
+            </w:tcMar>
+          </w:tcPr>
+          <w:p>
+            <w:pPr>
+              <w:spacing w:after="40" w:line="264"/>
+            </w:pPr>
+            <w:r>
+              <w:rPr>
+                <w:rFonts w:ascii="Times New Roman" w:cs="Times New Roman" w:eastAsia="Times New Roman" w:hAnsi="Times New Roman"/>
+                <w:b w:val="false"/>
+                <w:bCs w:val="false"/>
+                <w:sz w:val="22"/>
+                <w:szCs w:val="22"/>
+              </w:rPr>
+              <w:t xml:space="preserve">Đạt</w:t>
+            </w:r>
+          </w:p>
+        </w:tc>
+        <w:tc>
+          <w:tcPr>
+            <w:tcW w:type="dxa" w:w="1638"/>
+            <w:tcBorders>
+              <w:top w:val="single" w:color="AEB4C0" w:sz="4"/>
+              <w:left w:val="single" w:color="AEB4C0" w:sz="4"/>
+              <w:bottom w:val="single" w:color="AEB4C0" w:sz="4"/>
+              <w:right w:val="single" w:color="AEB4C0" w:sz="4"/>
+            </w:tcBorders>
+            <w:tcMar>
+              <w:top w:type="dxa" w:w="70"/>
+              <w:left w:type="dxa" w:w="110"/>
+              <w:bottom w:type="dxa" w:w="70"/>
+              <w:right w:type="dxa" w:w="110"/>
+            </w:tcMar>
+          </w:tcPr>
+          <w:p>
+            <w:pPr>
+              <w:spacing w:after="40" w:line="264"/>
+            </w:pPr>
+            <w:r>
+              <w:rPr>
+                <w:rFonts w:ascii="Times New Roman" w:cs="Times New Roman" w:eastAsia="Times New Roman" w:hAnsi="Times New Roman"/>
+                <w:b w:val="false"/>
+                <w:bCs w:val="false"/>
+                <w:sz w:val="22"/>
+                <w:szCs w:val="22"/>
+              </w:rPr>
+              <w:t xml:space="preserve">Đạt</w:t>
+            </w:r>
+          </w:p>
+        </w:tc>
+      </w:tr>
+      <w:tr>
+        <w:trPr>
+          <w:cantSplit/>
+          <w:tblHeader w:val="false"/>
+        </w:trPr>
+        <w:tc>
+          <w:tcPr>
+            <w:tcW w:type="dxa" w:w="800"/>
+            <w:tcBorders>
+              <w:top w:val="single" w:color="AEB4C0" w:sz="4"/>
+              <w:left w:val="single" w:color="AEB4C0" w:sz="4"/>
+              <w:bottom w:val="single" w:color="AEB4C0" w:sz="4"/>
+              <w:right w:val="single" w:color="AEB4C0" w:sz="4"/>
+            </w:tcBorders>
+            <w:tcMar>
+              <w:top w:type="dxa" w:w="70"/>
+              <w:left w:type="dxa" w:w="110"/>
+              <w:bottom w:type="dxa" w:w="70"/>
+              <w:right w:type="dxa" w:w="110"/>
+            </w:tcMar>
+          </w:tcPr>
+          <w:p>
+            <w:pPr>
+              <w:spacing w:after="40" w:line="264"/>
+            </w:pPr>
+            <w:r>
+              <w:rPr>
+                <w:rFonts w:ascii="Times New Roman" w:cs="Times New Roman" w:eastAsia="Times New Roman" w:hAnsi="Times New Roman"/>
+                <w:b w:val="false"/>
+                <w:bCs w:val="false"/>
+                <w:sz w:val="22"/>
+                <w:szCs w:val="22"/>
+              </w:rPr>
+              <w:t xml:space="preserve">TC07</w:t>
+            </w:r>
+          </w:p>
+        </w:tc>
+        <w:tc>
+          <w:tcPr>
+            <w:tcW w:type="dxa" w:w="3150"/>
+            <w:tcBorders>
+              <w:top w:val="single" w:color="AEB4C0" w:sz="4"/>
+              <w:left w:val="single" w:color="AEB4C0" w:sz="4"/>
+              <w:bottom w:val="single" w:color="AEB4C0" w:sz="4"/>
+              <w:right w:val="single" w:color="AEB4C0" w:sz="4"/>
+            </w:tcBorders>
+            <w:tcMar>
+              <w:top w:type="dxa" w:w="70"/>
+              <w:left w:type="dxa" w:w="110"/>
+              <w:bottom w:type="dxa" w:w="70"/>
+              <w:right w:type="dxa" w:w="110"/>
+            </w:tcMar>
+          </w:tcPr>
+          <w:p>
+            <w:pPr>
+              <w:spacing w:after="40" w:line="264"/>
+            </w:pPr>
+            <w:r>
+              <w:rPr>
+                <w:rFonts w:ascii="Times New Roman" w:cs="Times New Roman" w:eastAsia="Times New Roman" w:hAnsi="Times New Roman"/>
+                <w:b w:val="false"/>
+                <w:bCs w:val="false"/>
+                <w:sz w:val="22"/>
+                <w:szCs w:val="22"/>
+              </w:rPr>
+              <w:t xml:space="preserve">Chọn 2 ngôn ngữ</w:t>
+            </w:r>
+          </w:p>
+        </w:tc>
+        <w:tc>
+          <w:tcPr>
+            <w:tcW w:type="dxa" w:w="3050"/>
+            <w:tcBorders>
+              <w:top w:val="single" w:color="AEB4C0" w:sz="4"/>
+              <w:left w:val="single" w:color="AEB4C0" w:sz="4"/>
+              <w:bottom w:val="single" w:color="AEB4C0" w:sz="4"/>
+              <w:right w:val="single" w:color="AEB4C0" w:sz="4"/>
+            </w:tcBorders>
+            <w:tcMar>
+              <w:top w:type="dxa" w:w="70"/>
+              <w:left w:type="dxa" w:w="110"/>
+              <w:bottom w:type="dxa" w:w="70"/>
+              <w:right w:type="dxa" w:w="110"/>
+            </w:tcMar>
+          </w:tcPr>
+          <w:p>
+            <w:pPr>
+              <w:spacing w:after="40" w:line="264"/>
+            </w:pPr>
+            <w:r>
+              <w:rPr>
+                <w:rFonts w:ascii="Times New Roman" w:cs="Times New Roman" w:eastAsia="Times New Roman" w:hAnsi="Times New Roman"/>
+                <w:b w:val="false"/>
+                <w:bCs w:val="false"/>
+                <w:sz w:val="22"/>
+                <w:szCs w:val="22"/>
+              </w:rPr>
+              <w:t xml:space="preserve">Dòng đếm ghi 2, hai thẻ được tô màu</w:t>
+            </w:r>
+          </w:p>
+        </w:tc>
+        <w:tc>
+          <w:tcPr>
+            <w:tcW w:type="dxa" w:w="1000"/>
+            <w:tcBorders>
+              <w:top w:val="single" w:color="AEB4C0" w:sz="4"/>
+              <w:left w:val="single" w:color="AEB4C0" w:sz="4"/>
+              <w:bottom w:val="single" w:color="AEB4C0" w:sz="4"/>
+              <w:right w:val="single" w:color="AEB4C0" w:sz="4"/>
+            </w:tcBorders>
+            <w:tcMar>
+              <w:top w:type="dxa" w:w="70"/>
+              <w:left w:type="dxa" w:w="110"/>
+              <w:bottom w:type="dxa" w:w="70"/>
+              <w:right w:type="dxa" w:w="110"/>
+            </w:tcMar>
+          </w:tcPr>
+          <w:p>
+            <w:pPr>
+              <w:spacing w:after="40" w:line="264"/>
+            </w:pPr>
+            <w:r>
+              <w:rPr>
+                <w:rFonts w:ascii="Times New Roman" w:cs="Times New Roman" w:eastAsia="Times New Roman" w:hAnsi="Times New Roman"/>
+                <w:b w:val="false"/>
+                <w:bCs w:val="false"/>
+                <w:sz w:val="22"/>
+                <w:szCs w:val="22"/>
+              </w:rPr>
+              <w:t xml:space="preserve">Đạt</w:t>
+            </w:r>
+          </w:p>
+        </w:tc>
+        <w:tc>
+          <w:tcPr>
+            <w:tcW w:type="dxa" w:w="1638"/>
+            <w:tcBorders>
+              <w:top w:val="single" w:color="AEB4C0" w:sz="4"/>
+              <w:left w:val="single" w:color="AEB4C0" w:sz="4"/>
+              <w:bottom w:val="single" w:color="AEB4C0" w:sz="4"/>
+              <w:right w:val="single" w:color="AEB4C0" w:sz="4"/>
+            </w:tcBorders>
+            <w:tcMar>
+              <w:top w:type="dxa" w:w="70"/>
+              <w:left w:type="dxa" w:w="110"/>
+              <w:bottom w:type="dxa" w:w="70"/>
+              <w:right w:type="dxa" w:w="110"/>
+            </w:tcMar>
+          </w:tcPr>
+          <w:p>
+            <w:pPr>
+              <w:spacing w:after="40" w:line="264"/>
+            </w:pPr>
+            <w:r>
+              <w:rPr>
+                <w:rFonts w:ascii="Times New Roman" w:cs="Times New Roman" w:eastAsia="Times New Roman" w:hAnsi="Times New Roman"/>
+                <w:b w:val="false"/>
+                <w:bCs w:val="false"/>
+                <w:sz w:val="22"/>
+                <w:szCs w:val="22"/>
+              </w:rPr>
+              <w:t xml:space="preserve">Đạt</w:t>
+            </w:r>
+          </w:p>
+        </w:tc>
+      </w:tr>
+      <w:tr>
+        <w:trPr>
+          <w:cantSplit/>
+          <w:tblHeader w:val="false"/>
+        </w:trPr>
+        <w:tc>
+          <w:tcPr>
+            <w:tcW w:type="dxa" w:w="800"/>
+            <w:tcBorders>
+              <w:top w:val="single" w:color="AEB4C0" w:sz="4"/>
+              <w:left w:val="single" w:color="AEB4C0" w:sz="4"/>
+              <w:bottom w:val="single" w:color="AEB4C0" w:sz="4"/>
+              <w:right w:val="single" w:color="AEB4C0" w:sz="4"/>
+            </w:tcBorders>
+            <w:tcMar>
+              <w:top w:type="dxa" w:w="70"/>
+              <w:left w:type="dxa" w:w="110"/>
+              <w:bottom w:type="dxa" w:w="70"/>
+              <w:right w:type="dxa" w:w="110"/>
+            </w:tcMar>
+          </w:tcPr>
+          <w:p>
+            <w:pPr>
+              <w:spacing w:after="40" w:line="264"/>
+            </w:pPr>
+            <w:r>
+              <w:rPr>
+                <w:rFonts w:ascii="Times New Roman" w:cs="Times New Roman" w:eastAsia="Times New Roman" w:hAnsi="Times New Roman"/>
+                <w:b w:val="false"/>
+                <w:bCs w:val="false"/>
+                <w:sz w:val="22"/>
+                <w:szCs w:val="22"/>
+              </w:rPr>
+              <w:t xml:space="preserve">TC08</w:t>
+            </w:r>
+          </w:p>
+        </w:tc>
+        <w:tc>
+          <w:tcPr>
+            <w:tcW w:type="dxa" w:w="3150"/>
+            <w:tcBorders>
+              <w:top w:val="single" w:color="AEB4C0" w:sz="4"/>
+              <w:left w:val="single" w:color="AEB4C0" w:sz="4"/>
+              <w:bottom w:val="single" w:color="AEB4C0" w:sz="4"/>
+              <w:right w:val="single" w:color="AEB4C0" w:sz="4"/>
+            </w:tcBorders>
+            <w:tcMar>
+              <w:top w:type="dxa" w:w="70"/>
+              <w:left w:type="dxa" w:w="110"/>
+              <w:bottom w:type="dxa" w:w="70"/>
+              <w:right w:type="dxa" w:w="110"/>
+            </w:tcMar>
+          </w:tcPr>
+          <w:p>
+            <w:pPr>
+              <w:spacing w:after="40" w:line="264"/>
+            </w:pPr>
+            <w:r>
+              <w:rPr>
+                <w:rFonts w:ascii="Times New Roman" w:cs="Times New Roman" w:eastAsia="Times New Roman" w:hAnsi="Times New Roman"/>
+                <w:b w:val="false"/>
+                <w:bCs w:val="false"/>
+                <w:sz w:val="22"/>
+                <w:szCs w:val="22"/>
+              </w:rPr>
+              <w:t xml:space="preserve">Ở bước 2, bấm Quay lại</w:t>
+            </w:r>
+          </w:p>
+        </w:tc>
+        <w:tc>
+          <w:tcPr>
+            <w:tcW w:type="dxa" w:w="3050"/>
+            <w:tcBorders>
+              <w:top w:val="single" w:color="AEB4C0" w:sz="4"/>
+              <w:left w:val="single" w:color="AEB4C0" w:sz="4"/>
+              <w:bottom w:val="single" w:color="AEB4C0" w:sz="4"/>
+              <w:right w:val="single" w:color="AEB4C0" w:sz="4"/>
+            </w:tcBorders>
+            <w:tcMar>
+              <w:top w:type="dxa" w:w="70"/>
+              <w:left w:type="dxa" w:w="110"/>
+              <w:bottom w:type="dxa" w:w="70"/>
+              <w:right w:type="dxa" w:w="110"/>
+            </w:tcMar>
+          </w:tcPr>
+          <w:p>
+            <w:pPr>
+              <w:spacing w:after="40" w:line="264"/>
+            </w:pPr>
+            <w:r>
+              <w:rPr>
+                <w:rFonts w:ascii="Times New Roman" w:cs="Times New Roman" w:eastAsia="Times New Roman" w:hAnsi="Times New Roman"/>
+                <w:b w:val="false"/>
+                <w:bCs w:val="false"/>
+                <w:sz w:val="22"/>
+                <w:szCs w:val="22"/>
+              </w:rPr>
+              <w:t xml:space="preserve">Về bước 1, tệp vẫn còn</w:t>
+            </w:r>
+          </w:p>
+        </w:tc>
+        <w:tc>
+          <w:tcPr>
+            <w:tcW w:type="dxa" w:w="1000"/>
+            <w:tcBorders>
+              <w:top w:val="single" w:color="AEB4C0" w:sz="4"/>
+              <w:left w:val="single" w:color="AEB4C0" w:sz="4"/>
+              <w:bottom w:val="single" w:color="AEB4C0" w:sz="4"/>
+              <w:right w:val="single" w:color="AEB4C0" w:sz="4"/>
+            </w:tcBorders>
+            <w:tcMar>
+              <w:top w:type="dxa" w:w="70"/>
+              <w:left w:type="dxa" w:w="110"/>
+              <w:bottom w:type="dxa" w:w="70"/>
+              <w:right w:type="dxa" w:w="110"/>
+            </w:tcMar>
+          </w:tcPr>
+          <w:p>
+            <w:pPr>
+              <w:spacing w:after="40" w:line="264"/>
+            </w:pPr>
+            <w:r>
+              <w:rPr>
+                <w:rFonts w:ascii="Times New Roman" w:cs="Times New Roman" w:eastAsia="Times New Roman" w:hAnsi="Times New Roman"/>
+                <w:b w:val="false"/>
+                <w:bCs w:val="false"/>
+                <w:sz w:val="22"/>
+                <w:szCs w:val="22"/>
+              </w:rPr>
+              <w:t xml:space="preserve">Đạt</w:t>
+            </w:r>
+          </w:p>
+        </w:tc>
+        <w:tc>
+          <w:tcPr>
+            <w:tcW w:type="dxa" w:w="1638"/>
+            <w:tcBorders>
+              <w:top w:val="single" w:color="AEB4C0" w:sz="4"/>
+              <w:left w:val="single" w:color="AEB4C0" w:sz="4"/>
+              <w:bottom w:val="single" w:color="AEB4C0" w:sz="4"/>
+              <w:right w:val="single" w:color="AEB4C0" w:sz="4"/>
+            </w:tcBorders>
+            <w:tcMar>
+              <w:top w:type="dxa" w:w="70"/>
+              <w:left w:type="dxa" w:w="110"/>
+              <w:bottom w:type="dxa" w:w="70"/>
+              <w:right w:type="dxa" w:w="110"/>
+            </w:tcMar>
+          </w:tcPr>
+          <w:p>
+            <w:pPr>
+              <w:spacing w:after="40" w:line="264"/>
+            </w:pPr>
+            <w:r>
+              <w:rPr>
+                <w:rFonts w:ascii="Times New Roman" w:cs="Times New Roman" w:eastAsia="Times New Roman" w:hAnsi="Times New Roman"/>
+                <w:b w:val="false"/>
+                <w:bCs w:val="false"/>
+                <w:sz w:val="22"/>
+                <w:szCs w:val="22"/>
+              </w:rPr>
+              <w:t xml:space="preserve">Đạt</w:t>
+            </w:r>
+          </w:p>
+        </w:tc>
+      </w:tr>
+      <w:tr>
+        <w:trPr>
+          <w:cantSplit/>
+          <w:tblHeader w:val="false"/>
+        </w:trPr>
+        <w:tc>
+          <w:tcPr>
+            <w:tcW w:type="dxa" w:w="800"/>
+            <w:tcBorders>
+              <w:top w:val="single" w:color="AEB4C0" w:sz="4"/>
+              <w:left w:val="single" w:color="AEB4C0" w:sz="4"/>
+              <w:bottom w:val="single" w:color="AEB4C0" w:sz="4"/>
+              <w:right w:val="single" w:color="AEB4C0" w:sz="4"/>
+            </w:tcBorders>
+            <w:tcMar>
+              <w:top w:type="dxa" w:w="70"/>
+              <w:left w:type="dxa" w:w="110"/>
+              <w:bottom w:type="dxa" w:w="70"/>
+              <w:right w:type="dxa" w:w="110"/>
+            </w:tcMar>
+          </w:tcPr>
+          <w:p>
+            <w:pPr>
+              <w:spacing w:after="40" w:line="264"/>
+            </w:pPr>
+            <w:r>
+              <w:rPr>
+                <w:rFonts w:ascii="Times New Roman" w:cs="Times New Roman" w:eastAsia="Times New Roman" w:hAnsi="Times New Roman"/>
+                <w:b w:val="false"/>
+                <w:bCs w:val="false"/>
+                <w:sz w:val="22"/>
+                <w:szCs w:val="22"/>
+              </w:rPr>
+              <w:t xml:space="preserve">TC09</w:t>
+            </w:r>
+          </w:p>
+        </w:tc>
+        <w:tc>
+          <w:tcPr>
+            <w:tcW w:type="dxa" w:w="3150"/>
+            <w:tcBorders>
+              <w:top w:val="single" w:color="AEB4C0" w:sz="4"/>
+              <w:left w:val="single" w:color="AEB4C0" w:sz="4"/>
+              <w:bottom w:val="single" w:color="AEB4C0" w:sz="4"/>
+              <w:right w:val="single" w:color="AEB4C0" w:sz="4"/>
+            </w:tcBorders>
+            <w:tcMar>
+              <w:top w:type="dxa" w:w="70"/>
+              <w:left w:type="dxa" w:w="110"/>
+              <w:bottom w:type="dxa" w:w="70"/>
+              <w:right w:type="dxa" w:w="110"/>
+            </w:tcMar>
+          </w:tcPr>
+          <w:p>
+            <w:pPr>
+              <w:spacing w:after="40" w:line="264"/>
+            </w:pPr>
+            <w:r>
+              <w:rPr>
+                <w:rFonts w:ascii="Times New Roman" w:cs="Times New Roman" w:eastAsia="Times New Roman" w:hAnsi="Times New Roman"/>
+                <w:b w:val="false"/>
+                <w:bCs w:val="false"/>
+                <w:sz w:val="22"/>
+                <w:szCs w:val="22"/>
+              </w:rPr>
+              <w:t xml:space="preserve">Ở bước 3, chờ chạy hết</w:t>
+            </w:r>
+          </w:p>
+        </w:tc>
+        <w:tc>
+          <w:tcPr>
+            <w:tcW w:type="dxa" w:w="3050"/>
+            <w:tcBorders>
+              <w:top w:val="single" w:color="AEB4C0" w:sz="4"/>
+              <w:left w:val="single" w:color="AEB4C0" w:sz="4"/>
+              <w:bottom w:val="single" w:color="AEB4C0" w:sz="4"/>
+              <w:right w:val="single" w:color="AEB4C0" w:sz="4"/>
+            </w:tcBorders>
+            <w:tcMar>
+              <w:top w:type="dxa" w:w="70"/>
+              <w:left w:type="dxa" w:w="110"/>
+              <w:bottom w:type="dxa" w:w="70"/>
+              <w:right w:type="dxa" w:w="110"/>
+            </w:tcMar>
+          </w:tcPr>
+          <w:p>
+            <w:pPr>
+              <w:spacing w:after="40" w:line="264"/>
+            </w:pPr>
+            <w:r>
+              <w:rPr>
+                <w:rFonts w:ascii="Times New Roman" w:cs="Times New Roman" w:eastAsia="Times New Roman" w:hAnsi="Times New Roman"/>
+                <w:b w:val="false"/>
+                <w:bCs w:val="false"/>
+                <w:sz w:val="22"/>
+                <w:szCs w:val="22"/>
+              </w:rPr>
+              <w:t xml:space="preserve">Chạy từ 0% đến 100% rồi tự sang bước 4</w:t>
+            </w:r>
+          </w:p>
+        </w:tc>
+        <w:tc>
+          <w:tcPr>
+            <w:tcW w:type="dxa" w:w="1000"/>
+            <w:tcBorders>
+              <w:top w:val="single" w:color="AEB4C0" w:sz="4"/>
+              <w:left w:val="single" w:color="AEB4C0" w:sz="4"/>
+              <w:bottom w:val="single" w:color="AEB4C0" w:sz="4"/>
+              <w:right w:val="single" w:color="AEB4C0" w:sz="4"/>
+            </w:tcBorders>
+            <w:tcMar>
+              <w:top w:type="dxa" w:w="70"/>
+              <w:left w:type="dxa" w:w="110"/>
+              <w:bottom w:type="dxa" w:w="70"/>
+              <w:right w:type="dxa" w:w="110"/>
+            </w:tcMar>
+          </w:tcPr>
+          <w:p>
+            <w:pPr>
+              <w:spacing w:after="40" w:line="264"/>
+            </w:pPr>
+            <w:r>
+              <w:rPr>
+                <w:rFonts w:ascii="Times New Roman" w:cs="Times New Roman" w:eastAsia="Times New Roman" w:hAnsi="Times New Roman"/>
+                <w:b w:val="false"/>
+                <w:bCs w:val="false"/>
+                <w:sz w:val="22"/>
+                <w:szCs w:val="22"/>
+              </w:rPr>
+              <w:t xml:space="preserve">Đạt</w:t>
+            </w:r>
+          </w:p>
+        </w:tc>
+        <w:tc>
+          <w:tcPr>
+            <w:tcW w:type="dxa" w:w="1638"/>
+            <w:tcBorders>
+              <w:top w:val="single" w:color="AEB4C0" w:sz="4"/>
+              <w:left w:val="single" w:color="AEB4C0" w:sz="4"/>
+              <w:bottom w:val="single" w:color="AEB4C0" w:sz="4"/>
+              <w:right w:val="single" w:color="AEB4C0" w:sz="4"/>
+            </w:tcBorders>
+            <w:tcMar>
+              <w:top w:type="dxa" w:w="70"/>
+              <w:left w:type="dxa" w:w="110"/>
+              <w:bottom w:type="dxa" w:w="70"/>
+              <w:right w:type="dxa" w:w="110"/>
+            </w:tcMar>
+          </w:tcPr>
+          <w:p>
+            <w:pPr>
+              <w:spacing w:after="40" w:line="264"/>
+            </w:pPr>
+            <w:r>
+              <w:rPr>
+                <w:rFonts w:ascii="Times New Roman" w:cs="Times New Roman" w:eastAsia="Times New Roman" w:hAnsi="Times New Roman"/>
+                <w:b w:val="false"/>
+                <w:bCs w:val="false"/>
+                <w:sz w:val="22"/>
+                <w:szCs w:val="22"/>
+              </w:rPr>
+              <w:t xml:space="preserve">Đạt</w:t>
+            </w:r>
+          </w:p>
+        </w:tc>
+      </w:tr>
+      <w:tr>
+        <w:trPr>
+          <w:cantSplit/>
+          <w:tblHeader w:val="false"/>
+        </w:trPr>
+        <w:tc>
+          <w:tcPr>
+            <w:tcW w:type="dxa" w:w="800"/>
+            <w:tcBorders>
+              <w:top w:val="single" w:color="AEB4C0" w:sz="4"/>
+              <w:left w:val="single" w:color="AEB4C0" w:sz="4"/>
+              <w:bottom w:val="single" w:color="AEB4C0" w:sz="4"/>
+              <w:right w:val="single" w:color="AEB4C0" w:sz="4"/>
+            </w:tcBorders>
+            <w:tcMar>
+              <w:top w:type="dxa" w:w="70"/>
+              <w:left w:type="dxa" w:w="110"/>
+              <w:bottom w:type="dxa" w:w="70"/>
+              <w:right w:type="dxa" w:w="110"/>
+            </w:tcMar>
+          </w:tcPr>
+          <w:p>
+            <w:pPr>
+              <w:spacing w:after="40" w:line="264"/>
+            </w:pPr>
+            <w:r>
+              <w:rPr>
+                <w:rFonts w:ascii="Times New Roman" w:cs="Times New Roman" w:eastAsia="Times New Roman" w:hAnsi="Times New Roman"/>
+                <w:b w:val="false"/>
+                <w:bCs w:val="false"/>
+                <w:sz w:val="22"/>
+                <w:szCs w:val="22"/>
+              </w:rPr>
+              <w:t xml:space="preserve">TC10</w:t>
+            </w:r>
+          </w:p>
+        </w:tc>
+        <w:tc>
+          <w:tcPr>
+            <w:tcW w:type="dxa" w:w="3150"/>
+            <w:tcBorders>
+              <w:top w:val="single" w:color="AEB4C0" w:sz="4"/>
+              <w:left w:val="single" w:color="AEB4C0" w:sz="4"/>
+              <w:bottom w:val="single" w:color="AEB4C0" w:sz="4"/>
+              <w:right w:val="single" w:color="AEB4C0" w:sz="4"/>
+            </w:tcBorders>
+            <w:tcMar>
+              <w:top w:type="dxa" w:w="70"/>
+              <w:left w:type="dxa" w:w="110"/>
+              <w:bottom w:type="dxa" w:w="70"/>
+              <w:right w:type="dxa" w:w="110"/>
+            </w:tcMar>
+          </w:tcPr>
+          <w:p>
+            <w:pPr>
+              <w:spacing w:after="40" w:line="264"/>
+            </w:pPr>
+            <w:r>
+              <w:rPr>
+                <w:rFonts w:ascii="Times New Roman" w:cs="Times New Roman" w:eastAsia="Times New Roman" w:hAnsi="Times New Roman"/>
+                <w:b w:val="false"/>
+                <w:bCs w:val="false"/>
+                <w:sz w:val="22"/>
+                <w:szCs w:val="22"/>
+              </w:rPr>
+              <w:t xml:space="preserve">Ở bước 3, bấm Hủy giữa chừng</w:t>
+            </w:r>
+          </w:p>
+        </w:tc>
+        <w:tc>
+          <w:tcPr>
+            <w:tcW w:type="dxa" w:w="3050"/>
+            <w:tcBorders>
+              <w:top w:val="single" w:color="AEB4C0" w:sz="4"/>
+              <w:left w:val="single" w:color="AEB4C0" w:sz="4"/>
+              <w:bottom w:val="single" w:color="AEB4C0" w:sz="4"/>
+              <w:right w:val="single" w:color="AEB4C0" w:sz="4"/>
+            </w:tcBorders>
+            <w:tcMar>
+              <w:top w:type="dxa" w:w="70"/>
+              <w:left w:type="dxa" w:w="110"/>
+              <w:bottom w:type="dxa" w:w="70"/>
+              <w:right w:type="dxa" w:w="110"/>
+            </w:tcMar>
+          </w:tcPr>
+          <w:p>
+            <w:pPr>
+              <w:spacing w:after="40" w:line="264"/>
+            </w:pPr>
+            <w:r>
+              <w:rPr>
+                <w:rFonts w:ascii="Times New Roman" w:cs="Times New Roman" w:eastAsia="Times New Roman" w:hAnsi="Times New Roman"/>
+                <w:b w:val="false"/>
+                <w:bCs w:val="false"/>
+                <w:sz w:val="22"/>
+                <w:szCs w:val="22"/>
+              </w:rPr>
+              <w:t xml:space="preserve">Về bước 2, giữ nguyên tệp và lựa chọn</w:t>
+            </w:r>
+          </w:p>
+        </w:tc>
+        <w:tc>
+          <w:tcPr>
+            <w:tcW w:type="dxa" w:w="1000"/>
+            <w:tcBorders>
+              <w:top w:val="single" w:color="AEB4C0" w:sz="4"/>
+              <w:left w:val="single" w:color="AEB4C0" w:sz="4"/>
+              <w:bottom w:val="single" w:color="AEB4C0" w:sz="4"/>
+              <w:right w:val="single" w:color="AEB4C0" w:sz="4"/>
+            </w:tcBorders>
+            <w:tcMar>
+              <w:top w:type="dxa" w:w="70"/>
+              <w:left w:type="dxa" w:w="110"/>
+              <w:bottom w:type="dxa" w:w="70"/>
+              <w:right w:type="dxa" w:w="110"/>
+            </w:tcMar>
+          </w:tcPr>
+          <w:p>
+            <w:pPr>
+              <w:spacing w:after="40" w:line="264"/>
+            </w:pPr>
+            <w:r>
+              <w:rPr>
+                <w:rFonts w:ascii="Times New Roman" w:cs="Times New Roman" w:eastAsia="Times New Roman" w:hAnsi="Times New Roman"/>
+                <w:b w:val="false"/>
+                <w:bCs w:val="false"/>
+                <w:sz w:val="22"/>
+                <w:szCs w:val="22"/>
+              </w:rPr>
+              <w:t xml:space="preserve">Đạt</w:t>
+            </w:r>
+          </w:p>
+        </w:tc>
+        <w:tc>
+          <w:tcPr>
+            <w:tcW w:type="dxa" w:w="1638"/>
+            <w:tcBorders>
+              <w:top w:val="single" w:color="AEB4C0" w:sz="4"/>
+              <w:left w:val="single" w:color="AEB4C0" w:sz="4"/>
+              <w:bottom w:val="single" w:color="AEB4C0" w:sz="4"/>
+              <w:right w:val="single" w:color="AEB4C0" w:sz="4"/>
+            </w:tcBorders>
+            <w:tcMar>
+              <w:top w:type="dxa" w:w="70"/>
+              <w:left w:type="dxa" w:w="110"/>
+              <w:bottom w:type="dxa" w:w="70"/>
+              <w:right w:type="dxa" w:w="110"/>
+            </w:tcMar>
+          </w:tcPr>
+          <w:p>
+            <w:pPr>
+              <w:spacing w:after="40" w:line="264"/>
+            </w:pPr>
+            <w:r>
+              <w:rPr>
+                <w:rFonts w:ascii="Times New Roman" w:cs="Times New Roman" w:eastAsia="Times New Roman" w:hAnsi="Times New Roman"/>
+                <w:b w:val="false"/>
+                <w:bCs w:val="false"/>
+                <w:sz w:val="22"/>
+                <w:szCs w:val="22"/>
+              </w:rPr>
+              <w:t xml:space="preserve">Đạt</w:t>
+            </w:r>
+          </w:p>
+        </w:tc>
+      </w:tr>
+      <w:tr>
+        <w:trPr>
+          <w:cantSplit/>
+          <w:tblHeader w:val="false"/>
+        </w:trPr>
+        <w:tc>
+          <w:tcPr>
+            <w:tcW w:type="dxa" w:w="800"/>
+            <w:tcBorders>
+              <w:top w:val="single" w:color="AEB4C0" w:sz="4"/>
+              <w:left w:val="single" w:color="AEB4C0" w:sz="4"/>
+              <w:bottom w:val="single" w:color="AEB4C0" w:sz="4"/>
+              <w:right w:val="single" w:color="AEB4C0" w:sz="4"/>
+            </w:tcBorders>
+            <w:tcMar>
+              <w:top w:type="dxa" w:w="70"/>
+              <w:left w:type="dxa" w:w="110"/>
+              <w:bottom w:type="dxa" w:w="70"/>
+              <w:right w:type="dxa" w:w="110"/>
+            </w:tcMar>
+          </w:tcPr>
+          <w:p>
+            <w:pPr>
+              <w:spacing w:after="40" w:line="264"/>
+            </w:pPr>
+            <w:r>
+              <w:rPr>
+                <w:rFonts w:ascii="Times New Roman" w:cs="Times New Roman" w:eastAsia="Times New Roman" w:hAnsi="Times New Roman"/>
+                <w:b w:val="false"/>
+                <w:bCs w:val="false"/>
+                <w:sz w:val="22"/>
+                <w:szCs w:val="22"/>
+              </w:rPr>
+              <w:t xml:space="preserve">TC11</w:t>
+            </w:r>
+          </w:p>
+        </w:tc>
+        <w:tc>
+          <w:tcPr>
+            <w:tcW w:type="dxa" w:w="3150"/>
+            <w:tcBorders>
+              <w:top w:val="single" w:color="AEB4C0" w:sz="4"/>
+              <w:left w:val="single" w:color="AEB4C0" w:sz="4"/>
+              <w:bottom w:val="single" w:color="AEB4C0" w:sz="4"/>
+              <w:right w:val="single" w:color="AEB4C0" w:sz="4"/>
+            </w:tcBorders>
+            <w:tcMar>
+              <w:top w:type="dxa" w:w="70"/>
+              <w:left w:type="dxa" w:w="110"/>
+              <w:bottom w:type="dxa" w:w="70"/>
+              <w:right w:type="dxa" w:w="110"/>
+            </w:tcMar>
+          </w:tcPr>
+          <w:p>
+            <w:pPr>
+              <w:spacing w:after="40" w:line="264"/>
+            </w:pPr>
+            <w:r>
+              <w:rPr>
+                <w:rFonts w:ascii="Times New Roman" w:cs="Times New Roman" w:eastAsia="Times New Roman" w:hAnsi="Times New Roman"/>
+                <w:b w:val="false"/>
+                <w:bCs w:val="false"/>
+                <w:sz w:val="22"/>
+                <w:szCs w:val="22"/>
+              </w:rPr>
+              <w:t xml:space="preserve">Ở bước 4, bấm tab ngôn ngữ thứ hai</w:t>
+            </w:r>
+          </w:p>
+        </w:tc>
+        <w:tc>
+          <w:tcPr>
+            <w:tcW w:type="dxa" w:w="3050"/>
+            <w:tcBorders>
+              <w:top w:val="single" w:color="AEB4C0" w:sz="4"/>
+              <w:left w:val="single" w:color="AEB4C0" w:sz="4"/>
+              <w:bottom w:val="single" w:color="AEB4C0" w:sz="4"/>
+              <w:right w:val="single" w:color="AEB4C0" w:sz="4"/>
+            </w:tcBorders>
+            <w:tcMar>
+              <w:top w:type="dxa" w:w="70"/>
+              <w:left w:type="dxa" w:w="110"/>
+              <w:bottom w:type="dxa" w:w="70"/>
+              <w:right w:type="dxa" w:w="110"/>
+            </w:tcMar>
+          </w:tcPr>
+          <w:p>
+            <w:pPr>
+              <w:spacing w:after="40" w:line="264"/>
+            </w:pPr>
+            <w:r>
+              <w:rPr>
+                <w:rFonts w:ascii="Times New Roman" w:cs="Times New Roman" w:eastAsia="Times New Roman" w:hAnsi="Times New Roman"/>
+                <w:b w:val="false"/>
+                <w:bCs w:val="false"/>
+                <w:sz w:val="22"/>
+                <w:szCs w:val="22"/>
+              </w:rPr>
+              <w:t xml:space="preserve">Tab đổi màu, nút Tải về đổi tên theo ngôn ngữ</w:t>
+            </w:r>
+          </w:p>
+        </w:tc>
+        <w:tc>
+          <w:tcPr>
+            <w:tcW w:type="dxa" w:w="1000"/>
+            <w:tcBorders>
+              <w:top w:val="single" w:color="AEB4C0" w:sz="4"/>
+              <w:left w:val="single" w:color="AEB4C0" w:sz="4"/>
+              <w:bottom w:val="single" w:color="AEB4C0" w:sz="4"/>
+              <w:right w:val="single" w:color="AEB4C0" w:sz="4"/>
+            </w:tcBorders>
+            <w:tcMar>
+              <w:top w:type="dxa" w:w="70"/>
+              <w:left w:type="dxa" w:w="110"/>
+              <w:bottom w:type="dxa" w:w="70"/>
+              <w:right w:type="dxa" w:w="110"/>
+            </w:tcMar>
+          </w:tcPr>
+          <w:p>
+            <w:pPr>
+              <w:spacing w:after="40" w:line="264"/>
+            </w:pPr>
+            <w:r>
+              <w:rPr>
+                <w:rFonts w:ascii="Times New Roman" w:cs="Times New Roman" w:eastAsia="Times New Roman" w:hAnsi="Times New Roman"/>
+                <w:b w:val="false"/>
+                <w:bCs w:val="false"/>
+                <w:sz w:val="22"/>
+                <w:szCs w:val="22"/>
+              </w:rPr>
+              <w:t xml:space="preserve">Đạt</w:t>
+            </w:r>
+          </w:p>
+        </w:tc>
+        <w:tc>
+          <w:tcPr>
+            <w:tcW w:type="dxa" w:w="1638"/>
+            <w:tcBorders>
+              <w:top w:val="single" w:color="AEB4C0" w:sz="4"/>
+              <w:left w:val="single" w:color="AEB4C0" w:sz="4"/>
+              <w:bottom w:val="single" w:color="AEB4C0" w:sz="4"/>
+              <w:right w:val="single" w:color="AEB4C0" w:sz="4"/>
+            </w:tcBorders>
+            <w:tcMar>
+              <w:top w:type="dxa" w:w="70"/>
+              <w:left w:type="dxa" w:w="110"/>
+              <w:bottom w:type="dxa" w:w="70"/>
+              <w:right w:type="dxa" w:w="110"/>
+            </w:tcMar>
+          </w:tcPr>
+          <w:p>
+            <w:pPr>
+              <w:spacing w:after="40" w:line="264"/>
+            </w:pPr>
+            <w:r>
+              <w:rPr>
+                <w:rFonts w:ascii="Times New Roman" w:cs="Times New Roman" w:eastAsia="Times New Roman" w:hAnsi="Times New Roman"/>
+                <w:b w:val="false"/>
+                <w:bCs w:val="false"/>
+                <w:sz w:val="22"/>
+                <w:szCs w:val="22"/>
+              </w:rPr>
+              <w:t xml:space="preserve">Đạt</w:t>
+            </w:r>
+          </w:p>
+        </w:tc>
+      </w:tr>
+      <w:tr>
+        <w:trPr>
+          <w:cantSplit/>
+          <w:tblHeader w:val="false"/>
+        </w:trPr>
+        <w:tc>
+          <w:tcPr>
+            <w:tcW w:type="dxa" w:w="800"/>
+            <w:tcBorders>
+              <w:top w:val="single" w:color="AEB4C0" w:sz="4"/>
+              <w:left w:val="single" w:color="AEB4C0" w:sz="4"/>
+              <w:bottom w:val="single" w:color="AEB4C0" w:sz="4"/>
+              <w:right w:val="single" w:color="AEB4C0" w:sz="4"/>
+            </w:tcBorders>
+            <w:tcMar>
+              <w:top w:type="dxa" w:w="70"/>
+              <w:left w:type="dxa" w:w="110"/>
+              <w:bottom w:type="dxa" w:w="70"/>
+              <w:right w:type="dxa" w:w="110"/>
+            </w:tcMar>
+          </w:tcPr>
+          <w:p>
+            <w:pPr>
+              <w:spacing w:after="40" w:line="264"/>
+            </w:pPr>
+            <w:r>
+              <w:rPr>
+                <w:rFonts w:ascii="Times New Roman" w:cs="Times New Roman" w:eastAsia="Times New Roman" w:hAnsi="Times New Roman"/>
+                <w:b w:val="false"/>
+                <w:bCs w:val="false"/>
+                <w:sz w:val="22"/>
+                <w:szCs w:val="22"/>
+              </w:rPr>
+              <w:t xml:space="preserve">TC12</w:t>
+            </w:r>
+          </w:p>
+        </w:tc>
+        <w:tc>
+          <w:tcPr>
+            <w:tcW w:type="dxa" w:w="3150"/>
+            <w:tcBorders>
+              <w:top w:val="single" w:color="AEB4C0" w:sz="4"/>
+              <w:left w:val="single" w:color="AEB4C0" w:sz="4"/>
+              <w:bottom w:val="single" w:color="AEB4C0" w:sz="4"/>
+              <w:right w:val="single" w:color="AEB4C0" w:sz="4"/>
+            </w:tcBorders>
+            <w:tcMar>
+              <w:top w:type="dxa" w:w="70"/>
+              <w:left w:type="dxa" w:w="110"/>
+              <w:bottom w:type="dxa" w:w="70"/>
+              <w:right w:type="dxa" w:w="110"/>
+            </w:tcMar>
+          </w:tcPr>
+          <w:p>
+            <w:pPr>
+              <w:spacing w:after="40" w:line="264"/>
+            </w:pPr>
+            <w:r>
+              <w:rPr>
+                <w:rFonts w:ascii="Times New Roman" w:cs="Times New Roman" w:eastAsia="Times New Roman" w:hAnsi="Times New Roman"/>
+                <w:b w:val="false"/>
+                <w:bCs w:val="false"/>
+                <w:sz w:val="22"/>
+                <w:szCs w:val="22"/>
+              </w:rPr>
+              <w:t xml:space="preserve">Ở bước 4, bấm phát</w:t>
+            </w:r>
+          </w:p>
+        </w:tc>
+        <w:tc>
+          <w:tcPr>
+            <w:tcW w:type="dxa" w:w="3050"/>
+            <w:tcBorders>
+              <w:top w:val="single" w:color="AEB4C0" w:sz="4"/>
+              <w:left w:val="single" w:color="AEB4C0" w:sz="4"/>
+              <w:bottom w:val="single" w:color="AEB4C0" w:sz="4"/>
+              <w:right w:val="single" w:color="AEB4C0" w:sz="4"/>
+            </w:tcBorders>
+            <w:tcMar>
+              <w:top w:type="dxa" w:w="70"/>
+              <w:left w:type="dxa" w:w="110"/>
+              <w:bottom w:type="dxa" w:w="70"/>
+              <w:right w:type="dxa" w:w="110"/>
+            </w:tcMar>
+          </w:tcPr>
+          <w:p>
+            <w:pPr>
+              <w:spacing w:after="40" w:line="264"/>
+            </w:pPr>
+            <w:r>
+              <w:rPr>
+                <w:rFonts w:ascii="Times New Roman" w:cs="Times New Roman" w:eastAsia="Times New Roman" w:hAnsi="Times New Roman"/>
+                <w:b w:val="false"/>
+                <w:bCs w:val="false"/>
+                <w:sz w:val="22"/>
+                <w:szCs w:val="22"/>
+              </w:rPr>
+              <w:t xml:space="preserve">Video hoặc audio phát được</w:t>
+            </w:r>
+          </w:p>
+        </w:tc>
+        <w:tc>
+          <w:tcPr>
+            <w:tcW w:type="dxa" w:w="1000"/>
+            <w:tcBorders>
+              <w:top w:val="single" w:color="AEB4C0" w:sz="4"/>
+              <w:left w:val="single" w:color="AEB4C0" w:sz="4"/>
+              <w:bottom w:val="single" w:color="AEB4C0" w:sz="4"/>
+              <w:right w:val="single" w:color="AEB4C0" w:sz="4"/>
+            </w:tcBorders>
+            <w:tcMar>
+              <w:top w:type="dxa" w:w="70"/>
+              <w:left w:type="dxa" w:w="110"/>
+              <w:bottom w:type="dxa" w:w="70"/>
+              <w:right w:type="dxa" w:w="110"/>
+            </w:tcMar>
+          </w:tcPr>
+          <w:p>
+            <w:pPr>
+              <w:spacing w:after="40" w:line="264"/>
+            </w:pPr>
+            <w:r>
+              <w:rPr>
+                <w:rFonts w:ascii="Times New Roman" w:cs="Times New Roman" w:eastAsia="Times New Roman" w:hAnsi="Times New Roman"/>
+                <w:b w:val="false"/>
+                <w:bCs w:val="false"/>
+                <w:sz w:val="22"/>
+                <w:szCs w:val="22"/>
+              </w:rPr>
+              <w:t xml:space="preserve">Đạt</w:t>
+            </w:r>
+          </w:p>
+        </w:tc>
+        <w:tc>
+          <w:tcPr>
+            <w:tcW w:type="dxa" w:w="1638"/>
+            <w:tcBorders>
+              <w:top w:val="single" w:color="AEB4C0" w:sz="4"/>
+              <w:left w:val="single" w:color="AEB4C0" w:sz="4"/>
+              <w:bottom w:val="single" w:color="AEB4C0" w:sz="4"/>
+              <w:right w:val="single" w:color="AEB4C0" w:sz="4"/>
+            </w:tcBorders>
+            <w:tcMar>
+              <w:top w:type="dxa" w:w="70"/>
+              <w:left w:type="dxa" w:w="110"/>
+              <w:bottom w:type="dxa" w:w="70"/>
+              <w:right w:type="dxa" w:w="110"/>
+            </w:tcMar>
+          </w:tcPr>
+          <w:p>
+            <w:pPr>
+              <w:spacing w:after="40" w:line="264"/>
+            </w:pPr>
+            <w:r>
+              <w:rPr>
+                <w:rFonts w:ascii="Times New Roman" w:cs="Times New Roman" w:eastAsia="Times New Roman" w:hAnsi="Times New Roman"/>
+                <w:b w:val="false"/>
+                <w:bCs w:val="false"/>
+                <w:sz w:val="22"/>
+                <w:szCs w:val="22"/>
+              </w:rPr>
+              <w:t xml:space="preserve">Đạt</w:t>
+            </w:r>
+          </w:p>
+        </w:tc>
+      </w:tr>
+      <w:tr>
+        <w:trPr>
+          <w:cantSplit/>
+          <w:tblHeader w:val="false"/>
+        </w:trPr>
+        <w:tc>
+          <w:tcPr>
+            <w:tcW w:type="dxa" w:w="800"/>
+            <w:tcBorders>
+              <w:top w:val="single" w:color="AEB4C0" w:sz="4"/>
+              <w:left w:val="single" w:color="AEB4C0" w:sz="4"/>
+              <w:bottom w:val="single" w:color="AEB4C0" w:sz="4"/>
+              <w:right w:val="single" w:color="AEB4C0" w:sz="4"/>
+            </w:tcBorders>
+            <w:tcMar>
+              <w:top w:type="dxa" w:w="70"/>
+              <w:left w:type="dxa" w:w="110"/>
+              <w:bottom w:type="dxa" w:w="70"/>
+              <w:right w:type="dxa" w:w="110"/>
+            </w:tcMar>
+          </w:tcPr>
+          <w:p>
+            <w:pPr>
+              <w:spacing w:after="40" w:line="264"/>
+            </w:pPr>
+            <w:r>
+              <w:rPr>
+                <w:rFonts w:ascii="Times New Roman" w:cs="Times New Roman" w:eastAsia="Times New Roman" w:hAnsi="Times New Roman"/>
+                <w:b w:val="false"/>
+                <w:bCs w:val="false"/>
+                <w:sz w:val="22"/>
+                <w:szCs w:val="22"/>
+              </w:rPr>
+              <w:t xml:space="preserve">TC13</w:t>
+            </w:r>
+          </w:p>
+        </w:tc>
+        <w:tc>
+          <w:tcPr>
+            <w:tcW w:type="dxa" w:w="3150"/>
+            <w:tcBorders>
+              <w:top w:val="single" w:color="AEB4C0" w:sz="4"/>
+              <w:left w:val="single" w:color="AEB4C0" w:sz="4"/>
+              <w:bottom w:val="single" w:color="AEB4C0" w:sz="4"/>
+              <w:right w:val="single" w:color="AEB4C0" w:sz="4"/>
+            </w:tcBorders>
+            <w:tcMar>
+              <w:top w:type="dxa" w:w="70"/>
+              <w:left w:type="dxa" w:w="110"/>
+              <w:bottom w:type="dxa" w:w="70"/>
+              <w:right w:type="dxa" w:w="110"/>
+            </w:tcMar>
+          </w:tcPr>
+          <w:p>
+            <w:pPr>
+              <w:spacing w:after="40" w:line="264"/>
+            </w:pPr>
+            <w:r>
+              <w:rPr>
+                <w:rFonts w:ascii="Times New Roman" w:cs="Times New Roman" w:eastAsia="Times New Roman" w:hAnsi="Times New Roman"/>
+                <w:b w:val="false"/>
+                <w:bCs w:val="false"/>
+                <w:sz w:val="22"/>
+                <w:szCs w:val="22"/>
+              </w:rPr>
+              <w:t xml:space="preserve">Ở bước 4, bấm Tải về</w:t>
+            </w:r>
+          </w:p>
+        </w:tc>
+        <w:tc>
+          <w:tcPr>
+            <w:tcW w:type="dxa" w:w="3050"/>
+            <w:tcBorders>
+              <w:top w:val="single" w:color="AEB4C0" w:sz="4"/>
+              <w:left w:val="single" w:color="AEB4C0" w:sz="4"/>
+              <w:bottom w:val="single" w:color="AEB4C0" w:sz="4"/>
+              <w:right w:val="single" w:color="AEB4C0" w:sz="4"/>
+            </w:tcBorders>
+            <w:tcMar>
+              <w:top w:type="dxa" w:w="70"/>
+              <w:left w:type="dxa" w:w="110"/>
+              <w:bottom w:type="dxa" w:w="70"/>
+              <w:right w:type="dxa" w:w="110"/>
+            </w:tcMar>
+          </w:tcPr>
+          <w:p>
+            <w:pPr>
+              <w:spacing w:after="40" w:line="264"/>
+            </w:pPr>
+            <w:r>
+              <w:rPr>
+                <w:rFonts w:ascii="Times New Roman" w:cs="Times New Roman" w:eastAsia="Times New Roman" w:hAnsi="Times New Roman"/>
+                <w:b w:val="false"/>
+                <w:bCs w:val="false"/>
+                <w:sz w:val="22"/>
+                <w:szCs w:val="22"/>
+              </w:rPr>
+              <w:t xml:space="preserve">Web: tải tệp về máy. Mobile: hiện bảng chia sẻ</w:t>
+            </w:r>
+          </w:p>
+        </w:tc>
+        <w:tc>
+          <w:tcPr>
+            <w:tcW w:type="dxa" w:w="1000"/>
+            <w:tcBorders>
+              <w:top w:val="single" w:color="AEB4C0" w:sz="4"/>
+              <w:left w:val="single" w:color="AEB4C0" w:sz="4"/>
+              <w:bottom w:val="single" w:color="AEB4C0" w:sz="4"/>
+              <w:right w:val="single" w:color="AEB4C0" w:sz="4"/>
+            </w:tcBorders>
+            <w:tcMar>
+              <w:top w:type="dxa" w:w="70"/>
+              <w:left w:type="dxa" w:w="110"/>
+              <w:bottom w:type="dxa" w:w="70"/>
+              <w:right w:type="dxa" w:w="110"/>
+            </w:tcMar>
+          </w:tcPr>
+          <w:p>
+            <w:pPr>
+              <w:spacing w:after="40" w:line="264"/>
+            </w:pPr>
+            <w:r>
+              <w:rPr>
+                <w:rFonts w:ascii="Times New Roman" w:cs="Times New Roman" w:eastAsia="Times New Roman" w:hAnsi="Times New Roman"/>
+                <w:b w:val="false"/>
+                <w:bCs w:val="false"/>
+                <w:sz w:val="22"/>
+                <w:szCs w:val="22"/>
+              </w:rPr>
+              <w:t xml:space="preserve">Đạt</w:t>
+            </w:r>
+          </w:p>
+        </w:tc>
+        <w:tc>
+          <w:tcPr>
+            <w:tcW w:type="dxa" w:w="1638"/>
+            <w:tcBorders>
+              <w:top w:val="single" w:color="AEB4C0" w:sz="4"/>
+              <w:left w:val="single" w:color="AEB4C0" w:sz="4"/>
+              <w:bottom w:val="single" w:color="AEB4C0" w:sz="4"/>
+              <w:right w:val="single" w:color="AEB4C0" w:sz="4"/>
+            </w:tcBorders>
+            <w:tcMar>
+              <w:top w:type="dxa" w:w="70"/>
+              <w:left w:type="dxa" w:w="110"/>
+              <w:bottom w:type="dxa" w:w="70"/>
+              <w:right w:type="dxa" w:w="110"/>
+            </w:tcMar>
+          </w:tcPr>
+          <w:p>
+            <w:pPr>
+              <w:spacing w:after="40" w:line="264"/>
+            </w:pPr>
+            <w:r>
+              <w:rPr>
+                <w:rFonts w:ascii="Times New Roman" w:cs="Times New Roman" w:eastAsia="Times New Roman" w:hAnsi="Times New Roman"/>
+                <w:b w:val="false"/>
+                <w:bCs w:val="false"/>
+                <w:sz w:val="22"/>
+                <w:szCs w:val="22"/>
+              </w:rPr>
+              <w:t xml:space="preserve">Đạt</w:t>
+            </w:r>
+          </w:p>
+        </w:tc>
+      </w:tr>
+      <w:tr>
+        <w:trPr>
+          <w:cantSplit/>
+          <w:tblHeader w:val="false"/>
+        </w:trPr>
+        <w:tc>
+          <w:tcPr>
+            <w:tcW w:type="dxa" w:w="800"/>
+            <w:tcBorders>
+              <w:top w:val="single" w:color="AEB4C0" w:sz="4"/>
+              <w:left w:val="single" w:color="AEB4C0" w:sz="4"/>
+              <w:bottom w:val="single" w:color="AEB4C0" w:sz="4"/>
+              <w:right w:val="single" w:color="AEB4C0" w:sz="4"/>
+            </w:tcBorders>
+            <w:tcMar>
+              <w:top w:type="dxa" w:w="70"/>
+              <w:left w:type="dxa" w:w="110"/>
+              <w:bottom w:type="dxa" w:w="70"/>
+              <w:right w:type="dxa" w:w="110"/>
+            </w:tcMar>
+          </w:tcPr>
+          <w:p>
+            <w:pPr>
+              <w:spacing w:after="40" w:line="264"/>
+            </w:pPr>
+            <w:r>
+              <w:rPr>
+                <w:rFonts w:ascii="Times New Roman" w:cs="Times New Roman" w:eastAsia="Times New Roman" w:hAnsi="Times New Roman"/>
+                <w:b w:val="false"/>
+                <w:bCs w:val="false"/>
+                <w:sz w:val="22"/>
+                <w:szCs w:val="22"/>
+              </w:rPr>
+              <w:t xml:space="preserve">TC14</w:t>
+            </w:r>
+          </w:p>
+        </w:tc>
+        <w:tc>
+          <w:tcPr>
+            <w:tcW w:type="dxa" w:w="3150"/>
+            <w:tcBorders>
+              <w:top w:val="single" w:color="AEB4C0" w:sz="4"/>
+              <w:left w:val="single" w:color="AEB4C0" w:sz="4"/>
+              <w:bottom w:val="single" w:color="AEB4C0" w:sz="4"/>
+              <w:right w:val="single" w:color="AEB4C0" w:sz="4"/>
+            </w:tcBorders>
+            <w:tcMar>
+              <w:top w:type="dxa" w:w="70"/>
+              <w:left w:type="dxa" w:w="110"/>
+              <w:bottom w:type="dxa" w:w="70"/>
+              <w:right w:type="dxa" w:w="110"/>
+            </w:tcMar>
+          </w:tcPr>
+          <w:p>
+            <w:pPr>
+              <w:spacing w:after="40" w:line="264"/>
+            </w:pPr>
+            <w:r>
+              <w:rPr>
+                <w:rFonts w:ascii="Times New Roman" w:cs="Times New Roman" w:eastAsia="Times New Roman" w:hAnsi="Times New Roman"/>
+                <w:b w:val="false"/>
+                <w:bCs w:val="false"/>
+                <w:sz w:val="22"/>
+                <w:szCs w:val="22"/>
+              </w:rPr>
+              <w:t xml:space="preserve">Bấm Làm video mới</w:t>
+            </w:r>
+          </w:p>
+        </w:tc>
+        <w:tc>
+          <w:tcPr>
+            <w:tcW w:type="dxa" w:w="3050"/>
+            <w:tcBorders>
+              <w:top w:val="single" w:color="AEB4C0" w:sz="4"/>
+              <w:left w:val="single" w:color="AEB4C0" w:sz="4"/>
+              <w:bottom w:val="single" w:color="AEB4C0" w:sz="4"/>
+              <w:right w:val="single" w:color="AEB4C0" w:sz="4"/>
+            </w:tcBorders>
+            <w:tcMar>
+              <w:top w:type="dxa" w:w="70"/>
+              <w:left w:type="dxa" w:w="110"/>
+              <w:bottom w:type="dxa" w:w="70"/>
+              <w:right w:type="dxa" w:w="110"/>
+            </w:tcMar>
+          </w:tcPr>
+          <w:p>
+            <w:pPr>
+              <w:spacing w:after="40" w:line="264"/>
+            </w:pPr>
+            <w:r>
+              <w:rPr>
+                <w:rFonts w:ascii="Times New Roman" w:cs="Times New Roman" w:eastAsia="Times New Roman" w:hAnsi="Times New Roman"/>
+                <w:b w:val="false"/>
+                <w:bCs w:val="false"/>
+                <w:sz w:val="22"/>
+                <w:szCs w:val="22"/>
+              </w:rPr>
+              <w:t xml:space="preserve">Về bước 1, không còn tệp và ngôn ngữ cũ</w:t>
+            </w:r>
+          </w:p>
+        </w:tc>
+        <w:tc>
+          <w:tcPr>
+            <w:tcW w:type="dxa" w:w="1000"/>
+            <w:tcBorders>
+              <w:top w:val="single" w:color="AEB4C0" w:sz="4"/>
+              <w:left w:val="single" w:color="AEB4C0" w:sz="4"/>
+              <w:bottom w:val="single" w:color="AEB4C0" w:sz="4"/>
+              <w:right w:val="single" w:color="AEB4C0" w:sz="4"/>
+            </w:tcBorders>
+            <w:tcMar>
+              <w:top w:type="dxa" w:w="70"/>
+              <w:left w:type="dxa" w:w="110"/>
+              <w:bottom w:type="dxa" w:w="70"/>
+              <w:right w:type="dxa" w:w="110"/>
+            </w:tcMar>
+          </w:tcPr>
+          <w:p>
+            <w:pPr>
+              <w:spacing w:after="40" w:line="264"/>
+            </w:pPr>
+            <w:r>
+              <w:rPr>
+                <w:rFonts w:ascii="Times New Roman" w:cs="Times New Roman" w:eastAsia="Times New Roman" w:hAnsi="Times New Roman"/>
+                <w:b w:val="false"/>
+                <w:bCs w:val="false"/>
+                <w:sz w:val="22"/>
+                <w:szCs w:val="22"/>
+              </w:rPr>
+              <w:t xml:space="preserve">Đạt</w:t>
+            </w:r>
+          </w:p>
+        </w:tc>
+        <w:tc>
+          <w:tcPr>
+            <w:tcW w:type="dxa" w:w="1638"/>
+            <w:tcBorders>
+              <w:top w:val="single" w:color="AEB4C0" w:sz="4"/>
+              <w:left w:val="single" w:color="AEB4C0" w:sz="4"/>
+              <w:bottom w:val="single" w:color="AEB4C0" w:sz="4"/>
+              <w:right w:val="single" w:color="AEB4C0" w:sz="4"/>
+            </w:tcBorders>
+            <w:tcMar>
+              <w:top w:type="dxa" w:w="70"/>
+              <w:left w:type="dxa" w:w="110"/>
+              <w:bottom w:type="dxa" w:w="70"/>
+              <w:right w:type="dxa" w:w="110"/>
+            </w:tcMar>
+          </w:tcPr>
+          <w:p>
+            <w:pPr>
+              <w:spacing w:after="40" w:line="264"/>
+            </w:pPr>
+            <w:r>
+              <w:rPr>
+                <w:rFonts w:ascii="Times New Roman" w:cs="Times New Roman" w:eastAsia="Times New Roman" w:hAnsi="Times New Roman"/>
+                <w:b w:val="false"/>
+                <w:bCs w:val="false"/>
+                <w:sz w:val="22"/>
+                <w:szCs w:val="22"/>
+              </w:rPr>
+              <w:t xml:space="preserve">Đạt</w:t>
+            </w:r>
+          </w:p>
+        </w:tc>
+      </w:tr>
+      <w:tr>
+        <w:trPr>
+          <w:cantSplit/>
+          <w:tblHeader w:val="false"/>
+        </w:trPr>
+        <w:tc>
+          <w:tcPr>
+            <w:tcW w:type="dxa" w:w="800"/>
+            <w:tcBorders>
+              <w:top w:val="single" w:color="AEB4C0" w:sz="4"/>
+              <w:left w:val="single" w:color="AEB4C0" w:sz="4"/>
+              <w:bottom w:val="single" w:color="AEB4C0" w:sz="4"/>
+              <w:right w:val="single" w:color="AEB4C0" w:sz="4"/>
+            </w:tcBorders>
+            <w:tcMar>
+              <w:top w:type="dxa" w:w="70"/>
+              <w:left w:type="dxa" w:w="110"/>
+              <w:bottom w:type="dxa" w:w="70"/>
+              <w:right w:type="dxa" w:w="110"/>
+            </w:tcMar>
+          </w:tcPr>
+          <w:p>
+            <w:pPr>
+              <w:spacing w:after="40" w:line="264"/>
+            </w:pPr>
+            <w:r>
+              <w:rPr>
+                <w:rFonts w:ascii="Times New Roman" w:cs="Times New Roman" w:eastAsia="Times New Roman" w:hAnsi="Times New Roman"/>
+                <w:b w:val="false"/>
+                <w:bCs w:val="false"/>
+                <w:sz w:val="22"/>
+                <w:szCs w:val="22"/>
+              </w:rPr>
+              <w:t xml:space="preserve">TC15</w:t>
+            </w:r>
+          </w:p>
+        </w:tc>
+        <w:tc>
+          <w:tcPr>
+            <w:tcW w:type="dxa" w:w="3150"/>
+            <w:tcBorders>
+              <w:top w:val="single" w:color="AEB4C0" w:sz="4"/>
+              <w:left w:val="single" w:color="AEB4C0" w:sz="4"/>
+              <w:bottom w:val="single" w:color="AEB4C0" w:sz="4"/>
+              <w:right w:val="single" w:color="AEB4C0" w:sz="4"/>
+            </w:tcBorders>
+            <w:tcMar>
+              <w:top w:type="dxa" w:w="70"/>
+              <w:left w:type="dxa" w:w="110"/>
+              <w:bottom w:type="dxa" w:w="70"/>
+              <w:right w:type="dxa" w:w="110"/>
+            </w:tcMar>
+          </w:tcPr>
+          <w:p>
+            <w:pPr>
+              <w:spacing w:after="40" w:line="264"/>
+            </w:pPr>
+            <w:r>
+              <w:rPr>
+                <w:rFonts w:ascii="Times New Roman" w:cs="Times New Roman" w:eastAsia="Times New Roman" w:hAnsi="Times New Roman"/>
+                <w:b w:val="false"/>
+                <w:bCs w:val="false"/>
+                <w:sz w:val="22"/>
+                <w:szCs w:val="22"/>
+              </w:rPr>
+              <w:t xml:space="preserve">Thu nhỏ cửa sổ trình duyệt</w:t>
+            </w:r>
+          </w:p>
+        </w:tc>
+        <w:tc>
+          <w:tcPr>
+            <w:tcW w:type="dxa" w:w="3050"/>
+            <w:tcBorders>
+              <w:top w:val="single" w:color="AEB4C0" w:sz="4"/>
+              <w:left w:val="single" w:color="AEB4C0" w:sz="4"/>
+              <w:bottom w:val="single" w:color="AEB4C0" w:sz="4"/>
+              <w:right w:val="single" w:color="AEB4C0" w:sz="4"/>
+            </w:tcBorders>
+            <w:tcMar>
+              <w:top w:type="dxa" w:w="70"/>
+              <w:left w:type="dxa" w:w="110"/>
+              <w:bottom w:type="dxa" w:w="70"/>
+              <w:right w:type="dxa" w:w="110"/>
+            </w:tcMar>
+          </w:tcPr>
+          <w:p>
+            <w:pPr>
+              <w:spacing w:after="40" w:line="264"/>
+            </w:pPr>
+            <w:r>
+              <w:rPr>
+                <w:rFonts w:ascii="Times New Roman" w:cs="Times New Roman" w:eastAsia="Times New Roman" w:hAnsi="Times New Roman"/>
+                <w:b w:val="false"/>
+                <w:bCs w:val="false"/>
+                <w:sz w:val="22"/>
+                <w:szCs w:val="22"/>
+              </w:rPr>
+              <w:t xml:space="preserve">Bố cục không vỡ, tên bước ẩn đi chỉ còn số</w:t>
+            </w:r>
+          </w:p>
+        </w:tc>
+        <w:tc>
+          <w:tcPr>
+            <w:tcW w:type="dxa" w:w="1000"/>
+            <w:tcBorders>
+              <w:top w:val="single" w:color="AEB4C0" w:sz="4"/>
+              <w:left w:val="single" w:color="AEB4C0" w:sz="4"/>
+              <w:bottom w:val="single" w:color="AEB4C0" w:sz="4"/>
+              <w:right w:val="single" w:color="AEB4C0" w:sz="4"/>
+            </w:tcBorders>
+            <w:tcMar>
+              <w:top w:type="dxa" w:w="70"/>
+              <w:left w:type="dxa" w:w="110"/>
+              <w:bottom w:type="dxa" w:w="70"/>
+              <w:right w:type="dxa" w:w="110"/>
+            </w:tcMar>
+          </w:tcPr>
+          <w:p>
+            <w:pPr>
+              <w:spacing w:after="40" w:line="264"/>
+            </w:pPr>
+            <w:r>
+              <w:rPr>
+                <w:rFonts w:ascii="Times New Roman" w:cs="Times New Roman" w:eastAsia="Times New Roman" w:hAnsi="Times New Roman"/>
+                <w:b w:val="false"/>
+                <w:bCs w:val="false"/>
+                <w:sz w:val="22"/>
+                <w:szCs w:val="22"/>
+              </w:rPr>
+              <w:t xml:space="preserve">Đạt</w:t>
+            </w:r>
+          </w:p>
+        </w:tc>
+        <w:tc>
+          <w:tcPr>
+            <w:tcW w:type="dxa" w:w="1638"/>
+            <w:tcBorders>
+              <w:top w:val="single" w:color="AEB4C0" w:sz="4"/>
+              <w:left w:val="single" w:color="AEB4C0" w:sz="4"/>
+              <w:bottom w:val="single" w:color="AEB4C0" w:sz="4"/>
+              <w:right w:val="single" w:color="AEB4C0" w:sz="4"/>
+            </w:tcBorders>
+            <w:tcMar>
+              <w:top w:type="dxa" w:w="70"/>
+              <w:left w:type="dxa" w:w="110"/>
+              <w:bottom w:type="dxa" w:w="70"/>
+              <w:right w:type="dxa" w:w="110"/>
+            </w:tcMar>
+          </w:tcPr>
+          <w:p>
+            <w:pPr>
+              <w:spacing w:after="40" w:line="264"/>
+            </w:pPr>
+            <w:r>
+              <w:rPr>
+                <w:rFonts w:ascii="Times New Roman" w:cs="Times New Roman" w:eastAsia="Times New Roman" w:hAnsi="Times New Roman"/>
+                <w:b w:val="false"/>
+                <w:bCs w:val="false"/>
+                <w:sz w:val="22"/>
+                <w:szCs w:val="22"/>
+              </w:rPr>
+              <w:t xml:space="preserve">Không áp dụng</w:t>
+            </w:r>
+          </w:p>
+        </w:tc>
+      </w:tr>
+    </w:tbl>
+    <w:p>
+      <w:pPr>
+        <w:spacing w:after="100"/>
+      </w:pPr>
+    </w:p>
+    <w:p>
+      <w:pPr>
+        <w:pStyle w:val="Heading3"/>
+        <w:keepNext/>
+      </w:pPr>
+      <w:r>
+        <w:rPr>
+          <w:rFonts w:ascii="Times New Roman" w:cs="Times New Roman" w:eastAsia="Times New Roman" w:hAnsi="Times New Roman"/>
+        </w:rPr>
+        <w:t xml:space="preserve">8.4 Đánh giá kết quả</w:t>
+      </w:r>
+    </w:p>
+    <w:p>
+      <w:pPr>
+        <w:pStyle w:val="ListParagraph"/>
+        <w:numPr>
+          <w:ilvl w:val="0"/>
+          <w:numId w:val="2"/>
+        </w:numPr>
+        <w:spacing w:after="80" w:line="288"/>
+      </w:pPr>
+      <w:r>
+        <w:rPr>
+          <w:rFonts w:ascii="Times New Roman" w:cs="Times New Roman" w:eastAsia="Times New Roman" w:hAnsi="Times New Roman"/>
+          <w:sz w:val="26"/>
+          <w:szCs w:val="26"/>
+        </w:rPr>
+        <w:t xml:space="preserve">Web: 15 trên 15 ca đạt. Mobile: 13 trên 13 ca áp dụng đạt (TC05 và TC15 chỉ có trên web).</w:t>
+      </w:r>
+    </w:p>
+    <w:p>
+      <w:pPr>
+        <w:pStyle w:val="ListParagraph"/>
+        <w:numPr>
+          <w:ilvl w:val="0"/>
+          <w:numId w:val="2"/>
+        </w:numPr>
+        <w:spacing w:after="80" w:line="288"/>
+      </w:pPr>
+      <w:r>
+        <w:rPr>
+          <w:rFonts w:ascii="Times New Roman" w:cs="Times New Roman" w:eastAsia="Times New Roman" w:hAnsi="Times New Roman"/>
+          <w:sz w:val="26"/>
+          <w:szCs w:val="26"/>
+        </w:rPr>
+        <w:t xml:space="preserve">Ở TC05, ứng dụng bỏ qua tệp sai loại nhưng không hiện thông báo lỗi. Đây là điểm cần cải thiện về trải nghiệm người dùng.</w:t>
+      </w:r>
+    </w:p>
+    <w:p>
+      <w:pPr>
+        <w:pStyle w:val="ListParagraph"/>
+        <w:numPr>
+          <w:ilvl w:val="0"/>
+          <w:numId w:val="2"/>
+        </w:numPr>
+        <w:spacing w:after="80" w:line="288"/>
+      </w:pPr>
+      <w:r>
+        <w:rPr>
+          <w:rFonts w:ascii="Times New Roman" w:cs="Times New Roman" w:eastAsia="Times New Roman" w:hAnsi="Times New Roman"/>
+          <w:sz w:val="26"/>
+          <w:szCs w:val="26"/>
+        </w:rPr>
+        <w:t xml:space="preserve">Phần xử lý lồng tiếng đang dùng dữ liệu mô phỏng nên các ca về tiến trình và kết quả mới kiểm tra được hành vi giao diện, chưa kiểm tra được kết quả xử lý thật.</w:t>
+      </w:r>
+    </w:p>
+    <w:p>
+      <w:pPr>
+        <w:pStyle w:val="ListParagraph"/>
+        <w:numPr>
+          <w:ilvl w:val="0"/>
+          <w:numId w:val="2"/>
+        </w:numPr>
+        <w:spacing w:after="80" w:line="288"/>
+      </w:pPr>
+      <w:r>
+        <w:rPr>
+          <w:rFonts w:ascii="Times New Roman" w:cs="Times New Roman" w:eastAsia="Times New Roman" w:hAnsi="Times New Roman"/>
+          <w:sz w:val="26"/>
+          <w:szCs w:val="26"/>
+        </w:rPr>
+        <w:t xml:space="preserve">Phạm vi thử nghiệm: một trình duyệt trên Windows và một iPhone. Chưa thử trên Android và các trình duyệt khác.</w:t>
+      </w:r>
+    </w:p>
+    <w:p>
+      <w:pPr>
+        <w:pStyle w:val="ListParagraph"/>
+        <w:numPr>
+          <w:ilvl w:val="0"/>
+          <w:numId w:val="2"/>
+        </w:numPr>
+        <w:spacing w:after="80" w:line="288"/>
+      </w:pPr>
+      <w:r>
+        <w:rPr>
+          <w:rFonts w:ascii="Times New Roman" w:cs="Times New Roman" w:eastAsia="Times New Roman" w:hAnsi="Times New Roman"/>
+          <w:sz w:val="26"/>
+          <w:szCs w:val="26"/>
+        </w:rPr>
+        <w:t xml:space="preserve">Chưa có kiểm thử tự động cho giao diện. Hiện chỉ có kiểm tra tự động ở mức build, lint (web) và kiểm tra kiểu TypeScript (mobile) trong CI.</w:t>
+      </w:r>
+    </w:p>
+    <w:p>
+      <w:pPr>
+        <w:pStyle w:val="Heading2"/>
+        <w:keepNext/>
+      </w:pPr>
+      <w:r>
+        <w:rPr>
+          <w:rFonts w:ascii="Times New Roman" w:cs="Times New Roman" w:eastAsia="Times New Roman" w:hAnsi="Times New Roman"/>
+        </w:rPr>
+        <w:t xml:space="preserve">9. Kết luận và hướng mở rộng</w:t>
+      </w:r>
+    </w:p>
+    <w:p>
+      <w:pPr>
+        <w:pStyle w:val="Heading3"/>
+        <w:keepNext/>
+      </w:pPr>
+      <w:r>
+        <w:rPr>
+          <w:rFonts w:ascii="Times New Roman" w:cs="Times New Roman" w:eastAsia="Times New Roman" w:hAnsi="Times New Roman"/>
+        </w:rPr>
+        <w:t xml:space="preserve">9.1 Kết luận</w:t>
+      </w:r>
+    </w:p>
+    <w:p>
+      <w:pPr>
+        <w:spacing w:after="120" w:line="288"/>
+      </w:pPr>
+      <w:r>
+        <w:rPr>
+          <w:rFonts w:ascii="Times New Roman" w:cs="Times New Roman" w:eastAsia="Times New Roman" w:hAnsi="Times New Roman"/>
+          <w:sz w:val="26"/>
+          <w:szCs w:val="26"/>
+        </w:rPr>
+        <w:t xml:space="preserve">Nhóm đã xây dựng được giao diện web và mobile cho luồng lồng tiếng hoàn chỉnh gồm bốn bước: tải lên, chọn ngôn ngữ, theo dõi tiến trình và xem kết quả. Cả hai ứng dụng chạy được với dữ liệu mô phỏng, có kiểm tra tự động (CI) và bản web được triển khai tự động (CD) lên Vercel. Mã nguồn, lịch sử làm việc và tài liệu được quản lý trên GitHub.</w:t>
+      </w:r>
+    </w:p>
+    <w:p>
+      <w:pPr>
+        <w:pStyle w:val="Heading3"/>
+        <w:keepNext/>
+      </w:pPr>
+      <w:r>
+        <w:rPr>
+          <w:rFonts w:ascii="Times New Roman" w:cs="Times New Roman" w:eastAsia="Times New Roman" w:hAnsi="Times New Roman"/>
+        </w:rPr>
+        <w:t xml:space="preserve">9.2 Hướng mở rộng</w:t>
+      </w:r>
+    </w:p>
+    <w:p>
+      <w:pPr>
+        <w:pStyle w:val="ListParagraph"/>
+        <w:numPr>
+          <w:ilvl w:val="0"/>
+          <w:numId w:val="2"/>
+        </w:numPr>
+        <w:spacing w:after="80" w:line="288"/>
+      </w:pPr>
+      <w:r>
+        <w:rPr>
+          <w:rFonts w:ascii="Times New Roman" w:cs="Times New Roman" w:eastAsia="Times New Roman" w:hAnsi="Times New Roman"/>
+          <w:sz w:val="26"/>
+          <w:szCs w:val="26"/>
+        </w:rPr>
+        <w:t xml:space="preserve">Kết nối với Backend thật để thay phần mô phỏng tiến trình và kết quả lồng tiếng.</w:t>
+      </w:r>
+    </w:p>
+    <w:p>
+      <w:pPr>
+        <w:pStyle w:val="ListParagraph"/>
+        <w:numPr>
+          <w:ilvl w:val="0"/>
+          <w:numId w:val="2"/>
+        </w:numPr>
+        <w:spacing w:after="80" w:line="288"/>
+      </w:pPr>
+      <w:r>
+        <w:rPr>
+          <w:rFonts w:ascii="Times New Roman" w:cs="Times New Roman" w:eastAsia="Times New Roman" w:hAnsi="Times New Roman"/>
+          <w:sz w:val="26"/>
+          <w:szCs w:val="26"/>
+        </w:rPr>
+        <w:t xml:space="preserve">Bổ sung đăng nhập, màn hình lịch sử các lần xử lý và quản lý gói dịch vụ theo PRD.</w:t>
+      </w:r>
+    </w:p>
+    <w:p>
+      <w:pPr>
+        <w:pStyle w:val="ListParagraph"/>
+        <w:numPr>
+          <w:ilvl w:val="0"/>
+          <w:numId w:val="2"/>
+        </w:numPr>
+        <w:spacing w:after="80" w:line="288"/>
+      </w:pPr>
+      <w:r>
+        <w:rPr>
+          <w:rFonts w:ascii="Times New Roman" w:cs="Times New Roman" w:eastAsia="Times New Roman" w:hAnsi="Times New Roman"/>
+          <w:sz w:val="26"/>
+          <w:szCs w:val="26"/>
+        </w:rPr>
+        <w:t xml:space="preserve">Hiển thị thông báo khi người dùng chọn tệp sai loại hoặc quá lớn.</w:t>
+      </w:r>
+    </w:p>
+    <w:p>
+      <w:pPr>
+        <w:pStyle w:val="ListParagraph"/>
+        <w:numPr>
+          <w:ilvl w:val="0"/>
+          <w:numId w:val="2"/>
+        </w:numPr>
+        <w:spacing w:after="80" w:line="288"/>
+      </w:pPr>
+      <w:r>
+        <w:rPr>
+          <w:rFonts w:ascii="Times New Roman" w:cs="Times New Roman" w:eastAsia="Times New Roman" w:hAnsi="Times New Roman"/>
+          <w:sz w:val="26"/>
+          <w:szCs w:val="26"/>
+        </w:rPr>
+        <w:t xml:space="preserve">Hỗ trợ thêm Android và các trình duyệt khác; bổ sung kiểm thử giao diện tự động.</w:t>
+      </w:r>
+    </w:p>
+    <w:p>
+      <w:pPr>
+        <w:pStyle w:val="ListParagraph"/>
+        <w:numPr>
+          <w:ilvl w:val="0"/>
+          <w:numId w:val="2"/>
+        </w:numPr>
+        <w:spacing w:after="80" w:line="288"/>
+      </w:pPr>
+      <w:r>
+        <w:rPr>
+          <w:rFonts w:ascii="Times New Roman" w:cs="Times New Roman" w:eastAsia="Times New Roman" w:hAnsi="Times New Roman"/>
+          <w:sz w:val="26"/>
+          <w:szCs w:val="26"/>
+        </w:rPr>
+        <w:t xml:space="preserve">Thêm thông báo khi xử lý xong và hỗ trợ thêm ngôn ngữ.</w:t>
       </w:r>
     </w:p>
     <w:sectPr>

</xml_diff>